<commit_message>
T-0048: crew_keys.py gains main's tickets.baseBranch (T-0061, since 1.0.158); reference regenerated with config_reference.py --write and rebuilt with build.py
The merge brought a repo-only config leaf with no KEY_META row, so
crew_keys.problems() and the generator refused. The row reads scope_base.py.
configuration-reference.md and CONFIG.md's two generated tables are the
generator's output (130 keys: 72 global, 58 repo-only); the reference
HTML/DOCX/PDF are rebuilt by build.py (LibreOffice 24.2.7.2).

Claude-Session: https://claude.ai/code/session_01YVvVmFJquzLKR26dG6oSQS
</commit_message>
<xml_diff>
--- a/docs/guides/crew/crew-1.0-configuration-reference.docx
+++ b/docs/guides/crew/crew-1.0-configuration-reference.docx
@@ -741,11 +741,11 @@
         <w:rPr>
           <w:rStyle w:val="Strong"/>
         </w:rPr>
-        <w:t>129 keys</w:t>
+        <w:t>130 keys</w:t>
       </w:r>
       <w:r>
         <w:rPr/>
-        <w:t>: 72 settable in the machine-global file, 57 repo-only.</w:t>
+        <w:t>: 72 settable in the machine-global file, 58 repo-only.</w:t>
       </w:r>
     </w:p>
     <w:p>
@@ -25609,8 +25609,327 @@
         <w:jc w:val="left"/>
         <w:rPr/>
       </w:pPr>
-      <w:bookmarkStart w:id="34" w:name="route"/>
+      <w:bookmarkStart w:id="34" w:name="tickets"/>
       <w:bookmarkEnd w:id="34"/>
+      <w:r>
+        <w:rPr>
+          <w:rStyle w:val="SourceText"/>
+        </w:rPr>
+        <w:t>Tickets</w:t>
+      </w:r>
+    </w:p>
+    <w:tbl>
+      <w:tblPr>
+        <w:tblW w:w="12771" w:type="dxa"/>
+        <w:jc w:val="left"/>
+        <w:tblInd w:w="0" w:type="dxa"/>
+        <w:tblLayout w:type="fixed"/>
+        <w:tblCellMar>
+          <w:top w:w="28" w:type="dxa"/>
+          <w:left w:w="28" w:type="dxa"/>
+          <w:bottom w:w="28" w:type="dxa"/>
+          <w:right w:w="28" w:type="dxa"/>
+        </w:tblCellMar>
+      </w:tblPr>
+      <w:tblGrid>
+        <w:gridCol w:w="3204"/>
+        <w:gridCol w:w="1438"/>
+        <w:gridCol w:w="1156"/>
+        <w:gridCol w:w="1954"/>
+        <w:gridCol w:w="1466"/>
+        <w:gridCol w:w="3553"/>
+      </w:tblGrid>
+      <w:tr>
+        <w:trPr>
+          <w:tblHeader w:val="true"/>
+        </w:trPr>
+        <w:tc>
+          <w:tcPr>
+            <w:tcW w:w="3204" w:type="dxa"/>
+            <w:tcBorders/>
+            <w:vAlign w:val="center"/>
+          </w:tcPr>
+          <w:p>
+            <w:pPr>
+              <w:pStyle w:val="TableHeading"/>
+              <w:suppressLineNumbers/>
+              <w:shd w:fill="434C5E" w:val="clear"/>
+              <w:bidi w:val="0"/>
+              <w:spacing w:before="120" w:after="120"/>
+              <w:jc w:val="left"/>
+              <w:rPr/>
+            </w:pPr>
+            <w:r>
+              <w:rPr/>
+              <w:t>Setting</w:t>
+            </w:r>
+          </w:p>
+        </w:tc>
+        <w:tc>
+          <w:tcPr>
+            <w:tcW w:w="1438" w:type="dxa"/>
+            <w:tcBorders/>
+            <w:vAlign w:val="center"/>
+          </w:tcPr>
+          <w:p>
+            <w:pPr>
+              <w:pStyle w:val="TableHeading"/>
+              <w:suppressLineNumbers/>
+              <w:shd w:fill="434C5E" w:val="clear"/>
+              <w:bidi w:val="0"/>
+              <w:spacing w:before="120" w:after="120"/>
+              <w:jc w:val="left"/>
+              <w:rPr/>
+            </w:pPr>
+            <w:r>
+              <w:rPr/>
+              <w:t>Layer</w:t>
+            </w:r>
+          </w:p>
+        </w:tc>
+        <w:tc>
+          <w:tcPr>
+            <w:tcW w:w="1156" w:type="dxa"/>
+            <w:tcBorders/>
+            <w:vAlign w:val="center"/>
+          </w:tcPr>
+          <w:p>
+            <w:pPr>
+              <w:pStyle w:val="TableHeading"/>
+              <w:suppressLineNumbers/>
+              <w:shd w:fill="434C5E" w:val="clear"/>
+              <w:bidi w:val="0"/>
+              <w:spacing w:before="120" w:after="120"/>
+              <w:jc w:val="left"/>
+              <w:rPr/>
+            </w:pPr>
+            <w:r>
+              <w:rPr/>
+              <w:t>Default</w:t>
+            </w:r>
+          </w:p>
+        </w:tc>
+        <w:tc>
+          <w:tcPr>
+            <w:tcW w:w="1954" w:type="dxa"/>
+            <w:tcBorders/>
+            <w:vAlign w:val="center"/>
+          </w:tcPr>
+          <w:p>
+            <w:pPr>
+              <w:pStyle w:val="TableHeading"/>
+              <w:suppressLineNumbers/>
+              <w:shd w:fill="434C5E" w:val="clear"/>
+              <w:bidi w:val="0"/>
+              <w:spacing w:before="120" w:after="120"/>
+              <w:jc w:val="left"/>
+              <w:rPr/>
+            </w:pPr>
+            <w:r>
+              <w:rPr/>
+              <w:t>Values</w:t>
+            </w:r>
+          </w:p>
+        </w:tc>
+        <w:tc>
+          <w:tcPr>
+            <w:tcW w:w="1466" w:type="dxa"/>
+            <w:tcBorders/>
+            <w:vAlign w:val="center"/>
+          </w:tcPr>
+          <w:p>
+            <w:pPr>
+              <w:pStyle w:val="TableHeading"/>
+              <w:suppressLineNumbers/>
+              <w:shd w:fill="434C5E" w:val="clear"/>
+              <w:bidi w:val="0"/>
+              <w:spacing w:before="120" w:after="120"/>
+              <w:jc w:val="left"/>
+              <w:rPr/>
+            </w:pPr>
+            <w:r>
+              <w:rPr/>
+              <w:t>Since</w:t>
+            </w:r>
+          </w:p>
+        </w:tc>
+        <w:tc>
+          <w:tcPr>
+            <w:tcW w:w="3553" w:type="dxa"/>
+            <w:tcBorders/>
+            <w:vAlign w:val="center"/>
+          </w:tcPr>
+          <w:p>
+            <w:pPr>
+              <w:pStyle w:val="TableHeading"/>
+              <w:suppressLineNumbers/>
+              <w:shd w:fill="434C5E" w:val="clear"/>
+              <w:bidi w:val="0"/>
+              <w:spacing w:before="120" w:after="120"/>
+              <w:jc w:val="left"/>
+              <w:rPr/>
+            </w:pPr>
+            <w:r>
+              <w:rPr/>
+              <w:t>Summary</w:t>
+            </w:r>
+          </w:p>
+        </w:tc>
+      </w:tr>
+      <w:tr>
+        <w:trPr/>
+        <w:tc>
+          <w:tcPr>
+            <w:tcW w:w="3204" w:type="dxa"/>
+            <w:tcBorders/>
+            <w:vAlign w:val="center"/>
+          </w:tcPr>
+          <w:p>
+            <w:pPr>
+              <w:pStyle w:val="TableContents"/>
+              <w:shd w:fill="2E3440" w:val="clear"/>
+              <w:bidi w:val="0"/>
+              <w:spacing w:before="120" w:after="120"/>
+              <w:jc w:val="left"/>
+              <w:rPr/>
+            </w:pPr>
+            <w:r>
+              <w:rPr>
+                <w:rStyle w:val="SourceText"/>
+              </w:rPr>
+              <w:t>tickets.baseBranch</w:t>
+            </w:r>
+          </w:p>
+        </w:tc>
+        <w:tc>
+          <w:tcPr>
+            <w:tcW w:w="1438" w:type="dxa"/>
+            <w:tcBorders/>
+            <w:vAlign w:val="center"/>
+          </w:tcPr>
+          <w:p>
+            <w:pPr>
+              <w:pStyle w:val="TableContents"/>
+              <w:shd w:fill="2E3440" w:val="clear"/>
+              <w:bidi w:val="0"/>
+              <w:spacing w:before="120" w:after="120"/>
+              <w:jc w:val="left"/>
+              <w:rPr/>
+            </w:pPr>
+            <w:r>
+              <w:rPr/>
+              <w:t>repo</w:t>
+            </w:r>
+          </w:p>
+        </w:tc>
+        <w:tc>
+          <w:tcPr>
+            <w:tcW w:w="1156" w:type="dxa"/>
+            <w:tcBorders/>
+            <w:vAlign w:val="center"/>
+          </w:tcPr>
+          <w:p>
+            <w:pPr>
+              <w:pStyle w:val="TableContents"/>
+              <w:shd w:fill="2E3440" w:val="clear"/>
+              <w:bidi w:val="0"/>
+              <w:spacing w:before="120" w:after="120"/>
+              <w:jc w:val="left"/>
+              <w:rPr/>
+            </w:pPr>
+            <w:r>
+              <w:rPr>
+                <w:rStyle w:val="SourceText"/>
+              </w:rPr>
+              <w:t>null</w:t>
+            </w:r>
+          </w:p>
+        </w:tc>
+        <w:tc>
+          <w:tcPr>
+            <w:tcW w:w="1954" w:type="dxa"/>
+            <w:tcBorders/>
+            <w:vAlign w:val="center"/>
+          </w:tcPr>
+          <w:p>
+            <w:pPr>
+              <w:pStyle w:val="TableContents"/>
+              <w:shd w:fill="2E3440" w:val="clear"/>
+              <w:bidi w:val="0"/>
+              <w:spacing w:before="120" w:after="120"/>
+              <w:jc w:val="left"/>
+              <w:rPr/>
+            </w:pPr>
+            <w:r>
+              <w:rPr/>
+              <w:t xml:space="preserve">branch name or null (coerced in </w:t>
+            </w:r>
+            <w:r>
+              <w:rPr>
+                <w:rStyle w:val="SourceText"/>
+              </w:rPr>
+              <w:t>plugin/crew/hooks/scripts/scope_base.py</w:t>
+            </w:r>
+            <w:r>
+              <w:rPr/>
+              <w:t>)</w:t>
+            </w:r>
+          </w:p>
+        </w:tc>
+        <w:tc>
+          <w:tcPr>
+            <w:tcW w:w="1466" w:type="dxa"/>
+            <w:tcBorders/>
+            <w:vAlign w:val="center"/>
+          </w:tcPr>
+          <w:p>
+            <w:pPr>
+              <w:pStyle w:val="TableContents"/>
+              <w:shd w:fill="2E3440" w:val="clear"/>
+              <w:bidi w:val="0"/>
+              <w:spacing w:before="120" w:after="120"/>
+              <w:jc w:val="left"/>
+              <w:rPr/>
+            </w:pPr>
+            <w:r>
+              <w:rPr/>
+              <w:t>1.0.158</w:t>
+            </w:r>
+          </w:p>
+        </w:tc>
+        <w:tc>
+          <w:tcPr>
+            <w:tcW w:w="3553" w:type="dxa"/>
+            <w:tcBorders/>
+            <w:vAlign w:val="center"/>
+          </w:tcPr>
+          <w:p>
+            <w:pPr>
+              <w:pStyle w:val="TableContents"/>
+              <w:shd w:fill="2E3440" w:val="clear"/>
+              <w:bidi w:val="0"/>
+              <w:spacing w:before="120" w:after="120"/>
+              <w:jc w:val="left"/>
+              <w:rPr/>
+            </w:pPr>
+            <w:r>
+              <w:rPr/>
+              <w:t>The branch ticket branches are cut from; null tries origin/HEAD's target, then origin/main, then main. A value that is not a branch name, or names no commit, makes the scope base could not tell.</w:t>
+            </w:r>
+          </w:p>
+        </w:tc>
+      </w:tr>
+    </w:tbl>
+    <w:p>
+      <w:pPr>
+        <w:pStyle w:val="Heading3"/>
+        <w:bidi w:val="0"/>
+        <w:ind w:hanging="0" w:left="0" w:right="0"/>
+        <w:jc w:val="left"/>
+        <w:rPr/>
+      </w:pPr>
+      <w:bookmarkStart w:id="35" w:name="route"/>
+      <w:bookmarkEnd w:id="35"/>
       <w:r>
         <w:rPr>
           <w:rStyle w:val="SourceText"/>
@@ -25964,8 +26283,8 @@
         <w:jc w:val="left"/>
         <w:rPr/>
       </w:pPr>
-      <w:bookmarkStart w:id="35" w:name="coming-not-in-code-yet"/>
-      <w:bookmarkEnd w:id="35"/>
+      <w:bookmarkStart w:id="36" w:name="coming-not-in-code-yet"/>
+      <w:bookmarkEnd w:id="36"/>
       <w:r>
         <w:rPr/>
         <w:t>Coming (Not in Code Yet)</w:t>
@@ -26001,8 +26320,8 @@
         <w:jc w:val="left"/>
         <w:rPr/>
       </w:pPr>
-      <w:bookmarkStart w:id="36" w:name="t-0009"/>
-      <w:bookmarkEnd w:id="36"/>
+      <w:bookmarkStart w:id="37" w:name="t-0009"/>
+      <w:bookmarkEnd w:id="37"/>
       <w:r>
         <w:rPr/>
         <w:t>T-0009</w:t>
@@ -26445,8 +26764,8 @@
         <w:jc w:val="left"/>
         <w:rPr/>
       </w:pPr>
-      <w:bookmarkStart w:id="37" w:name="t-0011"/>
-      <w:bookmarkEnd w:id="37"/>
+      <w:bookmarkStart w:id="38" w:name="t-0011"/>
+      <w:bookmarkEnd w:id="38"/>
       <w:r>
         <w:rPr/>
         <w:t>T-0011</w:t>
@@ -27062,8 +27381,8 @@
         <w:jc w:val="left"/>
         <w:rPr/>
       </w:pPr>
-      <w:bookmarkStart w:id="38" w:name="t-0012"/>
-      <w:bookmarkEnd w:id="38"/>
+      <w:bookmarkStart w:id="39" w:name="t-0012"/>
+      <w:bookmarkEnd w:id="39"/>
       <w:r>
         <w:rPr/>
         <w:t>T-0012</w:t>
@@ -27669,8 +27988,8 @@
         <w:jc w:val="left"/>
         <w:rPr/>
       </w:pPr>
-      <w:bookmarkStart w:id="39" w:name="t-0013"/>
-      <w:bookmarkEnd w:id="39"/>
+      <w:bookmarkStart w:id="40" w:name="t-0013"/>
+      <w:bookmarkEnd w:id="40"/>
       <w:r>
         <w:rPr/>
         <w:t>T-0013</w:t>
@@ -28113,8 +28432,8 @@
         <w:jc w:val="left"/>
         <w:rPr/>
       </w:pPr>
-      <w:bookmarkStart w:id="40" w:name="t-0017"/>
-      <w:bookmarkEnd w:id="40"/>
+      <w:bookmarkStart w:id="41" w:name="t-0017"/>
+      <w:bookmarkEnd w:id="41"/>
       <w:r>
         <w:rPr/>
         <w:t>T-0017</w:t>
@@ -28432,8 +28751,8 @@
         <w:jc w:val="left"/>
         <w:rPr/>
       </w:pPr>
-      <w:bookmarkStart w:id="41" w:name="t-0029"/>
-      <w:bookmarkEnd w:id="41"/>
+      <w:bookmarkStart w:id="42" w:name="t-0029"/>
+      <w:bookmarkEnd w:id="42"/>
       <w:r>
         <w:rPr/>
         <w:t>T-0029</w:t>
@@ -28894,8 +29213,8 @@
         <w:jc w:val="left"/>
         <w:rPr/>
       </w:pPr>
-      <w:bookmarkStart w:id="42" w:name="t-0030"/>
-      <w:bookmarkEnd w:id="42"/>
+      <w:bookmarkStart w:id="43" w:name="t-0030"/>
+      <w:bookmarkEnd w:id="43"/>
       <w:r>
         <w:rPr/>
         <w:t>T-0030</w:t>
@@ -29338,8 +29657,8 @@
         <w:jc w:val="left"/>
         <w:rPr/>
       </w:pPr>
-      <w:bookmarkStart w:id="43" w:name="t-0050"/>
-      <w:bookmarkEnd w:id="43"/>
+      <w:bookmarkStart w:id="44" w:name="t-0050"/>
+      <w:bookmarkEnd w:id="44"/>
       <w:r>
         <w:rPr/>
         <w:t>T-0050</w:t>

</xml_diff>

<commit_message>
T-0048: tickets.baseBranch is kind branch ("checked in"), not type ("coerced in")
scope_base.read_base_branch refuses a non-string or blank value and the scope
base becomes "could not tell"; nothing is coerced. test_crew_keys pins the
row's kind against the real reader. Reference regenerated with
config_reference.py --write and rebuilt with build.py (LibreOffice 24.2.7.2).

Claude-Session: https://claude.ai/code/session_01YVvVmFJquzLKR26dG6oSQS
</commit_message>
<xml_diff>
--- a/docs/guides/crew/crew-1.0-configuration-reference.docx
+++ b/docs/guides/crew/crew-1.0-configuration-reference.docx
@@ -25632,12 +25632,12 @@
         </w:tblCellMar>
       </w:tblPr>
       <w:tblGrid>
-        <w:gridCol w:w="3204"/>
-        <w:gridCol w:w="1438"/>
+        <w:gridCol w:w="3196"/>
+        <w:gridCol w:w="1434"/>
         <w:gridCol w:w="1156"/>
-        <w:gridCol w:w="1954"/>
-        <w:gridCol w:w="1466"/>
-        <w:gridCol w:w="3553"/>
+        <w:gridCol w:w="1988"/>
+        <w:gridCol w:w="1463"/>
+        <w:gridCol w:w="3534"/>
       </w:tblGrid>
       <w:tr>
         <w:trPr>
@@ -25645,7 +25645,7 @@
         </w:trPr>
         <w:tc>
           <w:tcPr>
-            <w:tcW w:w="3204" w:type="dxa"/>
+            <w:tcW w:w="3196" w:type="dxa"/>
             <w:tcBorders/>
             <w:vAlign w:val="center"/>
           </w:tcPr>
@@ -25667,7 +25667,7 @@
         </w:tc>
         <w:tc>
           <w:tcPr>
-            <w:tcW w:w="1438" w:type="dxa"/>
+            <w:tcW w:w="1434" w:type="dxa"/>
             <w:tcBorders/>
             <w:vAlign w:val="center"/>
           </w:tcPr>
@@ -25711,7 +25711,7 @@
         </w:tc>
         <w:tc>
           <w:tcPr>
-            <w:tcW w:w="1954" w:type="dxa"/>
+            <w:tcW w:w="1988" w:type="dxa"/>
             <w:tcBorders/>
             <w:vAlign w:val="center"/>
           </w:tcPr>
@@ -25733,7 +25733,7 @@
         </w:tc>
         <w:tc>
           <w:tcPr>
-            <w:tcW w:w="1466" w:type="dxa"/>
+            <w:tcW w:w="1463" w:type="dxa"/>
             <w:tcBorders/>
             <w:vAlign w:val="center"/>
           </w:tcPr>
@@ -25755,7 +25755,7 @@
         </w:tc>
         <w:tc>
           <w:tcPr>
-            <w:tcW w:w="3553" w:type="dxa"/>
+            <w:tcW w:w="3534" w:type="dxa"/>
             <w:tcBorders/>
             <w:vAlign w:val="center"/>
           </w:tcPr>
@@ -25780,7 +25780,7 @@
         <w:trPr/>
         <w:tc>
           <w:tcPr>
-            <w:tcW w:w="3204" w:type="dxa"/>
+            <w:tcW w:w="3196" w:type="dxa"/>
             <w:tcBorders/>
             <w:vAlign w:val="center"/>
           </w:tcPr>
@@ -25803,7 +25803,7 @@
         </w:tc>
         <w:tc>
           <w:tcPr>
-            <w:tcW w:w="1438" w:type="dxa"/>
+            <w:tcW w:w="1434" w:type="dxa"/>
             <w:tcBorders/>
             <w:vAlign w:val="center"/>
           </w:tcPr>
@@ -25847,22 +25847,22 @@
         </w:tc>
         <w:tc>
           <w:tcPr>
-            <w:tcW w:w="1954" w:type="dxa"/>
-            <w:tcBorders/>
-            <w:vAlign w:val="center"/>
-          </w:tcPr>
-          <w:p>
-            <w:pPr>
-              <w:pStyle w:val="TableContents"/>
-              <w:shd w:fill="2E3440" w:val="clear"/>
-              <w:bidi w:val="0"/>
-              <w:spacing w:before="120" w:after="120"/>
-              <w:jc w:val="left"/>
-              <w:rPr/>
-            </w:pPr>
-            <w:r>
-              <w:rPr/>
-              <w:t xml:space="preserve">branch name or null (coerced in </w:t>
+            <w:tcW w:w="1988" w:type="dxa"/>
+            <w:tcBorders/>
+            <w:vAlign w:val="center"/>
+          </w:tcPr>
+          <w:p>
+            <w:pPr>
+              <w:pStyle w:val="TableContents"/>
+              <w:shd w:fill="2E3440" w:val="clear"/>
+              <w:bidi w:val="0"/>
+              <w:spacing w:before="120" w:after="120"/>
+              <w:jc w:val="left"/>
+              <w:rPr/>
+            </w:pPr>
+            <w:r>
+              <w:rPr/>
+              <w:t xml:space="preserve">branch name or null (checked in </w:t>
             </w:r>
             <w:r>
               <w:rPr>
@@ -25878,7 +25878,7 @@
         </w:tc>
         <w:tc>
           <w:tcPr>
-            <w:tcW w:w="1466" w:type="dxa"/>
+            <w:tcW w:w="1463" w:type="dxa"/>
             <w:tcBorders/>
             <w:vAlign w:val="center"/>
           </w:tcPr>
@@ -25899,7 +25899,7 @@
         </w:tc>
         <w:tc>
           <w:tcPr>
-            <w:tcW w:w="3553" w:type="dxa"/>
+            <w:tcW w:w="3534" w:type="dxa"/>
             <w:tcBorders/>
             <w:vAlign w:val="center"/>
           </w:tcPr>

</xml_diff>

<commit_message>
T-0050: a corrupt machine file is could-not-tell for the personal autopilot keys; reference lists personal values strictest first
read_global_config collapses a corrupt machine file to {}, so a global
autopilot.approval "human" read as the default "risk" with no warning.
crew_autopilot.settings now reads the machine file raw first, as it does the
repo file: unreadable JSON, a non-object file or a non-object autopilot block
reads both policies unknown and autopilot off, with a warning naming the file.

Docstrings (read_global_config, settings) and "every crew script write" wording
in the guide, the reference and the README follow the review's nits.

Tooling-seam: plugin/crew/hooks/scripts/crew_autopilot.py
Claude-Session: https://claude.ai/code/session_016wQA2o38aSB65bpjaGpMVJ
</commit_message>
<xml_diff>
--- a/docs/guides/crew/crew-1.0-configuration-reference.docx
+++ b/docs/guides/crew/crew-1.0-configuration-reference.docx
@@ -579,7 +579,7 @@
       </w:pPr>
       <w:r>
         <w:rPr/>
-        <w:t xml:space="preserve">Every crew write to either file first copies the old bytes to </w:t>
+        <w:t xml:space="preserve">Every write a crew script makes to either file first copies the old bytes to </w:t>
       </w:r>
       <w:r>
         <w:rPr>
@@ -589,7 +589,7 @@
       </w:r>
       <w:r>
         <w:rPr/>
-        <w:t xml:space="preserve"> (the newest 20 per file kept) and is refused when that copy fails. </w:t>
+        <w:t xml:space="preserve"> (the newest 20 per file kept) and is refused when that copy fails; a hand edit is not backed up. </w:t>
       </w:r>
       <w:r>
         <w:rPr>
@@ -25202,12 +25202,12 @@
         </w:tblCellMar>
       </w:tblPr>
       <w:tblGrid>
-        <w:gridCol w:w="3205"/>
-        <w:gridCol w:w="1400"/>
-        <w:gridCol w:w="1156"/>
-        <w:gridCol w:w="2758"/>
-        <w:gridCol w:w="1291"/>
-        <w:gridCol w:w="2961"/>
+        <w:gridCol w:w="3244"/>
+        <w:gridCol w:w="1397"/>
+        <w:gridCol w:w="1157"/>
+        <w:gridCol w:w="3088"/>
+        <w:gridCol w:w="1298"/>
+        <w:gridCol w:w="2587"/>
       </w:tblGrid>
       <w:tr>
         <w:trPr>
@@ -25215,7 +25215,7 @@
         </w:trPr>
         <w:tc>
           <w:tcPr>
-            <w:tcW w:w="3205" w:type="dxa"/>
+            <w:tcW w:w="3244" w:type="dxa"/>
             <w:tcBorders/>
             <w:vAlign w:val="center"/>
           </w:tcPr>
@@ -25237,7 +25237,7 @@
         </w:tc>
         <w:tc>
           <w:tcPr>
-            <w:tcW w:w="1400" w:type="dxa"/>
+            <w:tcW w:w="1397" w:type="dxa"/>
             <w:tcBorders/>
             <w:vAlign w:val="center"/>
           </w:tcPr>
@@ -25259,7 +25259,7 @@
         </w:tc>
         <w:tc>
           <w:tcPr>
-            <w:tcW w:w="1156" w:type="dxa"/>
+            <w:tcW w:w="1157" w:type="dxa"/>
             <w:tcBorders/>
             <w:vAlign w:val="center"/>
           </w:tcPr>
@@ -25281,7 +25281,7 @@
         </w:tc>
         <w:tc>
           <w:tcPr>
-            <w:tcW w:w="2758" w:type="dxa"/>
+            <w:tcW w:w="3088" w:type="dxa"/>
             <w:tcBorders/>
             <w:vAlign w:val="center"/>
           </w:tcPr>
@@ -25303,7 +25303,7 @@
         </w:tc>
         <w:tc>
           <w:tcPr>
-            <w:tcW w:w="1291" w:type="dxa"/>
+            <w:tcW w:w="1298" w:type="dxa"/>
             <w:tcBorders/>
             <w:vAlign w:val="center"/>
           </w:tcPr>
@@ -25325,7 +25325,7 @@
         </w:tc>
         <w:tc>
           <w:tcPr>
-            <w:tcW w:w="2961" w:type="dxa"/>
+            <w:tcW w:w="2587" w:type="dxa"/>
             <w:tcBorders/>
             <w:vAlign w:val="center"/>
           </w:tcPr>
@@ -25350,7 +25350,7 @@
         <w:trPr/>
         <w:tc>
           <w:tcPr>
-            <w:tcW w:w="3205" w:type="dxa"/>
+            <w:tcW w:w="3244" w:type="dxa"/>
             <w:tcBorders/>
             <w:vAlign w:val="center"/>
           </w:tcPr>
@@ -25373,7 +25373,7 @@
         </w:tc>
         <w:tc>
           <w:tcPr>
-            <w:tcW w:w="1400" w:type="dxa"/>
+            <w:tcW w:w="1397" w:type="dxa"/>
             <w:tcBorders/>
             <w:vAlign w:val="center"/>
           </w:tcPr>
@@ -25394,7 +25394,7 @@
         </w:tc>
         <w:tc>
           <w:tcPr>
-            <w:tcW w:w="1156" w:type="dxa"/>
+            <w:tcW w:w="1157" w:type="dxa"/>
             <w:tcBorders/>
             <w:vAlign w:val="center"/>
           </w:tcPr>
@@ -25417,7 +25417,7 @@
         </w:tc>
         <w:tc>
           <w:tcPr>
-            <w:tcW w:w="2758" w:type="dxa"/>
+            <w:tcW w:w="3088" w:type="dxa"/>
             <w:tcBorders/>
             <w:vAlign w:val="center"/>
           </w:tcPr>
@@ -25458,13 +25458,13 @@
             </w:r>
             <w:r>
               <w:rPr/>
-              <w:t>)</w:t>
-            </w:r>
-          </w:p>
-        </w:tc>
-        <w:tc>
-          <w:tcPr>
-            <w:tcW w:w="1291" w:type="dxa"/>
+              <w:t>); personal: listed strictest first, the stricter wins</w:t>
+            </w:r>
+          </w:p>
+        </w:tc>
+        <w:tc>
+          <w:tcPr>
+            <w:tcW w:w="1298" w:type="dxa"/>
             <w:tcBorders/>
             <w:vAlign w:val="center"/>
           </w:tcPr>
@@ -25485,7 +25485,7 @@
         </w:tc>
         <w:tc>
           <w:tcPr>
-            <w:tcW w:w="2961" w:type="dxa"/>
+            <w:tcW w:w="2587" w:type="dxa"/>
             <w:tcBorders/>
             <w:vAlign w:val="center"/>
           </w:tcPr>
@@ -25529,7 +25529,7 @@
         <w:trPr/>
         <w:tc>
           <w:tcPr>
-            <w:tcW w:w="3205" w:type="dxa"/>
+            <w:tcW w:w="3244" w:type="dxa"/>
             <w:tcBorders/>
             <w:vAlign w:val="center"/>
           </w:tcPr>
@@ -25552,7 +25552,7 @@
         </w:tc>
         <w:tc>
           <w:tcPr>
-            <w:tcW w:w="1400" w:type="dxa"/>
+            <w:tcW w:w="1397" w:type="dxa"/>
             <w:tcBorders/>
             <w:vAlign w:val="center"/>
           </w:tcPr>
@@ -25573,7 +25573,7 @@
         </w:tc>
         <w:tc>
           <w:tcPr>
-            <w:tcW w:w="1156" w:type="dxa"/>
+            <w:tcW w:w="1157" w:type="dxa"/>
             <w:tcBorders/>
             <w:vAlign w:val="center"/>
           </w:tcPr>
@@ -25596,7 +25596,7 @@
         </w:tc>
         <w:tc>
           <w:tcPr>
-            <w:tcW w:w="2758" w:type="dxa"/>
+            <w:tcW w:w="3088" w:type="dxa"/>
             <w:tcBorders/>
             <w:vAlign w:val="center"/>
           </w:tcPr>
@@ -25621,13 +25621,13 @@
             </w:r>
             <w:r>
               <w:rPr/>
-              <w:t>)</w:t>
-            </w:r>
-          </w:p>
-        </w:tc>
-        <w:tc>
-          <w:tcPr>
-            <w:tcW w:w="1291" w:type="dxa"/>
+              <w:t>); personal: the smaller wins</w:t>
+            </w:r>
+          </w:p>
+        </w:tc>
+        <w:tc>
+          <w:tcPr>
+            <w:tcW w:w="1298" w:type="dxa"/>
             <w:tcBorders/>
             <w:vAlign w:val="center"/>
           </w:tcPr>
@@ -25648,7 +25648,7 @@
         </w:tc>
         <w:tc>
           <w:tcPr>
-            <w:tcW w:w="2961" w:type="dxa"/>
+            <w:tcW w:w="2587" w:type="dxa"/>
             <w:tcBorders/>
             <w:vAlign w:val="center"/>
           </w:tcPr>
@@ -25672,7 +25672,7 @@
         <w:trPr/>
         <w:tc>
           <w:tcPr>
-            <w:tcW w:w="3205" w:type="dxa"/>
+            <w:tcW w:w="3244" w:type="dxa"/>
             <w:tcBorders/>
             <w:vAlign w:val="center"/>
           </w:tcPr>
@@ -25695,7 +25695,7 @@
         </w:tc>
         <w:tc>
           <w:tcPr>
-            <w:tcW w:w="1400" w:type="dxa"/>
+            <w:tcW w:w="1397" w:type="dxa"/>
             <w:tcBorders/>
             <w:vAlign w:val="center"/>
           </w:tcPr>
@@ -25716,7 +25716,7 @@
         </w:tc>
         <w:tc>
           <w:tcPr>
-            <w:tcW w:w="1156" w:type="dxa"/>
+            <w:tcW w:w="1157" w:type="dxa"/>
             <w:tcBorders/>
             <w:vAlign w:val="center"/>
           </w:tcPr>
@@ -25739,7 +25739,7 @@
         </w:tc>
         <w:tc>
           <w:tcPr>
-            <w:tcW w:w="2758" w:type="dxa"/>
+            <w:tcW w:w="3088" w:type="dxa"/>
             <w:tcBorders/>
             <w:vAlign w:val="center"/>
           </w:tcPr>
@@ -25778,11 +25778,15 @@
               </w:rPr>
               <w:t>all</w:t>
             </w:r>
-          </w:p>
-        </w:tc>
-        <w:tc>
-          <w:tcPr>
-            <w:tcW w:w="1291" w:type="dxa"/>
+            <w:r>
+              <w:rPr/>
+              <w:t>; personal: listed strictest first, the stricter wins</w:t>
+            </w:r>
+          </w:p>
+        </w:tc>
+        <w:tc>
+          <w:tcPr>
+            <w:tcW w:w="1298" w:type="dxa"/>
             <w:tcBorders/>
             <w:vAlign w:val="center"/>
           </w:tcPr>
@@ -25803,7 +25807,7 @@
         </w:tc>
         <w:tc>
           <w:tcPr>
-            <w:tcW w:w="2961" w:type="dxa"/>
+            <w:tcW w:w="2587" w:type="dxa"/>
             <w:tcBorders/>
             <w:vAlign w:val="center"/>
           </w:tcPr>
@@ -25837,7 +25841,7 @@
         <w:trPr/>
         <w:tc>
           <w:tcPr>
-            <w:tcW w:w="3205" w:type="dxa"/>
+            <w:tcW w:w="3244" w:type="dxa"/>
             <w:tcBorders/>
             <w:vAlign w:val="center"/>
           </w:tcPr>
@@ -25860,7 +25864,7 @@
         </w:tc>
         <w:tc>
           <w:tcPr>
-            <w:tcW w:w="1400" w:type="dxa"/>
+            <w:tcW w:w="1397" w:type="dxa"/>
             <w:tcBorders/>
             <w:vAlign w:val="center"/>
           </w:tcPr>
@@ -25881,7 +25885,7 @@
         </w:tc>
         <w:tc>
           <w:tcPr>
-            <w:tcW w:w="1156" w:type="dxa"/>
+            <w:tcW w:w="1157" w:type="dxa"/>
             <w:tcBorders/>
             <w:vAlign w:val="center"/>
           </w:tcPr>
@@ -25904,7 +25908,7 @@
         </w:tc>
         <w:tc>
           <w:tcPr>
-            <w:tcW w:w="2758" w:type="dxa"/>
+            <w:tcW w:w="3088" w:type="dxa"/>
             <w:tcBorders/>
             <w:vAlign w:val="center"/>
           </w:tcPr>
@@ -25931,23 +25935,27 @@
               <w:rPr>
                 <w:rStyle w:val="SourceText"/>
               </w:rPr>
+              <w:t>risk</w:t>
+            </w:r>
+            <w:r>
+              <w:rPr/>
+              <w:t xml:space="preserve"> | </w:t>
+            </w:r>
+            <w:r>
+              <w:rPr>
+                <w:rStyle w:val="SourceText"/>
+              </w:rPr>
               <w:t>self</w:t>
             </w:r>
             <w:r>
               <w:rPr/>
-              <w:t xml:space="preserve"> | </w:t>
-            </w:r>
-            <w:r>
-              <w:rPr>
-                <w:rStyle w:val="SourceText"/>
-              </w:rPr>
-              <w:t>risk</w:t>
-            </w:r>
-          </w:p>
-        </w:tc>
-        <w:tc>
-          <w:tcPr>
-            <w:tcW w:w="1291" w:type="dxa"/>
+              <w:t>; personal: listed strictest first, the stricter wins</w:t>
+            </w:r>
+          </w:p>
+        </w:tc>
+        <w:tc>
+          <w:tcPr>
+            <w:tcW w:w="1298" w:type="dxa"/>
             <w:tcBorders/>
             <w:vAlign w:val="center"/>
           </w:tcPr>
@@ -25968,7 +25976,7 @@
         </w:tc>
         <w:tc>
           <w:tcPr>
-            <w:tcW w:w="2961" w:type="dxa"/>
+            <w:tcW w:w="2587" w:type="dxa"/>
             <w:tcBorders/>
             <w:vAlign w:val="center"/>
           </w:tcPr>
@@ -26002,7 +26010,7 @@
         <w:trPr/>
         <w:tc>
           <w:tcPr>
-            <w:tcW w:w="3205" w:type="dxa"/>
+            <w:tcW w:w="3244" w:type="dxa"/>
             <w:tcBorders/>
             <w:vAlign w:val="center"/>
           </w:tcPr>
@@ -26025,7 +26033,7 @@
         </w:tc>
         <w:tc>
           <w:tcPr>
-            <w:tcW w:w="1400" w:type="dxa"/>
+            <w:tcW w:w="1397" w:type="dxa"/>
             <w:tcBorders/>
             <w:vAlign w:val="center"/>
           </w:tcPr>
@@ -26046,7 +26054,7 @@
         </w:tc>
         <w:tc>
           <w:tcPr>
-            <w:tcW w:w="1156" w:type="dxa"/>
+            <w:tcW w:w="1157" w:type="dxa"/>
             <w:tcBorders/>
             <w:vAlign w:val="center"/>
           </w:tcPr>
@@ -26069,7 +26077,7 @@
         </w:tc>
         <w:tc>
           <w:tcPr>
-            <w:tcW w:w="2758" w:type="dxa"/>
+            <w:tcW w:w="3088" w:type="dxa"/>
             <w:tcBorders/>
             <w:vAlign w:val="center"/>
           </w:tcPr>
@@ -26096,23 +26104,27 @@
               <w:rPr>
                 <w:rStyle w:val="SourceText"/>
               </w:rPr>
+              <w:t>risk</w:t>
+            </w:r>
+            <w:r>
+              <w:rPr/>
+              <w:t xml:space="preserve"> | </w:t>
+            </w:r>
+            <w:r>
+              <w:rPr>
+                <w:rStyle w:val="SourceText"/>
+              </w:rPr>
               <w:t>self</w:t>
             </w:r>
             <w:r>
               <w:rPr/>
-              <w:t xml:space="preserve"> | </w:t>
-            </w:r>
-            <w:r>
-              <w:rPr>
-                <w:rStyle w:val="SourceText"/>
-              </w:rPr>
-              <w:t>risk</w:t>
-            </w:r>
-          </w:p>
-        </w:tc>
-        <w:tc>
-          <w:tcPr>
-            <w:tcW w:w="1291" w:type="dxa"/>
+              <w:t>; personal: listed strictest first, the stricter wins</w:t>
+            </w:r>
+          </w:p>
+        </w:tc>
+        <w:tc>
+          <w:tcPr>
+            <w:tcW w:w="1298" w:type="dxa"/>
             <w:tcBorders/>
             <w:vAlign w:val="center"/>
           </w:tcPr>
@@ -26133,7 +26145,7 @@
         </w:tc>
         <w:tc>
           <w:tcPr>
-            <w:tcW w:w="2961" w:type="dxa"/>
+            <w:tcW w:w="2587" w:type="dxa"/>
             <w:tcBorders/>
             <w:vAlign w:val="center"/>
           </w:tcPr>

</xml_diff>

<commit_message>
T-0053: docs, key metadata, verify rule and code map for the sleep schedule
CONFIG.md section 11 rows (generated) and section 20's Sleep paragraph,
re-measured leaf counts (74 / 135 / 61); README, the two guide sources and
rebuilt guides say a receipt written asleep stops standing when the window
ends; crew_keys rows for the three keys; autopilot.md names the sleep= line
in place (109 lines); verify.json's policy rule maps crew_sleep.py and its
test; the ticket folder is removed (the spec ships as code and CHANGELOG).

Claude-Session: https://claude.ai/code/session_016wQA2o38aSB65bpjaGpMVJ
</commit_message>
<xml_diff>
--- a/docs/guides/crew/crew-1.0-configuration-reference.docx
+++ b/docs/guides/crew/crew-1.0-configuration-reference.docx
@@ -741,11 +741,11 @@
         <w:rPr>
           <w:rStyle w:val="Strong"/>
         </w:rPr>
-        <w:t>132 keys</w:t>
+        <w:t>135 keys</w:t>
       </w:r>
       <w:r>
         <w:rPr/>
-        <w:t>: 74 settable in the machine-global file, 58 repo-only.</w:t>
+        <w:t>: 74 settable in the machine-global file, 61 repo-only.</w:t>
       </w:r>
     </w:p>
     <w:p>
@@ -24925,12 +24925,12 @@
         </w:tblCellMar>
       </w:tblPr>
       <w:tblGrid>
-        <w:gridCol w:w="3207"/>
-        <w:gridCol w:w="1400"/>
-        <w:gridCol w:w="1157"/>
-        <w:gridCol w:w="2757"/>
-        <w:gridCol w:w="1291"/>
-        <w:gridCol w:w="2959"/>
+        <w:gridCol w:w="3588"/>
+        <w:gridCol w:w="1204"/>
+        <w:gridCol w:w="1156"/>
+        <w:gridCol w:w="2033"/>
+        <w:gridCol w:w="1288"/>
+        <w:gridCol w:w="3502"/>
       </w:tblGrid>
       <w:tr>
         <w:trPr>
@@ -24938,7 +24938,7 @@
         </w:trPr>
         <w:tc>
           <w:tcPr>
-            <w:tcW w:w="3207" w:type="dxa"/>
+            <w:tcW w:w="3588" w:type="dxa"/>
             <w:tcBorders/>
             <w:vAlign w:val="center"/>
           </w:tcPr>
@@ -24960,7 +24960,7 @@
         </w:tc>
         <w:tc>
           <w:tcPr>
-            <w:tcW w:w="1400" w:type="dxa"/>
+            <w:tcW w:w="1204" w:type="dxa"/>
             <w:tcBorders/>
             <w:vAlign w:val="center"/>
           </w:tcPr>
@@ -24982,7 +24982,7 @@
         </w:tc>
         <w:tc>
           <w:tcPr>
-            <w:tcW w:w="1157" w:type="dxa"/>
+            <w:tcW w:w="1156" w:type="dxa"/>
             <w:tcBorders/>
             <w:vAlign w:val="center"/>
           </w:tcPr>
@@ -25004,7 +25004,7 @@
         </w:tc>
         <w:tc>
           <w:tcPr>
-            <w:tcW w:w="2757" w:type="dxa"/>
+            <w:tcW w:w="2033" w:type="dxa"/>
             <w:tcBorders/>
             <w:vAlign w:val="center"/>
           </w:tcPr>
@@ -25026,7 +25026,7 @@
         </w:tc>
         <w:tc>
           <w:tcPr>
-            <w:tcW w:w="1291" w:type="dxa"/>
+            <w:tcW w:w="1288" w:type="dxa"/>
             <w:tcBorders/>
             <w:vAlign w:val="center"/>
           </w:tcPr>
@@ -25048,7 +25048,7 @@
         </w:tc>
         <w:tc>
           <w:tcPr>
-            <w:tcW w:w="2959" w:type="dxa"/>
+            <w:tcW w:w="3502" w:type="dxa"/>
             <w:tcBorders/>
             <w:vAlign w:val="center"/>
           </w:tcPr>
@@ -25073,7 +25073,7 @@
         <w:trPr/>
         <w:tc>
           <w:tcPr>
-            <w:tcW w:w="3207" w:type="dxa"/>
+            <w:tcW w:w="3588" w:type="dxa"/>
             <w:tcBorders/>
             <w:vAlign w:val="center"/>
           </w:tcPr>
@@ -25096,7 +25096,7 @@
         </w:tc>
         <w:tc>
           <w:tcPr>
-            <w:tcW w:w="1400" w:type="dxa"/>
+            <w:tcW w:w="1204" w:type="dxa"/>
             <w:tcBorders/>
             <w:vAlign w:val="center"/>
           </w:tcPr>
@@ -25117,7 +25117,7 @@
         </w:tc>
         <w:tc>
           <w:tcPr>
-            <w:tcW w:w="1157" w:type="dxa"/>
+            <w:tcW w:w="1156" w:type="dxa"/>
             <w:tcBorders/>
             <w:vAlign w:val="center"/>
           </w:tcPr>
@@ -25140,7 +25140,7 @@
         </w:tc>
         <w:tc>
           <w:tcPr>
-            <w:tcW w:w="2757" w:type="dxa"/>
+            <w:tcW w:w="2033" w:type="dxa"/>
             <w:tcBorders/>
             <w:vAlign w:val="center"/>
           </w:tcPr>
@@ -25187,7 +25187,7 @@
         </w:tc>
         <w:tc>
           <w:tcPr>
-            <w:tcW w:w="1291" w:type="dxa"/>
+            <w:tcW w:w="1288" w:type="dxa"/>
             <w:tcBorders/>
             <w:vAlign w:val="center"/>
           </w:tcPr>
@@ -25208,7 +25208,7 @@
         </w:tc>
         <w:tc>
           <w:tcPr>
-            <w:tcW w:w="2959" w:type="dxa"/>
+            <w:tcW w:w="3502" w:type="dxa"/>
             <w:tcBorders/>
             <w:vAlign w:val="center"/>
           </w:tcPr>
@@ -25252,7 +25252,7 @@
         <w:trPr/>
         <w:tc>
           <w:tcPr>
-            <w:tcW w:w="3207" w:type="dxa"/>
+            <w:tcW w:w="3588" w:type="dxa"/>
             <w:tcBorders/>
             <w:vAlign w:val="center"/>
           </w:tcPr>
@@ -25275,7 +25275,7 @@
         </w:tc>
         <w:tc>
           <w:tcPr>
-            <w:tcW w:w="1400" w:type="dxa"/>
+            <w:tcW w:w="1204" w:type="dxa"/>
             <w:tcBorders/>
             <w:vAlign w:val="center"/>
           </w:tcPr>
@@ -25296,7 +25296,7 @@
         </w:tc>
         <w:tc>
           <w:tcPr>
-            <w:tcW w:w="1157" w:type="dxa"/>
+            <w:tcW w:w="1156" w:type="dxa"/>
             <w:tcBorders/>
             <w:vAlign w:val="center"/>
           </w:tcPr>
@@ -25319,7 +25319,7 @@
         </w:tc>
         <w:tc>
           <w:tcPr>
-            <w:tcW w:w="2757" w:type="dxa"/>
+            <w:tcW w:w="2033" w:type="dxa"/>
             <w:tcBorders/>
             <w:vAlign w:val="center"/>
           </w:tcPr>
@@ -25350,7 +25350,7 @@
         </w:tc>
         <w:tc>
           <w:tcPr>
-            <w:tcW w:w="1291" w:type="dxa"/>
+            <w:tcW w:w="1288" w:type="dxa"/>
             <w:tcBorders/>
             <w:vAlign w:val="center"/>
           </w:tcPr>
@@ -25371,7 +25371,7 @@
         </w:tc>
         <w:tc>
           <w:tcPr>
-            <w:tcW w:w="2959" w:type="dxa"/>
+            <w:tcW w:w="3502" w:type="dxa"/>
             <w:tcBorders/>
             <w:vAlign w:val="center"/>
           </w:tcPr>
@@ -25395,7 +25395,7 @@
         <w:trPr/>
         <w:tc>
           <w:tcPr>
-            <w:tcW w:w="3207" w:type="dxa"/>
+            <w:tcW w:w="3588" w:type="dxa"/>
             <w:tcBorders/>
             <w:vAlign w:val="center"/>
           </w:tcPr>
@@ -25418,7 +25418,7 @@
         </w:tc>
         <w:tc>
           <w:tcPr>
-            <w:tcW w:w="1400" w:type="dxa"/>
+            <w:tcW w:w="1204" w:type="dxa"/>
             <w:tcBorders/>
             <w:vAlign w:val="center"/>
           </w:tcPr>
@@ -25439,7 +25439,7 @@
         </w:tc>
         <w:tc>
           <w:tcPr>
-            <w:tcW w:w="1157" w:type="dxa"/>
+            <w:tcW w:w="1156" w:type="dxa"/>
             <w:tcBorders/>
             <w:vAlign w:val="center"/>
           </w:tcPr>
@@ -25462,7 +25462,7 @@
         </w:tc>
         <w:tc>
           <w:tcPr>
-            <w:tcW w:w="2757" w:type="dxa"/>
+            <w:tcW w:w="2033" w:type="dxa"/>
             <w:tcBorders/>
             <w:vAlign w:val="center"/>
           </w:tcPr>
@@ -25505,7 +25505,7 @@
         </w:tc>
         <w:tc>
           <w:tcPr>
-            <w:tcW w:w="1291" w:type="dxa"/>
+            <w:tcW w:w="1288" w:type="dxa"/>
             <w:tcBorders/>
             <w:vAlign w:val="center"/>
           </w:tcPr>
@@ -25526,7 +25526,7 @@
         </w:tc>
         <w:tc>
           <w:tcPr>
-            <w:tcW w:w="2959" w:type="dxa"/>
+            <w:tcW w:w="3502" w:type="dxa"/>
             <w:tcBorders/>
             <w:vAlign w:val="center"/>
           </w:tcPr>
@@ -25560,7 +25560,7 @@
         <w:trPr/>
         <w:tc>
           <w:tcPr>
-            <w:tcW w:w="3207" w:type="dxa"/>
+            <w:tcW w:w="3588" w:type="dxa"/>
             <w:tcBorders/>
             <w:vAlign w:val="center"/>
           </w:tcPr>
@@ -25583,7 +25583,7 @@
         </w:tc>
         <w:tc>
           <w:tcPr>
-            <w:tcW w:w="1400" w:type="dxa"/>
+            <w:tcW w:w="1204" w:type="dxa"/>
             <w:tcBorders/>
             <w:vAlign w:val="center"/>
           </w:tcPr>
@@ -25604,7 +25604,7 @@
         </w:tc>
         <w:tc>
           <w:tcPr>
-            <w:tcW w:w="1157" w:type="dxa"/>
+            <w:tcW w:w="1156" w:type="dxa"/>
             <w:tcBorders/>
             <w:vAlign w:val="center"/>
           </w:tcPr>
@@ -25627,7 +25627,7 @@
         </w:tc>
         <w:tc>
           <w:tcPr>
-            <w:tcW w:w="2757" w:type="dxa"/>
+            <w:tcW w:w="2033" w:type="dxa"/>
             <w:tcBorders/>
             <w:vAlign w:val="center"/>
           </w:tcPr>
@@ -25670,7 +25670,7 @@
         </w:tc>
         <w:tc>
           <w:tcPr>
-            <w:tcW w:w="1291" w:type="dxa"/>
+            <w:tcW w:w="1288" w:type="dxa"/>
             <w:tcBorders/>
             <w:vAlign w:val="center"/>
           </w:tcPr>
@@ -25691,7 +25691,7 @@
         </w:tc>
         <w:tc>
           <w:tcPr>
-            <w:tcW w:w="2959" w:type="dxa"/>
+            <w:tcW w:w="3502" w:type="dxa"/>
             <w:tcBorders/>
             <w:vAlign w:val="center"/>
           </w:tcPr>
@@ -25725,7 +25725,7 @@
         <w:trPr/>
         <w:tc>
           <w:tcPr>
-            <w:tcW w:w="3207" w:type="dxa"/>
+            <w:tcW w:w="3588" w:type="dxa"/>
             <w:tcBorders/>
             <w:vAlign w:val="center"/>
           </w:tcPr>
@@ -25748,7 +25748,7 @@
         </w:tc>
         <w:tc>
           <w:tcPr>
-            <w:tcW w:w="1400" w:type="dxa"/>
+            <w:tcW w:w="1204" w:type="dxa"/>
             <w:tcBorders/>
             <w:vAlign w:val="center"/>
           </w:tcPr>
@@ -25769,7 +25769,7 @@
         </w:tc>
         <w:tc>
           <w:tcPr>
-            <w:tcW w:w="1157" w:type="dxa"/>
+            <w:tcW w:w="1156" w:type="dxa"/>
             <w:tcBorders/>
             <w:vAlign w:val="center"/>
           </w:tcPr>
@@ -25792,7 +25792,7 @@
         </w:tc>
         <w:tc>
           <w:tcPr>
-            <w:tcW w:w="2757" w:type="dxa"/>
+            <w:tcW w:w="2033" w:type="dxa"/>
             <w:tcBorders/>
             <w:vAlign w:val="center"/>
           </w:tcPr>
@@ -25835,7 +25835,7 @@
         </w:tc>
         <w:tc>
           <w:tcPr>
-            <w:tcW w:w="1291" w:type="dxa"/>
+            <w:tcW w:w="1288" w:type="dxa"/>
             <w:tcBorders/>
             <w:vAlign w:val="center"/>
           </w:tcPr>
@@ -25856,7 +25856,7 @@
         </w:tc>
         <w:tc>
           <w:tcPr>
-            <w:tcW w:w="2959" w:type="dxa"/>
+            <w:tcW w:w="3502" w:type="dxa"/>
             <w:tcBorders/>
             <w:vAlign w:val="center"/>
           </w:tcPr>
@@ -25882,6 +25882,529 @@
             <w:r>
               <w:rPr/>
               <w:t>.</w:t>
+            </w:r>
+          </w:p>
+        </w:tc>
+      </w:tr>
+      <w:tr>
+        <w:trPr/>
+        <w:tc>
+          <w:tcPr>
+            <w:tcW w:w="3588" w:type="dxa"/>
+            <w:tcBorders/>
+            <w:vAlign w:val="center"/>
+          </w:tcPr>
+          <w:p>
+            <w:pPr>
+              <w:pStyle w:val="TableContents"/>
+              <w:shd w:fill="2E3440" w:val="clear"/>
+              <w:bidi w:val="0"/>
+              <w:spacing w:before="120" w:after="120"/>
+              <w:jc w:val="left"/>
+              <w:rPr/>
+            </w:pPr>
+            <w:r>
+              <w:rPr>
+                <w:rStyle w:val="SourceText"/>
+              </w:rPr>
+              <w:t>autopilot.sleep.schedule</w:t>
+            </w:r>
+          </w:p>
+        </w:tc>
+        <w:tc>
+          <w:tcPr>
+            <w:tcW w:w="1204" w:type="dxa"/>
+            <w:tcBorders/>
+            <w:vAlign w:val="center"/>
+          </w:tcPr>
+          <w:p>
+            <w:pPr>
+              <w:pStyle w:val="TableContents"/>
+              <w:shd w:fill="2E3440" w:val="clear"/>
+              <w:bidi w:val="0"/>
+              <w:spacing w:before="120" w:after="120"/>
+              <w:jc w:val="left"/>
+              <w:rPr/>
+            </w:pPr>
+            <w:r>
+              <w:rPr/>
+              <w:t>repo</w:t>
+            </w:r>
+          </w:p>
+        </w:tc>
+        <w:tc>
+          <w:tcPr>
+            <w:tcW w:w="1156" w:type="dxa"/>
+            <w:tcBorders/>
+            <w:vAlign w:val="center"/>
+          </w:tcPr>
+          <w:p>
+            <w:pPr>
+              <w:pStyle w:val="TableContents"/>
+              <w:shd w:fill="2E3440" w:val="clear"/>
+              <w:bidi w:val="0"/>
+              <w:spacing w:before="120" w:after="120"/>
+              <w:jc w:val="left"/>
+              <w:rPr/>
+            </w:pPr>
+            <w:r>
+              <w:rPr>
+                <w:rStyle w:val="SourceText"/>
+              </w:rPr>
+              <w:t>null</w:t>
+            </w:r>
+          </w:p>
+        </w:tc>
+        <w:tc>
+          <w:tcPr>
+            <w:tcW w:w="2033" w:type="dxa"/>
+            <w:tcBorders/>
+            <w:vAlign w:val="center"/>
+          </w:tcPr>
+          <w:p>
+            <w:pPr>
+              <w:pStyle w:val="TableContents"/>
+              <w:shd w:fill="2E3440" w:val="clear"/>
+              <w:bidi w:val="0"/>
+              <w:spacing w:before="120" w:after="120"/>
+              <w:jc w:val="left"/>
+              <w:rPr/>
+            </w:pPr>
+            <w:r>
+              <w:rPr/>
+              <w:t xml:space="preserve">HH:MM-HH:MM or null (checked in </w:t>
+            </w:r>
+            <w:r>
+              <w:rPr>
+                <w:rStyle w:val="SourceText"/>
+              </w:rPr>
+              <w:t>plugin/crew/hooks/scripts/crew_sleep.py</w:t>
+            </w:r>
+            <w:r>
+              <w:rPr/>
+              <w:t>)</w:t>
+            </w:r>
+          </w:p>
+        </w:tc>
+        <w:tc>
+          <w:tcPr>
+            <w:tcW w:w="1288" w:type="dxa"/>
+            <w:tcBorders/>
+            <w:vAlign w:val="center"/>
+          </w:tcPr>
+          <w:p>
+            <w:pPr>
+              <w:pStyle w:val="TableContents"/>
+              <w:shd w:fill="2E3440" w:val="clear"/>
+              <w:bidi w:val="0"/>
+              <w:spacing w:before="120" w:after="120"/>
+              <w:jc w:val="left"/>
+              <w:rPr/>
+            </w:pPr>
+            <w:r>
+              <w:rPr/>
+              <w:t>1.0.394</w:t>
+            </w:r>
+          </w:p>
+        </w:tc>
+        <w:tc>
+          <w:tcPr>
+            <w:tcW w:w="3502" w:type="dxa"/>
+            <w:tcBorders/>
+            <w:vAlign w:val="center"/>
+          </w:tcPr>
+          <w:p>
+            <w:pPr>
+              <w:pStyle w:val="TableContents"/>
+              <w:shd w:fill="2E3440" w:val="clear"/>
+              <w:bidi w:val="0"/>
+              <w:spacing w:before="120" w:after="120"/>
+              <w:jc w:val="left"/>
+              <w:rPr/>
+            </w:pPr>
+            <w:r>
+              <w:rPr/>
+              <w:t xml:space="preserve">A nightly window, </w:t>
+            </w:r>
+            <w:r>
+              <w:rPr>
+                <w:rStyle w:val="SourceText"/>
+              </w:rPr>
+              <w:t>HH:MM-HH:MM</w:t>
+            </w:r>
+            <w:r>
+              <w:rPr/>
+              <w:t xml:space="preserve"> in machine local time (may cross midnight); inside it the two sleep overrides apply. Anything else reads as could not tell, and the day values apply.</w:t>
+            </w:r>
+          </w:p>
+        </w:tc>
+      </w:tr>
+      <w:tr>
+        <w:trPr/>
+        <w:tc>
+          <w:tcPr>
+            <w:tcW w:w="3588" w:type="dxa"/>
+            <w:tcBorders/>
+            <w:vAlign w:val="center"/>
+          </w:tcPr>
+          <w:p>
+            <w:pPr>
+              <w:pStyle w:val="TableContents"/>
+              <w:shd w:fill="2E3440" w:val="clear"/>
+              <w:bidi w:val="0"/>
+              <w:spacing w:before="120" w:after="120"/>
+              <w:jc w:val="left"/>
+              <w:rPr/>
+            </w:pPr>
+            <w:r>
+              <w:rPr>
+                <w:rStyle w:val="SourceText"/>
+              </w:rPr>
+              <w:t>autopilot.sleep.approval</w:t>
+            </w:r>
+          </w:p>
+        </w:tc>
+        <w:tc>
+          <w:tcPr>
+            <w:tcW w:w="1204" w:type="dxa"/>
+            <w:tcBorders/>
+            <w:vAlign w:val="center"/>
+          </w:tcPr>
+          <w:p>
+            <w:pPr>
+              <w:pStyle w:val="TableContents"/>
+              <w:shd w:fill="2E3440" w:val="clear"/>
+              <w:bidi w:val="0"/>
+              <w:spacing w:before="120" w:after="120"/>
+              <w:jc w:val="left"/>
+              <w:rPr/>
+            </w:pPr>
+            <w:r>
+              <w:rPr/>
+              <w:t>repo</w:t>
+            </w:r>
+          </w:p>
+        </w:tc>
+        <w:tc>
+          <w:tcPr>
+            <w:tcW w:w="1156" w:type="dxa"/>
+            <w:tcBorders/>
+            <w:vAlign w:val="center"/>
+          </w:tcPr>
+          <w:p>
+            <w:pPr>
+              <w:pStyle w:val="TableContents"/>
+              <w:shd w:fill="2E3440" w:val="clear"/>
+              <w:bidi w:val="0"/>
+              <w:spacing w:before="120" w:after="120"/>
+              <w:jc w:val="left"/>
+              <w:rPr/>
+            </w:pPr>
+            <w:r>
+              <w:rPr>
+                <w:rStyle w:val="SourceText"/>
+              </w:rPr>
+              <w:t>null</w:t>
+            </w:r>
+          </w:p>
+        </w:tc>
+        <w:tc>
+          <w:tcPr>
+            <w:tcW w:w="2033" w:type="dxa"/>
+            <w:tcBorders/>
+            <w:vAlign w:val="center"/>
+          </w:tcPr>
+          <w:p>
+            <w:pPr>
+              <w:pStyle w:val="TableContents"/>
+              <w:shd w:fill="2E3440" w:val="clear"/>
+              <w:bidi w:val="0"/>
+              <w:spacing w:before="120" w:after="120"/>
+              <w:jc w:val="left"/>
+              <w:rPr/>
+            </w:pPr>
+            <w:r>
+              <w:rPr>
+                <w:rStyle w:val="SourceText"/>
+              </w:rPr>
+              <w:t>null</w:t>
+            </w:r>
+            <w:r>
+              <w:rPr/>
+              <w:t xml:space="preserve"> | </w:t>
+            </w:r>
+            <w:r>
+              <w:rPr>
+                <w:rStyle w:val="SourceText"/>
+              </w:rPr>
+              <w:t>human</w:t>
+            </w:r>
+            <w:r>
+              <w:rPr/>
+              <w:t xml:space="preserve"> | </w:t>
+            </w:r>
+            <w:r>
+              <w:rPr>
+                <w:rStyle w:val="SourceText"/>
+              </w:rPr>
+              <w:t>self</w:t>
+            </w:r>
+            <w:r>
+              <w:rPr/>
+              <w:t xml:space="preserve"> | </w:t>
+            </w:r>
+            <w:r>
+              <w:rPr>
+                <w:rStyle w:val="SourceText"/>
+              </w:rPr>
+              <w:t>risk</w:t>
+            </w:r>
+            <w:r>
+              <w:rPr/>
+              <w:t xml:space="preserve"> (checked in </w:t>
+            </w:r>
+            <w:r>
+              <w:rPr>
+                <w:rStyle w:val="SourceText"/>
+              </w:rPr>
+              <w:t>plugin/crew/hooks/scripts/crew_sleep.py</w:t>
+            </w:r>
+            <w:r>
+              <w:rPr/>
+              <w:t>)</w:t>
+            </w:r>
+          </w:p>
+        </w:tc>
+        <w:tc>
+          <w:tcPr>
+            <w:tcW w:w="1288" w:type="dxa"/>
+            <w:tcBorders/>
+            <w:vAlign w:val="center"/>
+          </w:tcPr>
+          <w:p>
+            <w:pPr>
+              <w:pStyle w:val="TableContents"/>
+              <w:shd w:fill="2E3440" w:val="clear"/>
+              <w:bidi w:val="0"/>
+              <w:spacing w:before="120" w:after="120"/>
+              <w:jc w:val="left"/>
+              <w:rPr/>
+            </w:pPr>
+            <w:r>
+              <w:rPr/>
+              <w:t>1.0.394</w:t>
+            </w:r>
+          </w:p>
+        </w:tc>
+        <w:tc>
+          <w:tcPr>
+            <w:tcW w:w="3502" w:type="dxa"/>
+            <w:tcBorders/>
+            <w:vAlign w:val="center"/>
+          </w:tcPr>
+          <w:p>
+            <w:pPr>
+              <w:pStyle w:val="TableContents"/>
+              <w:shd w:fill="2E3440" w:val="clear"/>
+              <w:bidi w:val="0"/>
+              <w:spacing w:before="120" w:after="120"/>
+              <w:jc w:val="left"/>
+              <w:rPr/>
+            </w:pPr>
+            <w:r>
+              <w:rPr>
+                <w:rStyle w:val="SourceText"/>
+              </w:rPr>
+              <w:t>autopilot.approval</w:t>
+            </w:r>
+            <w:r>
+              <w:rPr/>
+              <w:t xml:space="preserve"> inside the sleep window; null keeps the day value, and so does anything else, with a warning.</w:t>
+            </w:r>
+          </w:p>
+        </w:tc>
+      </w:tr>
+      <w:tr>
+        <w:trPr/>
+        <w:tc>
+          <w:tcPr>
+            <w:tcW w:w="3588" w:type="dxa"/>
+            <w:tcBorders/>
+            <w:vAlign w:val="center"/>
+          </w:tcPr>
+          <w:p>
+            <w:pPr>
+              <w:pStyle w:val="TableContents"/>
+              <w:shd w:fill="2E3440" w:val="clear"/>
+              <w:bidi w:val="0"/>
+              <w:spacing w:before="120" w:after="120"/>
+              <w:jc w:val="left"/>
+              <w:rPr/>
+            </w:pPr>
+            <w:r>
+              <w:rPr>
+                <w:rStyle w:val="SourceText"/>
+              </w:rPr>
+              <w:t>autopilot.sleep.questions</w:t>
+            </w:r>
+          </w:p>
+        </w:tc>
+        <w:tc>
+          <w:tcPr>
+            <w:tcW w:w="1204" w:type="dxa"/>
+            <w:tcBorders/>
+            <w:vAlign w:val="center"/>
+          </w:tcPr>
+          <w:p>
+            <w:pPr>
+              <w:pStyle w:val="TableContents"/>
+              <w:shd w:fill="2E3440" w:val="clear"/>
+              <w:bidi w:val="0"/>
+              <w:spacing w:before="120" w:after="120"/>
+              <w:jc w:val="left"/>
+              <w:rPr/>
+            </w:pPr>
+            <w:r>
+              <w:rPr/>
+              <w:t>repo</w:t>
+            </w:r>
+          </w:p>
+        </w:tc>
+        <w:tc>
+          <w:tcPr>
+            <w:tcW w:w="1156" w:type="dxa"/>
+            <w:tcBorders/>
+            <w:vAlign w:val="center"/>
+          </w:tcPr>
+          <w:p>
+            <w:pPr>
+              <w:pStyle w:val="TableContents"/>
+              <w:shd w:fill="2E3440" w:val="clear"/>
+              <w:bidi w:val="0"/>
+              <w:spacing w:before="120" w:after="120"/>
+              <w:jc w:val="left"/>
+              <w:rPr/>
+            </w:pPr>
+            <w:r>
+              <w:rPr>
+                <w:rStyle w:val="SourceText"/>
+              </w:rPr>
+              <w:t>null</w:t>
+            </w:r>
+          </w:p>
+        </w:tc>
+        <w:tc>
+          <w:tcPr>
+            <w:tcW w:w="2033" w:type="dxa"/>
+            <w:tcBorders/>
+            <w:vAlign w:val="center"/>
+          </w:tcPr>
+          <w:p>
+            <w:pPr>
+              <w:pStyle w:val="TableContents"/>
+              <w:shd w:fill="2E3440" w:val="clear"/>
+              <w:bidi w:val="0"/>
+              <w:spacing w:before="120" w:after="120"/>
+              <w:jc w:val="left"/>
+              <w:rPr/>
+            </w:pPr>
+            <w:r>
+              <w:rPr>
+                <w:rStyle w:val="SourceText"/>
+              </w:rPr>
+              <w:t>null</w:t>
+            </w:r>
+            <w:r>
+              <w:rPr/>
+              <w:t xml:space="preserve"> | </w:t>
+            </w:r>
+            <w:r>
+              <w:rPr>
+                <w:rStyle w:val="SourceText"/>
+              </w:rPr>
+              <w:t>human</w:t>
+            </w:r>
+            <w:r>
+              <w:rPr/>
+              <w:t xml:space="preserve"> | </w:t>
+            </w:r>
+            <w:r>
+              <w:rPr>
+                <w:rStyle w:val="SourceText"/>
+              </w:rPr>
+              <w:t>self</w:t>
+            </w:r>
+            <w:r>
+              <w:rPr/>
+              <w:t xml:space="preserve"> | </w:t>
+            </w:r>
+            <w:r>
+              <w:rPr>
+                <w:rStyle w:val="SourceText"/>
+              </w:rPr>
+              <w:t>risk</w:t>
+            </w:r>
+            <w:r>
+              <w:rPr/>
+              <w:t xml:space="preserve"> (checked in </w:t>
+            </w:r>
+            <w:r>
+              <w:rPr>
+                <w:rStyle w:val="SourceText"/>
+              </w:rPr>
+              <w:t>plugin/crew/hooks/scripts/crew_sleep.py</w:t>
+            </w:r>
+            <w:r>
+              <w:rPr/>
+              <w:t>)</w:t>
+            </w:r>
+          </w:p>
+        </w:tc>
+        <w:tc>
+          <w:tcPr>
+            <w:tcW w:w="1288" w:type="dxa"/>
+            <w:tcBorders/>
+            <w:vAlign w:val="center"/>
+          </w:tcPr>
+          <w:p>
+            <w:pPr>
+              <w:pStyle w:val="TableContents"/>
+              <w:shd w:fill="2E3440" w:val="clear"/>
+              <w:bidi w:val="0"/>
+              <w:spacing w:before="120" w:after="120"/>
+              <w:jc w:val="left"/>
+              <w:rPr/>
+            </w:pPr>
+            <w:r>
+              <w:rPr/>
+              <w:t>1.0.394</w:t>
+            </w:r>
+          </w:p>
+        </w:tc>
+        <w:tc>
+          <w:tcPr>
+            <w:tcW w:w="3502" w:type="dxa"/>
+            <w:tcBorders/>
+            <w:vAlign w:val="center"/>
+          </w:tcPr>
+          <w:p>
+            <w:pPr>
+              <w:pStyle w:val="TableContents"/>
+              <w:shd w:fill="2E3440" w:val="clear"/>
+              <w:bidi w:val="0"/>
+              <w:spacing w:before="120" w:after="120"/>
+              <w:jc w:val="left"/>
+              <w:rPr/>
+            </w:pPr>
+            <w:r>
+              <w:rPr>
+                <w:rStyle w:val="SourceText"/>
+              </w:rPr>
+              <w:t>autopilot.questions</w:t>
+            </w:r>
+            <w:r>
+              <w:rPr/>
+              <w:t xml:space="preserve"> inside the sleep window; null keeps the day value, and so does anything else, with a warning.</w:t>
             </w:r>
           </w:p>
         </w:tc>

</xml_diff>

<commit_message>
T-0053 review round 1: docs for the stricter-override rule, TZ and window length
CONFIG.md, README and CHANGELOG: an unknown sleep state takes the stricter
of the day value and a valid override (owner decision taken on the
recommendation); the clock is local time in the process TZ and approve /
questions-check run in the model's shell environment (N3); a window can be
up to 23h59 and a looser night value applies for all of it (N4). crew_keys
row and the generated reference follow; code map re-derived at 7f3fb820;
verify.json re-measured.

N5: plan.md was removed with the ticket folder in 4a839b47; its Touch
amendment is recorded here and in the PR body: crew_keys.py,
test_crew_keys.py and docs/guides/crew/src/configuration-reference.md were
touched, and crew_sleep.resolve takes (block, when, policies) rather than
the spec's (block, now), with read_overrides added in review round 1.

Claude-Session: https://claude.ai/code/session_016wQA2o38aSB65bpjaGpMVJ
</commit_message>
<xml_diff>
--- a/docs/guides/crew/crew-1.0-configuration-reference.docx
+++ b/docs/guides/crew/crew-1.0-configuration-reference.docx
@@ -24925,8 +24925,8 @@
         </w:tblCellMar>
       </w:tblPr>
       <w:tblGrid>
-        <w:gridCol w:w="3588"/>
-        <w:gridCol w:w="1204"/>
+        <w:gridCol w:w="3589"/>
+        <w:gridCol w:w="1203"/>
         <w:gridCol w:w="1156"/>
         <w:gridCol w:w="2033"/>
         <w:gridCol w:w="1288"/>
@@ -24938,7 +24938,7 @@
         </w:trPr>
         <w:tc>
           <w:tcPr>
-            <w:tcW w:w="3588" w:type="dxa"/>
+            <w:tcW w:w="3589" w:type="dxa"/>
             <w:tcBorders/>
             <w:vAlign w:val="center"/>
           </w:tcPr>
@@ -24960,7 +24960,7 @@
         </w:tc>
         <w:tc>
           <w:tcPr>
-            <w:tcW w:w="1204" w:type="dxa"/>
+            <w:tcW w:w="1203" w:type="dxa"/>
             <w:tcBorders/>
             <w:vAlign w:val="center"/>
           </w:tcPr>
@@ -25073,7 +25073,7 @@
         <w:trPr/>
         <w:tc>
           <w:tcPr>
-            <w:tcW w:w="3588" w:type="dxa"/>
+            <w:tcW w:w="3589" w:type="dxa"/>
             <w:tcBorders/>
             <w:vAlign w:val="center"/>
           </w:tcPr>
@@ -25096,7 +25096,7 @@
         </w:tc>
         <w:tc>
           <w:tcPr>
-            <w:tcW w:w="1204" w:type="dxa"/>
+            <w:tcW w:w="1203" w:type="dxa"/>
             <w:tcBorders/>
             <w:vAlign w:val="center"/>
           </w:tcPr>
@@ -25252,7 +25252,7 @@
         <w:trPr/>
         <w:tc>
           <w:tcPr>
-            <w:tcW w:w="3588" w:type="dxa"/>
+            <w:tcW w:w="3589" w:type="dxa"/>
             <w:tcBorders/>
             <w:vAlign w:val="center"/>
           </w:tcPr>
@@ -25275,7 +25275,7 @@
         </w:tc>
         <w:tc>
           <w:tcPr>
-            <w:tcW w:w="1204" w:type="dxa"/>
+            <w:tcW w:w="1203" w:type="dxa"/>
             <w:tcBorders/>
             <w:vAlign w:val="center"/>
           </w:tcPr>
@@ -25395,7 +25395,7 @@
         <w:trPr/>
         <w:tc>
           <w:tcPr>
-            <w:tcW w:w="3588" w:type="dxa"/>
+            <w:tcW w:w="3589" w:type="dxa"/>
             <w:tcBorders/>
             <w:vAlign w:val="center"/>
           </w:tcPr>
@@ -25418,7 +25418,7 @@
         </w:tc>
         <w:tc>
           <w:tcPr>
-            <w:tcW w:w="1204" w:type="dxa"/>
+            <w:tcW w:w="1203" w:type="dxa"/>
             <w:tcBorders/>
             <w:vAlign w:val="center"/>
           </w:tcPr>
@@ -25560,7 +25560,7 @@
         <w:trPr/>
         <w:tc>
           <w:tcPr>
-            <w:tcW w:w="3588" w:type="dxa"/>
+            <w:tcW w:w="3589" w:type="dxa"/>
             <w:tcBorders/>
             <w:vAlign w:val="center"/>
           </w:tcPr>
@@ -25583,7 +25583,7 @@
         </w:tc>
         <w:tc>
           <w:tcPr>
-            <w:tcW w:w="1204" w:type="dxa"/>
+            <w:tcW w:w="1203" w:type="dxa"/>
             <w:tcBorders/>
             <w:vAlign w:val="center"/>
           </w:tcPr>
@@ -25725,7 +25725,7 @@
         <w:trPr/>
         <w:tc>
           <w:tcPr>
-            <w:tcW w:w="3588" w:type="dxa"/>
+            <w:tcW w:w="3589" w:type="dxa"/>
             <w:tcBorders/>
             <w:vAlign w:val="center"/>
           </w:tcPr>
@@ -25748,7 +25748,7 @@
         </w:tc>
         <w:tc>
           <w:tcPr>
-            <w:tcW w:w="1204" w:type="dxa"/>
+            <w:tcW w:w="1203" w:type="dxa"/>
             <w:tcBorders/>
             <w:vAlign w:val="center"/>
           </w:tcPr>
@@ -25890,7 +25890,7 @@
         <w:trPr/>
         <w:tc>
           <w:tcPr>
-            <w:tcW w:w="3588" w:type="dxa"/>
+            <w:tcW w:w="3589" w:type="dxa"/>
             <w:tcBorders/>
             <w:vAlign w:val="center"/>
           </w:tcPr>
@@ -25913,7 +25913,7 @@
         </w:tc>
         <w:tc>
           <w:tcPr>
-            <w:tcW w:w="1204" w:type="dxa"/>
+            <w:tcW w:w="1203" w:type="dxa"/>
             <w:tcBorders/>
             <w:vAlign w:val="center"/>
           </w:tcPr>
@@ -26034,7 +26034,7 @@
             </w:r>
             <w:r>
               <w:rPr/>
-              <w:t xml:space="preserve"> in machine local time (may cross midnight); inside it the two sleep overrides apply. Anything else reads as could not tell, and the day values apply.</w:t>
+              <w:t xml:space="preserve"> in machine local time (may cross midnight); inside it the two sleep overrides apply. Anything else is could not tell: only a stricter override applies.</w:t>
             </w:r>
           </w:p>
         </w:tc>
@@ -26043,7 +26043,7 @@
         <w:trPr/>
         <w:tc>
           <w:tcPr>
-            <w:tcW w:w="3588" w:type="dxa"/>
+            <w:tcW w:w="3589" w:type="dxa"/>
             <w:tcBorders/>
             <w:vAlign w:val="center"/>
           </w:tcPr>
@@ -26066,7 +26066,7 @@
         </w:tc>
         <w:tc>
           <w:tcPr>
-            <w:tcW w:w="1204" w:type="dxa"/>
+            <w:tcW w:w="1203" w:type="dxa"/>
             <w:tcBorders/>
             <w:vAlign w:val="center"/>
           </w:tcPr>
@@ -26228,7 +26228,7 @@
         <w:trPr/>
         <w:tc>
           <w:tcPr>
-            <w:tcW w:w="3588" w:type="dxa"/>
+            <w:tcW w:w="3589" w:type="dxa"/>
             <w:tcBorders/>
             <w:vAlign w:val="center"/>
           </w:tcPr>
@@ -26251,7 +26251,7 @@
         </w:tc>
         <w:tc>
           <w:tcPr>
-            <w:tcW w:w="1204" w:type="dxa"/>
+            <w:tcW w:w="1203" w:type="dxa"/>
             <w:tcBorders/>
             <w:vAlign w:val="center"/>
           </w:tcPr>

</xml_diff>

<commit_message>
T-0074: refresh artifacts (code map citations, rules, guides rebuilt, review diagram page, BUDGETS) and remove docs/tickets/T-0074
The spec ships as code and the CHANGELOG entry.

Claude-Session: https://claude.ai/code/session_016wQA2o38aSB65bpjaGpMVJ
</commit_message>
<xml_diff>
--- a/docs/guides/crew/crew-1.0-configuration-reference.docx
+++ b/docs/guides/crew/crew-1.0-configuration-reference.docx
@@ -741,11 +741,11 @@
         <w:rPr>
           <w:rStyle w:val="Strong"/>
         </w:rPr>
-        <w:t>132 keys</w:t>
+        <w:t>133 keys</w:t>
       </w:r>
       <w:r>
         <w:rPr/>
-        <w:t>: 74 settable in the machine-global file, 58 repo-only.</w:t>
+        <w:t>: 74 settable in the machine-global file, 59 repo-only.</w:t>
       </w:r>
     </w:p>
     <w:p>
@@ -24925,12 +24925,12 @@
         </w:tblCellMar>
       </w:tblPr>
       <w:tblGrid>
-        <w:gridCol w:w="3207"/>
-        <w:gridCol w:w="1400"/>
-        <w:gridCol w:w="1157"/>
-        <w:gridCol w:w="2757"/>
-        <w:gridCol w:w="1291"/>
-        <w:gridCol w:w="2959"/>
+        <w:gridCol w:w="3595"/>
+        <w:gridCol w:w="1280"/>
+        <w:gridCol w:w="1156"/>
+        <w:gridCol w:w="2307"/>
+        <w:gridCol w:w="1346"/>
+        <w:gridCol w:w="3087"/>
       </w:tblGrid>
       <w:tr>
         <w:trPr>
@@ -24938,7 +24938,7 @@
         </w:trPr>
         <w:tc>
           <w:tcPr>
-            <w:tcW w:w="3207" w:type="dxa"/>
+            <w:tcW w:w="3595" w:type="dxa"/>
             <w:tcBorders/>
             <w:vAlign w:val="center"/>
           </w:tcPr>
@@ -24960,7 +24960,7 @@
         </w:tc>
         <w:tc>
           <w:tcPr>
-            <w:tcW w:w="1400" w:type="dxa"/>
+            <w:tcW w:w="1280" w:type="dxa"/>
             <w:tcBorders/>
             <w:vAlign w:val="center"/>
           </w:tcPr>
@@ -24982,7 +24982,7 @@
         </w:tc>
         <w:tc>
           <w:tcPr>
-            <w:tcW w:w="1157" w:type="dxa"/>
+            <w:tcW w:w="1156" w:type="dxa"/>
             <w:tcBorders/>
             <w:vAlign w:val="center"/>
           </w:tcPr>
@@ -25004,7 +25004,7 @@
         </w:tc>
         <w:tc>
           <w:tcPr>
-            <w:tcW w:w="2757" w:type="dxa"/>
+            <w:tcW w:w="2307" w:type="dxa"/>
             <w:tcBorders/>
             <w:vAlign w:val="center"/>
           </w:tcPr>
@@ -25026,7 +25026,7 @@
         </w:tc>
         <w:tc>
           <w:tcPr>
-            <w:tcW w:w="1291" w:type="dxa"/>
+            <w:tcW w:w="1346" w:type="dxa"/>
             <w:tcBorders/>
             <w:vAlign w:val="center"/>
           </w:tcPr>
@@ -25048,7 +25048,7 @@
         </w:tc>
         <w:tc>
           <w:tcPr>
-            <w:tcW w:w="2959" w:type="dxa"/>
+            <w:tcW w:w="3087" w:type="dxa"/>
             <w:tcBorders/>
             <w:vAlign w:val="center"/>
           </w:tcPr>
@@ -25073,7 +25073,7 @@
         <w:trPr/>
         <w:tc>
           <w:tcPr>
-            <w:tcW w:w="3207" w:type="dxa"/>
+            <w:tcW w:w="3595" w:type="dxa"/>
             <w:tcBorders/>
             <w:vAlign w:val="center"/>
           </w:tcPr>
@@ -25096,7 +25096,7 @@
         </w:tc>
         <w:tc>
           <w:tcPr>
-            <w:tcW w:w="1400" w:type="dxa"/>
+            <w:tcW w:w="1280" w:type="dxa"/>
             <w:tcBorders/>
             <w:vAlign w:val="center"/>
           </w:tcPr>
@@ -25117,7 +25117,7 @@
         </w:tc>
         <w:tc>
           <w:tcPr>
-            <w:tcW w:w="1157" w:type="dxa"/>
+            <w:tcW w:w="1156" w:type="dxa"/>
             <w:tcBorders/>
             <w:vAlign w:val="center"/>
           </w:tcPr>
@@ -25140,7 +25140,7 @@
         </w:tc>
         <w:tc>
           <w:tcPr>
-            <w:tcW w:w="2757" w:type="dxa"/>
+            <w:tcW w:w="2307" w:type="dxa"/>
             <w:tcBorders/>
             <w:vAlign w:val="center"/>
           </w:tcPr>
@@ -25187,7 +25187,7 @@
         </w:tc>
         <w:tc>
           <w:tcPr>
-            <w:tcW w:w="1291" w:type="dxa"/>
+            <w:tcW w:w="1346" w:type="dxa"/>
             <w:tcBorders/>
             <w:vAlign w:val="center"/>
           </w:tcPr>
@@ -25208,7 +25208,7 @@
         </w:tc>
         <w:tc>
           <w:tcPr>
-            <w:tcW w:w="2959" w:type="dxa"/>
+            <w:tcW w:w="3087" w:type="dxa"/>
             <w:tcBorders/>
             <w:vAlign w:val="center"/>
           </w:tcPr>
@@ -25252,7 +25252,7 @@
         <w:trPr/>
         <w:tc>
           <w:tcPr>
-            <w:tcW w:w="3207" w:type="dxa"/>
+            <w:tcW w:w="3595" w:type="dxa"/>
             <w:tcBorders/>
             <w:vAlign w:val="center"/>
           </w:tcPr>
@@ -25275,7 +25275,7 @@
         </w:tc>
         <w:tc>
           <w:tcPr>
-            <w:tcW w:w="1400" w:type="dxa"/>
+            <w:tcW w:w="1280" w:type="dxa"/>
             <w:tcBorders/>
             <w:vAlign w:val="center"/>
           </w:tcPr>
@@ -25296,7 +25296,7 @@
         </w:tc>
         <w:tc>
           <w:tcPr>
-            <w:tcW w:w="1157" w:type="dxa"/>
+            <w:tcW w:w="1156" w:type="dxa"/>
             <w:tcBorders/>
             <w:vAlign w:val="center"/>
           </w:tcPr>
@@ -25319,7 +25319,7 @@
         </w:tc>
         <w:tc>
           <w:tcPr>
-            <w:tcW w:w="2757" w:type="dxa"/>
+            <w:tcW w:w="2307" w:type="dxa"/>
             <w:tcBorders/>
             <w:vAlign w:val="center"/>
           </w:tcPr>
@@ -25350,7 +25350,7 @@
         </w:tc>
         <w:tc>
           <w:tcPr>
-            <w:tcW w:w="1291" w:type="dxa"/>
+            <w:tcW w:w="1346" w:type="dxa"/>
             <w:tcBorders/>
             <w:vAlign w:val="center"/>
           </w:tcPr>
@@ -25371,7 +25371,7 @@
         </w:tc>
         <w:tc>
           <w:tcPr>
-            <w:tcW w:w="2959" w:type="dxa"/>
+            <w:tcW w:w="3087" w:type="dxa"/>
             <w:tcBorders/>
             <w:vAlign w:val="center"/>
           </w:tcPr>
@@ -25395,7 +25395,7 @@
         <w:trPr/>
         <w:tc>
           <w:tcPr>
-            <w:tcW w:w="3207" w:type="dxa"/>
+            <w:tcW w:w="3595" w:type="dxa"/>
             <w:tcBorders/>
             <w:vAlign w:val="center"/>
           </w:tcPr>
@@ -25418,7 +25418,7 @@
         </w:tc>
         <w:tc>
           <w:tcPr>
-            <w:tcW w:w="1400" w:type="dxa"/>
+            <w:tcW w:w="1280" w:type="dxa"/>
             <w:tcBorders/>
             <w:vAlign w:val="center"/>
           </w:tcPr>
@@ -25439,7 +25439,7 @@
         </w:tc>
         <w:tc>
           <w:tcPr>
-            <w:tcW w:w="1157" w:type="dxa"/>
+            <w:tcW w:w="1156" w:type="dxa"/>
             <w:tcBorders/>
             <w:vAlign w:val="center"/>
           </w:tcPr>
@@ -25462,7 +25462,7 @@
         </w:tc>
         <w:tc>
           <w:tcPr>
-            <w:tcW w:w="2757" w:type="dxa"/>
+            <w:tcW w:w="2307" w:type="dxa"/>
             <w:tcBorders/>
             <w:vAlign w:val="center"/>
           </w:tcPr>
@@ -25505,7 +25505,7 @@
         </w:tc>
         <w:tc>
           <w:tcPr>
-            <w:tcW w:w="1291" w:type="dxa"/>
+            <w:tcW w:w="1346" w:type="dxa"/>
             <w:tcBorders/>
             <w:vAlign w:val="center"/>
           </w:tcPr>
@@ -25526,7 +25526,7 @@
         </w:tc>
         <w:tc>
           <w:tcPr>
-            <w:tcW w:w="2959" w:type="dxa"/>
+            <w:tcW w:w="3087" w:type="dxa"/>
             <w:tcBorders/>
             <w:vAlign w:val="center"/>
           </w:tcPr>
@@ -25560,7 +25560,7 @@
         <w:trPr/>
         <w:tc>
           <w:tcPr>
-            <w:tcW w:w="3207" w:type="dxa"/>
+            <w:tcW w:w="3595" w:type="dxa"/>
             <w:tcBorders/>
             <w:vAlign w:val="center"/>
           </w:tcPr>
@@ -25583,7 +25583,7 @@
         </w:tc>
         <w:tc>
           <w:tcPr>
-            <w:tcW w:w="1400" w:type="dxa"/>
+            <w:tcW w:w="1280" w:type="dxa"/>
             <w:tcBorders/>
             <w:vAlign w:val="center"/>
           </w:tcPr>
@@ -25604,7 +25604,7 @@
         </w:tc>
         <w:tc>
           <w:tcPr>
-            <w:tcW w:w="1157" w:type="dxa"/>
+            <w:tcW w:w="1156" w:type="dxa"/>
             <w:tcBorders/>
             <w:vAlign w:val="center"/>
           </w:tcPr>
@@ -25627,7 +25627,7 @@
         </w:tc>
         <w:tc>
           <w:tcPr>
-            <w:tcW w:w="2757" w:type="dxa"/>
+            <w:tcW w:w="2307" w:type="dxa"/>
             <w:tcBorders/>
             <w:vAlign w:val="center"/>
           </w:tcPr>
@@ -25670,7 +25670,7 @@
         </w:tc>
         <w:tc>
           <w:tcPr>
-            <w:tcW w:w="1291" w:type="dxa"/>
+            <w:tcW w:w="1346" w:type="dxa"/>
             <w:tcBorders/>
             <w:vAlign w:val="center"/>
           </w:tcPr>
@@ -25691,7 +25691,7 @@
         </w:tc>
         <w:tc>
           <w:tcPr>
-            <w:tcW w:w="2959" w:type="dxa"/>
+            <w:tcW w:w="3087" w:type="dxa"/>
             <w:tcBorders/>
             <w:vAlign w:val="center"/>
           </w:tcPr>
@@ -25725,7 +25725,7 @@
         <w:trPr/>
         <w:tc>
           <w:tcPr>
-            <w:tcW w:w="3207" w:type="dxa"/>
+            <w:tcW w:w="3595" w:type="dxa"/>
             <w:tcBorders/>
             <w:vAlign w:val="center"/>
           </w:tcPr>
@@ -25748,7 +25748,7 @@
         </w:tc>
         <w:tc>
           <w:tcPr>
-            <w:tcW w:w="1400" w:type="dxa"/>
+            <w:tcW w:w="1280" w:type="dxa"/>
             <w:tcBorders/>
             <w:vAlign w:val="center"/>
           </w:tcPr>
@@ -25769,7 +25769,7 @@
         </w:tc>
         <w:tc>
           <w:tcPr>
-            <w:tcW w:w="1157" w:type="dxa"/>
+            <w:tcW w:w="1156" w:type="dxa"/>
             <w:tcBorders/>
             <w:vAlign w:val="center"/>
           </w:tcPr>
@@ -25792,7 +25792,7 @@
         </w:tc>
         <w:tc>
           <w:tcPr>
-            <w:tcW w:w="2757" w:type="dxa"/>
+            <w:tcW w:w="2307" w:type="dxa"/>
             <w:tcBorders/>
             <w:vAlign w:val="center"/>
           </w:tcPr>
@@ -25835,7 +25835,7 @@
         </w:tc>
         <w:tc>
           <w:tcPr>
-            <w:tcW w:w="1291" w:type="dxa"/>
+            <w:tcW w:w="1346" w:type="dxa"/>
             <w:tcBorders/>
             <w:vAlign w:val="center"/>
           </w:tcPr>
@@ -25856,7 +25856,7 @@
         </w:tc>
         <w:tc>
           <w:tcPr>
-            <w:tcW w:w="2959" w:type="dxa"/>
+            <w:tcW w:w="3087" w:type="dxa"/>
             <w:tcBorders/>
             <w:vAlign w:val="center"/>
           </w:tcPr>
@@ -25882,6 +25882,149 @@
             <w:r>
               <w:rPr/>
               <w:t>.</w:t>
+            </w:r>
+          </w:p>
+        </w:tc>
+      </w:tr>
+      <w:tr>
+        <w:trPr/>
+        <w:tc>
+          <w:tcPr>
+            <w:tcW w:w="3595" w:type="dxa"/>
+            <w:tcBorders/>
+            <w:vAlign w:val="center"/>
+          </w:tcPr>
+          <w:p>
+            <w:pPr>
+              <w:pStyle w:val="TableContents"/>
+              <w:shd w:fill="2E3440" w:val="clear"/>
+              <w:bidi w:val="0"/>
+              <w:spacing w:before="120" w:after="120"/>
+              <w:jc w:val="left"/>
+              <w:rPr/>
+            </w:pPr>
+            <w:r>
+              <w:rPr>
+                <w:rStyle w:val="SourceText"/>
+              </w:rPr>
+              <w:t>autopilot.maxAutoReplans</w:t>
+            </w:r>
+          </w:p>
+        </w:tc>
+        <w:tc>
+          <w:tcPr>
+            <w:tcW w:w="1280" w:type="dxa"/>
+            <w:tcBorders/>
+            <w:vAlign w:val="center"/>
+          </w:tcPr>
+          <w:p>
+            <w:pPr>
+              <w:pStyle w:val="TableContents"/>
+              <w:shd w:fill="2E3440" w:val="clear"/>
+              <w:bidi w:val="0"/>
+              <w:spacing w:before="120" w:after="120"/>
+              <w:jc w:val="left"/>
+              <w:rPr/>
+            </w:pPr>
+            <w:r>
+              <w:rPr/>
+              <w:t>repo</w:t>
+            </w:r>
+          </w:p>
+        </w:tc>
+        <w:tc>
+          <w:tcPr>
+            <w:tcW w:w="1156" w:type="dxa"/>
+            <w:tcBorders/>
+            <w:vAlign w:val="center"/>
+          </w:tcPr>
+          <w:p>
+            <w:pPr>
+              <w:pStyle w:val="TableContents"/>
+              <w:shd w:fill="2E3440" w:val="clear"/>
+              <w:bidi w:val="0"/>
+              <w:spacing w:before="120" w:after="120"/>
+              <w:jc w:val="left"/>
+              <w:rPr/>
+            </w:pPr>
+            <w:r>
+              <w:rPr>
+                <w:rStyle w:val="SourceText"/>
+              </w:rPr>
+              <w:t>0</w:t>
+            </w:r>
+          </w:p>
+        </w:tc>
+        <w:tc>
+          <w:tcPr>
+            <w:tcW w:w="2307" w:type="dxa"/>
+            <w:tcBorders/>
+            <w:vAlign w:val="center"/>
+          </w:tcPr>
+          <w:p>
+            <w:pPr>
+              <w:pStyle w:val="TableContents"/>
+              <w:shd w:fill="2E3440" w:val="clear"/>
+              <w:bidi w:val="0"/>
+              <w:spacing w:before="120" w:after="120"/>
+              <w:jc w:val="left"/>
+              <w:rPr/>
+            </w:pPr>
+            <w:r>
+              <w:rPr/>
+              <w:t xml:space="preserve">non-negative integer (checked in </w:t>
+            </w:r>
+            <w:r>
+              <w:rPr>
+                <w:rStyle w:val="SourceText"/>
+              </w:rPr>
+              <w:t>plugin/crew/hooks/scripts/crew_autopilot.py</w:t>
+            </w:r>
+            <w:r>
+              <w:rPr/>
+              <w:t>)</w:t>
+            </w:r>
+          </w:p>
+        </w:tc>
+        <w:tc>
+          <w:tcPr>
+            <w:tcW w:w="1346" w:type="dxa"/>
+            <w:tcBorders/>
+            <w:vAlign w:val="center"/>
+          </w:tcPr>
+          <w:p>
+            <w:pPr>
+              <w:pStyle w:val="TableContents"/>
+              <w:shd w:fill="2E3440" w:val="clear"/>
+              <w:bidi w:val="0"/>
+              <w:spacing w:before="120" w:after="120"/>
+              <w:jc w:val="left"/>
+              <w:rPr/>
+            </w:pPr>
+            <w:r>
+              <w:rPr/>
+              <w:t>1.0.402</w:t>
+            </w:r>
+          </w:p>
+        </w:tc>
+        <w:tc>
+          <w:tcPr>
+            <w:tcW w:w="3087" w:type="dxa"/>
+            <w:tcBorders/>
+            <w:vAlign w:val="center"/>
+          </w:tcPr>
+          <w:p>
+            <w:pPr>
+              <w:pStyle w:val="TableContents"/>
+              <w:shd w:fill="2E3440" w:val="clear"/>
+              <w:bidi w:val="0"/>
+              <w:spacing w:before="120" w:after="120"/>
+              <w:jc w:val="left"/>
+              <w:rPr/>
+            </w:pPr>
+            <w:r>
+              <w:rPr/>
+              <w:t>Successor plans autopilot may start by rejecting an out-of-rounds BLOCK review itself; 0 is off, and anything but a non-negative integer reads as 0, with a warning.</w:t>
             </w:r>
           </w:p>
         </w:tc>

</xml_diff>

<commit_message>
T-0074: review round 1 - the non-stop replan re-checks the rejected round, cap at most 5, the cap stop is auto-replan-cap
F1: _auto_rejected re-runs conditions 5-8 (_block_round, shared with the
policy) on the rejected round, so a reject name typed with
review_ledger.py --reject --by gives the owner's replan stop when rounds
are left, the reviewer is the author's family, or the round is not a
FINDINGS round with a BLOCK. N3: the rejected round must be the current
plan's. N1: maxAutoReplans above 5 reads as 5 with a warning. N2: at the
cap next answers phase auto-replan-cap, its FIXED_STOPS id. Tests first,
each red on b573d4c9. Docs, guides, code map and rules follow.

Claude-Session: https://claude.ai/code/session_016wQA2o38aSB65bpjaGpMVJ
</commit_message>
<xml_diff>
--- a/docs/guides/crew/crew-1.0-configuration-reference.docx
+++ b/docs/guides/crew/crew-1.0-configuration-reference.docx
@@ -24925,12 +24925,12 @@
         </w:tblCellMar>
       </w:tblPr>
       <w:tblGrid>
-        <w:gridCol w:w="3595"/>
-        <w:gridCol w:w="1280"/>
+        <w:gridCol w:w="3601"/>
+        <w:gridCol w:w="1284"/>
         <w:gridCol w:w="1156"/>
-        <w:gridCol w:w="2307"/>
-        <w:gridCol w:w="1346"/>
-        <w:gridCol w:w="3087"/>
+        <w:gridCol w:w="2240"/>
+        <w:gridCol w:w="1349"/>
+        <w:gridCol w:w="3141"/>
       </w:tblGrid>
       <w:tr>
         <w:trPr>
@@ -24938,7 +24938,7 @@
         </w:trPr>
         <w:tc>
           <w:tcPr>
-            <w:tcW w:w="3595" w:type="dxa"/>
+            <w:tcW w:w="3601" w:type="dxa"/>
             <w:tcBorders/>
             <w:vAlign w:val="center"/>
           </w:tcPr>
@@ -24960,7 +24960,7 @@
         </w:tc>
         <w:tc>
           <w:tcPr>
-            <w:tcW w:w="1280" w:type="dxa"/>
+            <w:tcW w:w="1284" w:type="dxa"/>
             <w:tcBorders/>
             <w:vAlign w:val="center"/>
           </w:tcPr>
@@ -25004,7 +25004,7 @@
         </w:tc>
         <w:tc>
           <w:tcPr>
-            <w:tcW w:w="2307" w:type="dxa"/>
+            <w:tcW w:w="2240" w:type="dxa"/>
             <w:tcBorders/>
             <w:vAlign w:val="center"/>
           </w:tcPr>
@@ -25026,7 +25026,7 @@
         </w:tc>
         <w:tc>
           <w:tcPr>
-            <w:tcW w:w="1346" w:type="dxa"/>
+            <w:tcW w:w="1349" w:type="dxa"/>
             <w:tcBorders/>
             <w:vAlign w:val="center"/>
           </w:tcPr>
@@ -25048,7 +25048,7 @@
         </w:tc>
         <w:tc>
           <w:tcPr>
-            <w:tcW w:w="3087" w:type="dxa"/>
+            <w:tcW w:w="3141" w:type="dxa"/>
             <w:tcBorders/>
             <w:vAlign w:val="center"/>
           </w:tcPr>
@@ -25073,7 +25073,7 @@
         <w:trPr/>
         <w:tc>
           <w:tcPr>
-            <w:tcW w:w="3595" w:type="dxa"/>
+            <w:tcW w:w="3601" w:type="dxa"/>
             <w:tcBorders/>
             <w:vAlign w:val="center"/>
           </w:tcPr>
@@ -25096,7 +25096,7 @@
         </w:tc>
         <w:tc>
           <w:tcPr>
-            <w:tcW w:w="1280" w:type="dxa"/>
+            <w:tcW w:w="1284" w:type="dxa"/>
             <w:tcBorders/>
             <w:vAlign w:val="center"/>
           </w:tcPr>
@@ -25140,7 +25140,7 @@
         </w:tc>
         <w:tc>
           <w:tcPr>
-            <w:tcW w:w="2307" w:type="dxa"/>
+            <w:tcW w:w="2240" w:type="dxa"/>
             <w:tcBorders/>
             <w:vAlign w:val="center"/>
           </w:tcPr>
@@ -25187,7 +25187,7 @@
         </w:tc>
         <w:tc>
           <w:tcPr>
-            <w:tcW w:w="1346" w:type="dxa"/>
+            <w:tcW w:w="1349" w:type="dxa"/>
             <w:tcBorders/>
             <w:vAlign w:val="center"/>
           </w:tcPr>
@@ -25208,7 +25208,7 @@
         </w:tc>
         <w:tc>
           <w:tcPr>
-            <w:tcW w:w="3087" w:type="dxa"/>
+            <w:tcW w:w="3141" w:type="dxa"/>
             <w:tcBorders/>
             <w:vAlign w:val="center"/>
           </w:tcPr>
@@ -25252,7 +25252,7 @@
         <w:trPr/>
         <w:tc>
           <w:tcPr>
-            <w:tcW w:w="3595" w:type="dxa"/>
+            <w:tcW w:w="3601" w:type="dxa"/>
             <w:tcBorders/>
             <w:vAlign w:val="center"/>
           </w:tcPr>
@@ -25275,7 +25275,7 @@
         </w:tc>
         <w:tc>
           <w:tcPr>
-            <w:tcW w:w="1280" w:type="dxa"/>
+            <w:tcW w:w="1284" w:type="dxa"/>
             <w:tcBorders/>
             <w:vAlign w:val="center"/>
           </w:tcPr>
@@ -25319,7 +25319,7 @@
         </w:tc>
         <w:tc>
           <w:tcPr>
-            <w:tcW w:w="2307" w:type="dxa"/>
+            <w:tcW w:w="2240" w:type="dxa"/>
             <w:tcBorders/>
             <w:vAlign w:val="center"/>
           </w:tcPr>
@@ -25350,7 +25350,7 @@
         </w:tc>
         <w:tc>
           <w:tcPr>
-            <w:tcW w:w="1346" w:type="dxa"/>
+            <w:tcW w:w="1349" w:type="dxa"/>
             <w:tcBorders/>
             <w:vAlign w:val="center"/>
           </w:tcPr>
@@ -25371,7 +25371,7 @@
         </w:tc>
         <w:tc>
           <w:tcPr>
-            <w:tcW w:w="3087" w:type="dxa"/>
+            <w:tcW w:w="3141" w:type="dxa"/>
             <w:tcBorders/>
             <w:vAlign w:val="center"/>
           </w:tcPr>
@@ -25395,7 +25395,7 @@
         <w:trPr/>
         <w:tc>
           <w:tcPr>
-            <w:tcW w:w="3595" w:type="dxa"/>
+            <w:tcW w:w="3601" w:type="dxa"/>
             <w:tcBorders/>
             <w:vAlign w:val="center"/>
           </w:tcPr>
@@ -25418,7 +25418,7 @@
         </w:tc>
         <w:tc>
           <w:tcPr>
-            <w:tcW w:w="1280" w:type="dxa"/>
+            <w:tcW w:w="1284" w:type="dxa"/>
             <w:tcBorders/>
             <w:vAlign w:val="center"/>
           </w:tcPr>
@@ -25462,7 +25462,7 @@
         </w:tc>
         <w:tc>
           <w:tcPr>
-            <w:tcW w:w="2307" w:type="dxa"/>
+            <w:tcW w:w="2240" w:type="dxa"/>
             <w:tcBorders/>
             <w:vAlign w:val="center"/>
           </w:tcPr>
@@ -25505,7 +25505,7 @@
         </w:tc>
         <w:tc>
           <w:tcPr>
-            <w:tcW w:w="1346" w:type="dxa"/>
+            <w:tcW w:w="1349" w:type="dxa"/>
             <w:tcBorders/>
             <w:vAlign w:val="center"/>
           </w:tcPr>
@@ -25526,7 +25526,7 @@
         </w:tc>
         <w:tc>
           <w:tcPr>
-            <w:tcW w:w="3087" w:type="dxa"/>
+            <w:tcW w:w="3141" w:type="dxa"/>
             <w:tcBorders/>
             <w:vAlign w:val="center"/>
           </w:tcPr>
@@ -25560,7 +25560,7 @@
         <w:trPr/>
         <w:tc>
           <w:tcPr>
-            <w:tcW w:w="3595" w:type="dxa"/>
+            <w:tcW w:w="3601" w:type="dxa"/>
             <w:tcBorders/>
             <w:vAlign w:val="center"/>
           </w:tcPr>
@@ -25583,7 +25583,7 @@
         </w:tc>
         <w:tc>
           <w:tcPr>
-            <w:tcW w:w="1280" w:type="dxa"/>
+            <w:tcW w:w="1284" w:type="dxa"/>
             <w:tcBorders/>
             <w:vAlign w:val="center"/>
           </w:tcPr>
@@ -25627,7 +25627,7 @@
         </w:tc>
         <w:tc>
           <w:tcPr>
-            <w:tcW w:w="2307" w:type="dxa"/>
+            <w:tcW w:w="2240" w:type="dxa"/>
             <w:tcBorders/>
             <w:vAlign w:val="center"/>
           </w:tcPr>
@@ -25670,7 +25670,7 @@
         </w:tc>
         <w:tc>
           <w:tcPr>
-            <w:tcW w:w="1346" w:type="dxa"/>
+            <w:tcW w:w="1349" w:type="dxa"/>
             <w:tcBorders/>
             <w:vAlign w:val="center"/>
           </w:tcPr>
@@ -25691,7 +25691,7 @@
         </w:tc>
         <w:tc>
           <w:tcPr>
-            <w:tcW w:w="3087" w:type="dxa"/>
+            <w:tcW w:w="3141" w:type="dxa"/>
             <w:tcBorders/>
             <w:vAlign w:val="center"/>
           </w:tcPr>
@@ -25725,7 +25725,7 @@
         <w:trPr/>
         <w:tc>
           <w:tcPr>
-            <w:tcW w:w="3595" w:type="dxa"/>
+            <w:tcW w:w="3601" w:type="dxa"/>
             <w:tcBorders/>
             <w:vAlign w:val="center"/>
           </w:tcPr>
@@ -25748,7 +25748,7 @@
         </w:tc>
         <w:tc>
           <w:tcPr>
-            <w:tcW w:w="1280" w:type="dxa"/>
+            <w:tcW w:w="1284" w:type="dxa"/>
             <w:tcBorders/>
             <w:vAlign w:val="center"/>
           </w:tcPr>
@@ -25792,7 +25792,7 @@
         </w:tc>
         <w:tc>
           <w:tcPr>
-            <w:tcW w:w="2307" w:type="dxa"/>
+            <w:tcW w:w="2240" w:type="dxa"/>
             <w:tcBorders/>
             <w:vAlign w:val="center"/>
           </w:tcPr>
@@ -25835,7 +25835,7 @@
         </w:tc>
         <w:tc>
           <w:tcPr>
-            <w:tcW w:w="1346" w:type="dxa"/>
+            <w:tcW w:w="1349" w:type="dxa"/>
             <w:tcBorders/>
             <w:vAlign w:val="center"/>
           </w:tcPr>
@@ -25856,7 +25856,7 @@
         </w:tc>
         <w:tc>
           <w:tcPr>
-            <w:tcW w:w="3087" w:type="dxa"/>
+            <w:tcW w:w="3141" w:type="dxa"/>
             <w:tcBorders/>
             <w:vAlign w:val="center"/>
           </w:tcPr>
@@ -25890,7 +25890,7 @@
         <w:trPr/>
         <w:tc>
           <w:tcPr>
-            <w:tcW w:w="3595" w:type="dxa"/>
+            <w:tcW w:w="3601" w:type="dxa"/>
             <w:tcBorders/>
             <w:vAlign w:val="center"/>
           </w:tcPr>
@@ -25913,7 +25913,7 @@
         </w:tc>
         <w:tc>
           <w:tcPr>
-            <w:tcW w:w="1280" w:type="dxa"/>
+            <w:tcW w:w="1284" w:type="dxa"/>
             <w:tcBorders/>
             <w:vAlign w:val="center"/>
           </w:tcPr>
@@ -25957,7 +25957,7 @@
         </w:tc>
         <w:tc>
           <w:tcPr>
-            <w:tcW w:w="2307" w:type="dxa"/>
+            <w:tcW w:w="2240" w:type="dxa"/>
             <w:tcBorders/>
             <w:vAlign w:val="center"/>
           </w:tcPr>
@@ -25988,7 +25988,7 @@
         </w:tc>
         <w:tc>
           <w:tcPr>
-            <w:tcW w:w="1346" w:type="dxa"/>
+            <w:tcW w:w="1349" w:type="dxa"/>
             <w:tcBorders/>
             <w:vAlign w:val="center"/>
           </w:tcPr>
@@ -26009,22 +26009,22 @@
         </w:tc>
         <w:tc>
           <w:tcPr>
-            <w:tcW w:w="3087" w:type="dxa"/>
-            <w:tcBorders/>
-            <w:vAlign w:val="center"/>
-          </w:tcPr>
-          <w:p>
-            <w:pPr>
-              <w:pStyle w:val="TableContents"/>
-              <w:shd w:fill="2E3440" w:val="clear"/>
-              <w:bidi w:val="0"/>
-              <w:spacing w:before="120" w:after="120"/>
-              <w:jc w:val="left"/>
-              <w:rPr/>
-            </w:pPr>
-            <w:r>
-              <w:rPr/>
-              <w:t>Successor plans autopilot may start by rejecting an out-of-rounds BLOCK review itself; 0 is off, and anything but a non-negative integer reads as 0, with a warning.</w:t>
+            <w:tcW w:w="3141" w:type="dxa"/>
+            <w:tcBorders/>
+            <w:vAlign w:val="center"/>
+          </w:tcPr>
+          <w:p>
+            <w:pPr>
+              <w:pStyle w:val="TableContents"/>
+              <w:shd w:fill="2E3440" w:val="clear"/>
+              <w:bidi w:val="0"/>
+              <w:spacing w:before="120" w:after="120"/>
+              <w:jc w:val="left"/>
+              <w:rPr/>
+            </w:pPr>
+            <w:r>
+              <w:rPr/>
+              <w:t>Successor plans autopilot may start by rejecting an out-of-rounds BLOCK review itself; 0 is off, and anything but a non-negative integer reads as 0, and above 5 as 5, with a warning.</w:t>
             </w:r>
           </w:p>
         </w:tc>

</xml_diff>

<commit_message>
T-0053: a night value that is not a policy reads as human (landing decision)
`crew_sleep._override` returned None for a non-null value outside the
policies ("Human", "always", true), so the looser day value stayed in
force. It now returns STRICTEST with a warning, so asleep it applies and
under unknown it is the stricter value, consistent with review round 2's
N7. Must-block tests asleep and unknown (red before), a must-allow while
awake; two old-behaviour assertions updated. CONFIG.md, README, crew_keys
summaries (configuration reference regenerated, guide rebuilt), code map.

Claude-Session: https://claude.ai/code/session_016wQA2o38aSB65bpjaGpMVJ
</commit_message>
<xml_diff>
--- a/docs/guides/crew/crew-1.0-configuration-reference.docx
+++ b/docs/guides/crew/crew-1.0-configuration-reference.docx
@@ -26568,7 +26568,7 @@
             </w:r>
             <w:r>
               <w:rPr/>
-              <w:t xml:space="preserve"> inside the sleep window; null keeps the day value, and so does anything else, with a warning.</w:t>
+              <w:t xml:space="preserve"> inside the sleep window; null keeps the day value; anything else counts as human, the strictest, with a warning.</w:t>
             </w:r>
           </w:p>
         </w:tc>
@@ -26753,7 +26753,7 @@
             </w:r>
             <w:r>
               <w:rPr/>
-              <w:t xml:space="preserve"> inside the sleep window; null keeps the day value, and so does anything else, with a warning.</w:t>
+              <w:t xml:space="preserve"> inside the sleep window; null keeps the day value; anything else counts as human, the strictest, with a warning.</w:t>
             </w:r>
           </w:p>
         </w:tc>

</xml_diff>

<commit_message>
crew 1.0.332: T-0053 version, one past T-0084's 1.0.331 (batch: origin/main 86d96fa1 is 1.0.328); crew_keys since x3 and the generated reference
Claude-Session: https://claude.ai/code/session_016wQA2o38aSB65bpjaGpMVJ
</commit_message>
<xml_diff>
--- a/docs/guides/crew/crew-1.0-configuration-reference.docx
+++ b/docs/guides/crew/crew-1.0-configuration-reference.docx
@@ -26352,7 +26352,7 @@
             </w:pPr>
             <w:r>
               <w:rPr/>
-              <w:t>1.0.394</w:t>
+              <w:t>1.0.332</w:t>
             </w:r>
           </w:p>
         </w:tc>
@@ -26541,7 +26541,7 @@
             </w:pPr>
             <w:r>
               <w:rPr/>
-              <w:t>1.0.394</w:t>
+              <w:t>1.0.332</w:t>
             </w:r>
           </w:p>
         </w:tc>
@@ -26726,7 +26726,7 @@
             </w:pPr>
             <w:r>
               <w:rPr/>
-              <w:t>1.0.394</w:t>
+              <w:t>1.0.332</w:t>
             </w:r>
           </w:p>
         </w:tc>

</xml_diff>

<commit_message>
Revert "crew 1.0.332: T-0053 version, one past T-0084's 1.0.331 (batch: origin/main 86d96fa1 is 1.0.328); crew_keys since x3 and the generated reference"
This reverts commit 791af057961696651b2b8f8cbb3a1df35f359d6b.
</commit_message>
<xml_diff>
--- a/docs/guides/crew/crew-1.0-configuration-reference.docx
+++ b/docs/guides/crew/crew-1.0-configuration-reference.docx
@@ -26352,7 +26352,7 @@
             </w:pPr>
             <w:r>
               <w:rPr/>
-              <w:t>1.0.332</w:t>
+              <w:t>1.0.394</w:t>
             </w:r>
           </w:p>
         </w:tc>
@@ -26541,7 +26541,7 @@
             </w:pPr>
             <w:r>
               <w:rPr/>
-              <w:t>1.0.332</w:t>
+              <w:t>1.0.394</w:t>
             </w:r>
           </w:p>
         </w:tc>
@@ -26726,7 +26726,7 @@
             </w:pPr>
             <w:r>
               <w:rPr/>
-              <w:t>1.0.332</w:t>
+              <w:t>1.0.394</w:t>
             </w:r>
           </w:p>
         </w:tc>

</xml_diff>

<commit_message>
crew 1.0.332: T-0053 version, set last again after merging T-0084's Windows test fix (batch: one past T-0084's 1.0.331); crew_keys since x3 and the generated reference
Claude-Session: https://claude.ai/code/session_016wQA2o38aSB65bpjaGpMVJ
</commit_message>
<xml_diff>
--- a/docs/guides/crew/crew-1.0-configuration-reference.docx
+++ b/docs/guides/crew/crew-1.0-configuration-reference.docx
@@ -26352,7 +26352,7 @@
             </w:pPr>
             <w:r>
               <w:rPr/>
-              <w:t>1.0.394</w:t>
+              <w:t>1.0.332</w:t>
             </w:r>
           </w:p>
         </w:tc>
@@ -26541,7 +26541,7 @@
             </w:pPr>
             <w:r>
               <w:rPr/>
-              <w:t>1.0.394</w:t>
+              <w:t>1.0.332</w:t>
             </w:r>
           </w:p>
         </w:tc>
@@ -26726,7 +26726,7 @@
             </w:pPr>
             <w:r>
               <w:rPr/>
-              <w:t>1.0.394</w:t>
+              <w:t>1.0.332</w:t>
             </w:r>
           </w:p>
         </w:tc>

</xml_diff>

<commit_message>
Revert "crew 1.0.332: T-0053 version, set last again after merging T-0084's Windows test fix (batch: one past T-0084's 1.0.331); crew_keys since x3 and the generated reference"
This reverts commit cedcf07055b2578ee034f66945f0a52d2f973ca0.
</commit_message>
<xml_diff>
--- a/docs/guides/crew/crew-1.0-configuration-reference.docx
+++ b/docs/guides/crew/crew-1.0-configuration-reference.docx
@@ -26352,7 +26352,7 @@
             </w:pPr>
             <w:r>
               <w:rPr/>
-              <w:t>1.0.332</w:t>
+              <w:t>1.0.394</w:t>
             </w:r>
           </w:p>
         </w:tc>
@@ -26541,7 +26541,7 @@
             </w:pPr>
             <w:r>
               <w:rPr/>
-              <w:t>1.0.332</w:t>
+              <w:t>1.0.394</w:t>
             </w:r>
           </w:p>
         </w:tc>
@@ -26726,7 +26726,7 @@
             </w:pPr>
             <w:r>
               <w:rPr/>
-              <w:t>1.0.332</w:t>
+              <w:t>1.0.394</w:t>
             </w:r>
           </w:p>
         </w:tc>

</xml_diff>

<commit_message>
crew 1.0.332: T-0053 version, set last again after the merge-review NIT (batch: one past T-0084's 1.0.331); crew_keys since x3 and the generated reference
Claude-Session: https://claude.ai/code/session_016wQA2o38aSB65bpjaGpMVJ
</commit_message>
<xml_diff>
--- a/docs/guides/crew/crew-1.0-configuration-reference.docx
+++ b/docs/guides/crew/crew-1.0-configuration-reference.docx
@@ -26352,7 +26352,7 @@
             </w:pPr>
             <w:r>
               <w:rPr/>
-              <w:t>1.0.394</w:t>
+              <w:t>1.0.332</w:t>
             </w:r>
           </w:p>
         </w:tc>
@@ -26541,7 +26541,7 @@
             </w:pPr>
             <w:r>
               <w:rPr/>
-              <w:t>1.0.394</w:t>
+              <w:t>1.0.332</w:t>
             </w:r>
           </w:p>
         </w:tc>
@@ -26726,7 +26726,7 @@
             </w:pPr>
             <w:r>
               <w:rPr/>
-              <w:t>1.0.394</w:t>
+              <w:t>1.0.332</w:t>
             </w:r>
           </w:p>
         </w:tc>

</xml_diff>

<commit_message>
batch 6: regenerate rules, diagrams README, the two changed guides; re-measure BUDGETS
Claude-Session: https://claude.ai/code/session_016wQA2o38aSB65bpjaGpMVJ
</commit_message>
<xml_diff>
--- a/docs/guides/crew/crew-1.0-configuration-reference.docx
+++ b/docs/guides/crew/crew-1.0-configuration-reference.docx
@@ -92,7 +92,7 @@
       </w:r>
       <w:r>
         <w:rPr/>
-        <w:t xml:space="preserve"> file. Your personal defaults for every repo on this machine: providers and models, notifications, auto-clear, the guards. </w:t>
+        <w:t xml:space="preserve"> file. Your personal defaults for every repo on this machine: providers and models, notifications, auto-clear, the guards, how far autopilot may go. </w:t>
       </w:r>
     </w:p>
     <w:p>
@@ -129,7 +129,7 @@
       </w:r>
       <w:r>
         <w:rPr/>
-        <w:t xml:space="preserve"> file. Facts about one checkout: the tracker, the board, scope enforcement, autopilot, production declarations. </w:t>
+        <w:t xml:space="preserve"> file. Facts about one checkout: the tracker, the board, scope enforcement, production declarations. </w:t>
       </w:r>
     </w:p>
     <w:p>
@@ -141,7 +141,7 @@
       </w:pPr>
       <w:r>
         <w:rPr/>
-        <w:t>The repo file wins over the machine file, which wins over crew's defaults. Three exceptions, each named in the Layer column below:</w:t>
+        <w:t>The repo file wins over the machine file, which wins over crew's defaults. Four exceptions, each named in the Layer column below:</w:t>
       </w:r>
     </w:p>
     <w:p>
@@ -260,6 +260,7 @@
           <w:tab w:val="left" w:pos="829" w:leader="none"/>
         </w:tabs>
         <w:bidi w:val="0"/>
+        <w:spacing w:before="120" w:after="0"/>
         <w:ind w:hanging="283" w:left="829"/>
         <w:jc w:val="left"/>
         <w:rPr/>
@@ -302,6 +303,47 @@
     <w:p>
       <w:pPr>
         <w:pStyle w:val="BodyText"/>
+        <w:numPr>
+          <w:ilvl w:val="0"/>
+          <w:numId w:val="2"/>
+        </w:numPr>
+        <w:tabs>
+          <w:tab w:val="clear" w:pos="1134"/>
+          <w:tab w:val="left" w:pos="829" w:leader="none"/>
+        </w:tabs>
+        <w:bidi w:val="0"/>
+        <w:ind w:hanging="283" w:left="829"/>
+        <w:jc w:val="left"/>
+        <w:rPr/>
+      </w:pPr>
+      <w:r>
+        <w:rPr/>
+        <w:t xml:space="preserve">A </w:t>
+      </w:r>
+      <w:r>
+        <w:rPr>
+          <w:rStyle w:val="Strong"/>
+        </w:rPr>
+        <w:t>personal</w:t>
+      </w:r>
+      <w:r>
+        <w:rPr/>
+        <w:t xml:space="preserve"> key (the five </w:t>
+      </w:r>
+      <w:r>
+        <w:rPr>
+          <w:rStyle w:val="SourceText"/>
+        </w:rPr>
+        <w:t>autopilot.*</w:t>
+      </w:r>
+      <w:r>
+        <w:rPr/>
+        <w:t xml:space="preserve"> keys) resolves per key to the stricter of the layers that set it; a layer that says nothing imposes nothing. A machine value is your default for every repo, which a repo may narrow and never widen. </w:t>
+      </w:r>
+    </w:p>
+    <w:p>
+      <w:pPr>
+        <w:pStyle w:val="BodyText"/>
         <w:bidi w:val="0"/>
         <w:jc w:val="left"/>
         <w:rPr/>
@@ -328,7 +370,57 @@
       </w:r>
       <w:r>
         <w:rPr/>
-        <w:t xml:space="preserve"> template writes every key, which would otherwise shadow your machine defaults.</w:t>
+        <w:t xml:space="preserve"> template writes every key except the personal ones, so it does not shadow your machine defaults for those; a repo </w:t>
+      </w:r>
+      <w:r>
+        <w:rPr>
+          <w:rStyle w:val="SourceText"/>
+        </w:rPr>
+        <w:t>/crew:init</w:t>
+      </w:r>
+      <w:r>
+        <w:rPr/>
+        <w:t xml:space="preserve"> set up before that still spells </w:t>
+      </w:r>
+      <w:r>
+        <w:rPr>
+          <w:rStyle w:val="SourceText"/>
+        </w:rPr>
+        <w:t>autopilot.mode: "off"</w:t>
+      </w:r>
+      <w:r>
+        <w:rPr/>
+        <w:t xml:space="preserve">, which holds a machine </w:t>
+      </w:r>
+      <w:r>
+        <w:rPr>
+          <w:rStyle w:val="SourceText"/>
+        </w:rPr>
+        <w:t>plan</w:t>
+      </w:r>
+      <w:r>
+        <w:rPr/>
+        <w:t xml:space="preserve"> down until you remove it (</w:t>
+      </w:r>
+      <w:r>
+        <w:rPr>
+          <w:rStyle w:val="SourceText"/>
+        </w:rPr>
+        <w:t>--explain --all</w:t>
+      </w:r>
+      <w:r>
+        <w:rPr/>
+        <w:t xml:space="preserve"> names it as a </w:t>
+      </w:r>
+      <w:r>
+        <w:rPr>
+          <w:rStyle w:val="SourceText"/>
+        </w:rPr>
+        <w:t>shadow:</w:t>
+      </w:r>
+      <w:r>
+        <w:rPr/>
+        <w:t>).</w:t>
       </w:r>
     </w:p>
     <w:p>
@@ -440,7 +532,17 @@
       </w:r>
       <w:r>
         <w:rPr/>
-        <w:t xml:space="preserve"> is the same table, and </w:t>
+        <w:t xml:space="preserve"> is the same table, </w:t>
+      </w:r>
+      <w:r>
+        <w:rPr>
+          <w:rStyle w:val="SourceText"/>
+        </w:rPr>
+        <w:t>--explain --all</w:t>
+      </w:r>
+      <w:r>
+        <w:rPr/>
+        <w:t xml:space="preserve"> adds every repo-only key and names each shadowing repo value, and </w:t>
       </w:r>
       <w:r>
         <w:rPr>
@@ -461,8 +563,125 @@
         <w:jc w:val="left"/>
         <w:rPr/>
       </w:pPr>
-      <w:bookmarkStart w:id="3" w:name="common-setups"/>
+      <w:bookmarkStart w:id="3" w:name="backups-and-rebuilding-a-lost-config"/>
       <w:bookmarkEnd w:id="3"/>
+      <w:r>
+        <w:rPr/>
+        <w:t>Backups and Rebuilding a Lost Config</w:t>
+      </w:r>
+    </w:p>
+    <w:p>
+      <w:pPr>
+        <w:pStyle w:val="BodyText"/>
+        <w:bidi w:val="0"/>
+        <w:jc w:val="left"/>
+        <w:rPr/>
+      </w:pPr>
+      <w:r>
+        <w:rPr/>
+        <w:t xml:space="preserve">Every write a crew script makes to either file first copies the old bytes to </w:t>
+      </w:r>
+      <w:r>
+        <w:rPr>
+          <w:rStyle w:val="SourceText"/>
+        </w:rPr>
+        <w:t>~/.claude/crew/backups/</w:t>
+      </w:r>
+      <w:r>
+        <w:rPr/>
+        <w:t xml:space="preserve"> (the newest 20 per file kept) and is refused when that copy fails; a hand edit is not backed up. </w:t>
+      </w:r>
+      <w:r>
+        <w:rPr>
+          <w:rStyle w:val="SourceText"/>
+        </w:rPr>
+        <w:t>crew_config.py --backups</w:t>
+      </w:r>
+      <w:r>
+        <w:rPr/>
+        <w:t xml:space="preserve"> lists the machine file's (add </w:t>
+      </w:r>
+      <w:r>
+        <w:rPr>
+          <w:rStyle w:val="SourceText"/>
+        </w:rPr>
+        <w:t>--repo</w:t>
+      </w:r>
+      <w:r>
+        <w:rPr/>
+        <w:t xml:space="preserve"> for the repo file's) and </w:t>
+      </w:r>
+      <w:r>
+        <w:rPr>
+          <w:rStyle w:val="SourceText"/>
+        </w:rPr>
+        <w:t>--restore &lt;stamp&gt; --apply</w:t>
+      </w:r>
+      <w:r>
+        <w:rPr/>
+        <w:t xml:space="preserve"> puts one back. Your non-default values are kept in </w:t>
+      </w:r>
+      <w:r>
+        <w:rPr>
+          <w:rStyle w:val="SourceText"/>
+        </w:rPr>
+        <w:t>~/.claude/crew/profile.json</w:t>
+      </w:r>
+      <w:r>
+        <w:rPr/>
+        <w:t xml:space="preserve"> (and in your vault when </w:t>
+      </w:r>
+      <w:r>
+        <w:rPr>
+          <w:rStyle w:val="SourceText"/>
+        </w:rPr>
+        <w:t>memory.vaultPath</w:t>
+      </w:r>
+      <w:r>
+        <w:rPr/>
+        <w:t xml:space="preserve"> is set), so </w:t>
+      </w:r>
+      <w:r>
+        <w:rPr>
+          <w:rStyle w:val="SourceText"/>
+        </w:rPr>
+        <w:t>--rebuild --repo</w:t>
+      </w:r>
+      <w:r>
+        <w:rPr/>
+        <w:t xml:space="preserve"> or </w:t>
+      </w:r>
+      <w:r>
+        <w:rPr>
+          <w:rStyle w:val="SourceText"/>
+        </w:rPr>
+        <w:t>--rebuild --global</w:t>
+      </w:r>
+      <w:r>
+        <w:rPr/>
+        <w:t xml:space="preserve"> regenerates a lost or corrupt file from the template plus that profile, as a dry run until </w:t>
+      </w:r>
+      <w:r>
+        <w:rPr>
+          <w:rStyle w:val="SourceText"/>
+        </w:rPr>
+        <w:t>--apply</w:t>
+      </w:r>
+      <w:r>
+        <w:rPr/>
+        <w:t>.</w:t>
+      </w:r>
+    </w:p>
+    <w:p>
+      <w:pPr>
+        <w:pStyle w:val="Heading2"/>
+        <w:bidi w:val="0"/>
+        <w:ind w:hanging="0" w:left="0" w:right="0"/>
+        <w:jc w:val="left"/>
+        <w:rPr/>
+      </w:pPr>
+      <w:bookmarkStart w:id="4" w:name="common-setups"/>
+      <w:bookmarkEnd w:id="4"/>
       <w:r>
         <w:rPr/>
         <w:t>Common Setups</w:t>
@@ -503,7 +722,17 @@
       </w:r>
       <w:r>
         <w:rPr/>
-        <w:t xml:space="preserve"> and the guards in </w:t>
+        <w:t xml:space="preserve">, the guards and the </w:t>
+      </w:r>
+      <w:r>
+        <w:rPr>
+          <w:rStyle w:val="SourceText"/>
+        </w:rPr>
+        <w:t>autopilot.*</w:t>
+      </w:r>
+      <w:r>
+        <w:rPr/>
+        <w:t xml:space="preserve"> keys in </w:t>
       </w:r>
       <w:r>
         <w:rPr>
@@ -541,17 +770,7 @@
       </w:r>
       <w:r>
         <w:rPr/>
-        <w:t xml:space="preserve"> In the repo file, set </w:t>
-      </w:r>
-      <w:r>
-        <w:rPr>
-          <w:rStyle w:val="SourceText"/>
-        </w:rPr>
-        <w:t>scope.allowCliApproval: true</w:t>
-      </w:r>
-      <w:r>
-        <w:rPr/>
-        <w:t xml:space="preserve"> and </w:t>
+        <w:t xml:space="preserve"> Set </w:t>
       </w:r>
       <w:r>
         <w:rPr>
@@ -561,7 +780,7 @@
       </w:r>
       <w:r>
         <w:rPr/>
-        <w:t xml:space="preserve">, then choose </w:t>
+        <w:t xml:space="preserve"> and choose </w:t>
       </w:r>
       <w:r>
         <w:rPr>
@@ -601,7 +820,17 @@
       </w:r>
       <w:r>
         <w:rPr/>
-        <w:t xml:space="preserve">). Review acceptance and production deploys still stop for you. </w:t>
+        <w:t xml:space="preserve">) in either file, and set </w:t>
+      </w:r>
+      <w:r>
+        <w:rPr>
+          <w:rStyle w:val="SourceText"/>
+        </w:rPr>
+        <w:t>scope.allowCliApproval: true</w:t>
+      </w:r>
+      <w:r>
+        <w:rPr/>
+        <w:t xml:space="preserve"> in the repo file, which is the only file that key is read from. Review acceptance and production deploys still stop for you. </w:t>
       </w:r>
     </w:p>
     <w:p>
@@ -691,8 +920,8 @@
         <w:jc w:val="left"/>
         <w:rPr/>
       </w:pPr>
-      <w:bookmarkStart w:id="4" w:name="reference-generated"/>
-      <w:bookmarkEnd w:id="4"/>
+      <w:bookmarkStart w:id="5" w:name="reference-generated"/>
+      <w:bookmarkEnd w:id="5"/>
       <w:r>
         <w:rPr/>
         <w:t>Reference (Generated)</w:t>
@@ -745,7 +974,7 @@
       </w:r>
       <w:r>
         <w:rPr/>
-        <w:t>: 76 settable in the machine-global file, 62 repo-only.</w:t>
+        <w:t>: 81 settable in the machine-global file, 57 repo-only.</w:t>
       </w:r>
     </w:p>
     <w:p>
@@ -889,8 +1118,8 @@
         <w:jc w:val="left"/>
         <w:rPr/>
       </w:pPr>
-      <w:bookmarkStart w:id="5" w:name="layers"/>
-      <w:bookmarkEnd w:id="5"/>
+      <w:bookmarkStart w:id="6" w:name="layers"/>
+      <w:bookmarkEnd w:id="6"/>
       <w:r>
         <w:rPr/>
         <w:t>Layers</w:t>
@@ -1059,6 +1288,54 @@
         <w:rPr>
           <w:rStyle w:val="Strong"/>
         </w:rPr>
+        <w:t>both, stricter wins</w:t>
+      </w:r>
+      <w:r>
+        <w:rPr/>
+        <w:t>: a personal key (</w:t>
+      </w:r>
+      <w:r>
+        <w:rPr>
+          <w:rStyle w:val="SourceText"/>
+        </w:rPr>
+        <w:t>crew_guards.PERSONAL_KEYS</w:t>
+      </w:r>
+      <w:r>
+        <w:rPr/>
+        <w:t xml:space="preserve">): either file may set it, and where both do the STRICTER value wins; a layer that is silent (absent or </w:t>
+      </w:r>
+      <w:r>
+        <w:rPr>
+          <w:rStyle w:val="SourceText"/>
+        </w:rPr>
+        <w:t>null</w:t>
+      </w:r>
+      <w:r>
+        <w:rPr/>
+        <w:t xml:space="preserve">) imposes nothing, so a machine value is your default for every repo and a repo may only narrow it. </w:t>
+      </w:r>
+    </w:p>
+    <w:p>
+      <w:pPr>
+        <w:pStyle w:val="BodyText"/>
+        <w:numPr>
+          <w:ilvl w:val="0"/>
+          <w:numId w:val="6"/>
+        </w:numPr>
+        <w:tabs>
+          <w:tab w:val="clear" w:pos="1134"/>
+          <w:tab w:val="left" w:pos="829" w:leader="none"/>
+        </w:tabs>
+        <w:bidi w:val="0"/>
+        <w:spacing w:before="120" w:after="0"/>
+        <w:ind w:hanging="283" w:left="829"/>
+        <w:jc w:val="left"/>
+        <w:rPr/>
+      </w:pPr>
+      <w:r>
+        <w:rPr>
+          <w:rStyle w:val="Strong"/>
+        </w:rPr>
         <w:t>machine-arms</w:t>
       </w:r>
       <w:r>
@@ -1131,8 +1408,8 @@
         <w:jc w:val="left"/>
         <w:rPr/>
       </w:pPr>
-      <w:bookmarkStart w:id="6" w:name="top-level-keys"/>
-      <w:bookmarkEnd w:id="6"/>
+      <w:bookmarkStart w:id="7" w:name="top-level-keys"/>
+      <w:bookmarkEnd w:id="7"/>
       <w:r>
         <w:rPr/>
         <w:t>Top-Level Keys</w:t>
@@ -2082,8 +2359,8 @@
         <w:jc w:val="left"/>
         <w:rPr/>
       </w:pPr>
-      <w:bookmarkStart w:id="7" w:name="qa"/>
-      <w:bookmarkEnd w:id="7"/>
+      <w:bookmarkStart w:id="8" w:name="qa"/>
+      <w:bookmarkEnd w:id="8"/>
       <w:r>
         <w:rPr>
           <w:rStyle w:val="SourceText"/>
@@ -3596,8 +3873,8 @@
         <w:jc w:val="left"/>
         <w:rPr/>
       </w:pPr>
-      <w:bookmarkStart w:id="8" w:name="dev"/>
-      <w:bookmarkEnd w:id="8"/>
+      <w:bookmarkStart w:id="9" w:name="dev"/>
+      <w:bookmarkEnd w:id="9"/>
       <w:r>
         <w:rPr>
           <w:rStyle w:val="SourceText"/>
@@ -4881,8 +5158,8 @@
         <w:jc w:val="left"/>
         <w:rPr/>
       </w:pPr>
-      <w:bookmarkStart w:id="9" w:name="worktree"/>
-      <w:bookmarkEnd w:id="9"/>
+      <w:bookmarkStart w:id="10" w:name="worktree"/>
+      <w:bookmarkEnd w:id="10"/>
       <w:r>
         <w:rPr>
           <w:rStyle w:val="SourceText"/>
@@ -5200,8 +5477,8 @@
         <w:jc w:val="left"/>
         <w:rPr/>
       </w:pPr>
-      <w:bookmarkStart w:id="10" w:name="secondopinion"/>
-      <w:bookmarkEnd w:id="10"/>
+      <w:bookmarkStart w:id="11" w:name="secondopinion"/>
+      <w:bookmarkEnd w:id="11"/>
       <w:r>
         <w:rPr>
           <w:rStyle w:val="SourceText"/>
@@ -6101,8 +6378,8 @@
         <w:jc w:val="left"/>
         <w:rPr/>
       </w:pPr>
-      <w:bookmarkStart w:id="11" w:name="jira"/>
-      <w:bookmarkEnd w:id="11"/>
+      <w:bookmarkStart w:id="12" w:name="jira"/>
+      <w:bookmarkEnd w:id="12"/>
       <w:r>
         <w:rPr>
           <w:rStyle w:val="SourceText"/>
@@ -6573,8 +6850,8 @@
         <w:jc w:val="left"/>
         <w:rPr/>
       </w:pPr>
-      <w:bookmarkStart w:id="12" w:name="sdp"/>
-      <w:bookmarkEnd w:id="12"/>
+      <w:bookmarkStart w:id="13" w:name="sdp"/>
+      <w:bookmarkEnd w:id="13"/>
       <w:r>
         <w:rPr>
           <w:rStyle w:val="SourceText"/>
@@ -7178,8 +7455,8 @@
         <w:jc w:val="left"/>
         <w:rPr/>
       </w:pPr>
-      <w:bookmarkStart w:id="13" w:name="obsidian"/>
-      <w:bookmarkEnd w:id="13"/>
+      <w:bookmarkStart w:id="14" w:name="obsidian"/>
+      <w:bookmarkEnd w:id="14"/>
       <w:r>
         <w:rPr>
           <w:rStyle w:val="SourceText"/>
@@ -8588,8 +8865,8 @@
         <w:jc w:val="left"/>
         <w:rPr/>
       </w:pPr>
-      <w:bookmarkStart w:id="14" w:name="memory"/>
-      <w:bookmarkEnd w:id="14"/>
+      <w:bookmarkStart w:id="15" w:name="memory"/>
+      <w:bookmarkEnd w:id="15"/>
       <w:r>
         <w:rPr>
           <w:rStyle w:val="SourceText"/>
@@ -9499,8 +9776,8 @@
         <w:jc w:val="left"/>
         <w:rPr/>
       </w:pPr>
-      <w:bookmarkStart w:id="15" w:name="context"/>
-      <w:bookmarkEnd w:id="15"/>
+      <w:bookmarkStart w:id="16" w:name="context"/>
+      <w:bookmarkEnd w:id="16"/>
       <w:r>
         <w:rPr>
           <w:rStyle w:val="SourceText"/>
@@ -12783,8 +13060,8 @@
         <w:jc w:val="left"/>
         <w:rPr/>
       </w:pPr>
-      <w:bookmarkStart w:id="16" w:name="resume"/>
-      <w:bookmarkEnd w:id="16"/>
+      <w:bookmarkStart w:id="17" w:name="resume"/>
+      <w:bookmarkEnd w:id="17"/>
       <w:r>
         <w:rPr>
           <w:rStyle w:val="SourceText"/>
@@ -13454,8 +13731,8 @@
         <w:jc w:val="left"/>
         <w:rPr/>
       </w:pPr>
-      <w:bookmarkStart w:id="17" w:name="emergency"/>
-      <w:bookmarkEnd w:id="17"/>
+      <w:bookmarkStart w:id="18" w:name="emergency"/>
+      <w:bookmarkEnd w:id="18"/>
       <w:r>
         <w:rPr>
           <w:rStyle w:val="SourceText"/>
@@ -14079,8 +14356,8 @@
         <w:jc w:val="left"/>
         <w:rPr/>
       </w:pPr>
-      <w:bookmarkStart w:id="18" w:name="notify"/>
-      <w:bookmarkEnd w:id="18"/>
+      <w:bookmarkStart w:id="19" w:name="notify"/>
+      <w:bookmarkEnd w:id="19"/>
       <w:r>
         <w:rPr>
           <w:rStyle w:val="SourceText"/>
@@ -14980,8 +15257,8 @@
         <w:jc w:val="left"/>
         <w:rPr/>
       </w:pPr>
-      <w:bookmarkStart w:id="19" w:name="platform"/>
-      <w:bookmarkEnd w:id="19"/>
+      <w:bookmarkStart w:id="20" w:name="platform"/>
+      <w:bookmarkEnd w:id="20"/>
       <w:r>
         <w:rPr>
           <w:rStyle w:val="SourceText"/>
@@ -15728,8 +16005,8 @@
         <w:jc w:val="left"/>
         <w:rPr/>
       </w:pPr>
-      <w:bookmarkStart w:id="20" w:name="shellroute"/>
-      <w:bookmarkEnd w:id="20"/>
+      <w:bookmarkStart w:id="21" w:name="shellroute"/>
+      <w:bookmarkEnd w:id="21"/>
       <w:r>
         <w:rPr>
           <w:rStyle w:val="SourceText"/>
@@ -16236,8 +16513,8 @@
         <w:jc w:val="left"/>
         <w:rPr/>
       </w:pPr>
-      <w:bookmarkStart w:id="21" w:name="pm"/>
-      <w:bookmarkEnd w:id="21"/>
+      <w:bookmarkStart w:id="22" w:name="pm"/>
+      <w:bookmarkEnd w:id="22"/>
       <w:r>
         <w:rPr>
           <w:rStyle w:val="SourceText"/>
@@ -17437,8 +17714,8 @@
         <w:jc w:val="left"/>
         <w:rPr/>
       </w:pPr>
-      <w:bookmarkStart w:id="22" w:name="graph"/>
-      <w:bookmarkEnd w:id="22"/>
+      <w:bookmarkStart w:id="23" w:name="graph"/>
+      <w:bookmarkEnd w:id="23"/>
       <w:r>
         <w:rPr>
           <w:rStyle w:val="SourceText"/>
@@ -18328,8 +18605,8 @@
         <w:jc w:val="left"/>
         <w:rPr/>
       </w:pPr>
-      <w:bookmarkStart w:id="23" w:name="docs"/>
-      <w:bookmarkEnd w:id="23"/>
+      <w:bookmarkStart w:id="24" w:name="docs"/>
+      <w:bookmarkEnd w:id="24"/>
       <w:r>
         <w:rPr>
           <w:rStyle w:val="SourceText"/>
@@ -18790,8 +19067,8 @@
         <w:jc w:val="left"/>
         <w:rPr/>
       </w:pPr>
-      <w:bookmarkStart w:id="24" w:name="bitbucket"/>
-      <w:bookmarkEnd w:id="24"/>
+      <w:bookmarkStart w:id="25" w:name="bitbucket"/>
+      <w:bookmarkEnd w:id="25"/>
       <w:r>
         <w:rPr>
           <w:rStyle w:val="SourceText"/>
@@ -19405,8 +19682,8 @@
         <w:jc w:val="left"/>
         <w:rPr/>
       </w:pPr>
-      <w:bookmarkStart w:id="25" w:name="github"/>
-      <w:bookmarkEnd w:id="25"/>
+      <w:bookmarkStart w:id="26" w:name="github"/>
+      <w:bookmarkEnd w:id="26"/>
       <w:r>
         <w:rPr>
           <w:rStyle w:val="SourceText"/>
@@ -19877,8 +20154,8 @@
         <w:jc w:val="left"/>
         <w:rPr/>
       </w:pPr>
-      <w:bookmarkStart w:id="26" w:name="install"/>
-      <w:bookmarkEnd w:id="26"/>
+      <w:bookmarkStart w:id="27" w:name="install"/>
+      <w:bookmarkEnd w:id="27"/>
       <w:r>
         <w:rPr>
           <w:rStyle w:val="SourceText"/>
@@ -20212,8 +20489,8 @@
         <w:jc w:val="left"/>
         <w:rPr/>
       </w:pPr>
-      <w:bookmarkStart w:id="27" w:name="guards"/>
-      <w:bookmarkEnd w:id="27"/>
+      <w:bookmarkStart w:id="28" w:name="guards"/>
+      <w:bookmarkEnd w:id="28"/>
       <w:r>
         <w:rPr>
           <w:rStyle w:val="SourceText"/>
@@ -22046,8 +22323,8 @@
         <w:jc w:val="left"/>
         <w:rPr/>
       </w:pPr>
-      <w:bookmarkStart w:id="28" w:name="production"/>
-      <w:bookmarkEnd w:id="28"/>
+      <w:bookmarkStart w:id="29" w:name="production"/>
+      <w:bookmarkEnd w:id="29"/>
       <w:r>
         <w:rPr>
           <w:rStyle w:val="SourceText"/>
@@ -22508,8 +22785,8 @@
         <w:jc w:val="left"/>
         <w:rPr/>
       </w:pPr>
-      <w:bookmarkStart w:id="29" w:name="cloud"/>
-      <w:bookmarkEnd w:id="29"/>
+      <w:bookmarkStart w:id="30" w:name="cloud"/>
+      <w:bookmarkEnd w:id="30"/>
       <w:r>
         <w:rPr>
           <w:rStyle w:val="SourceText"/>
@@ -23113,8 +23390,8 @@
         <w:jc w:val="left"/>
         <w:rPr/>
       </w:pPr>
-      <w:bookmarkStart w:id="30" w:name="environments"/>
-      <w:bookmarkEnd w:id="30"/>
+      <w:bookmarkStart w:id="31" w:name="environments"/>
+      <w:bookmarkEnd w:id="31"/>
       <w:r>
         <w:rPr>
           <w:rStyle w:val="SourceText"/>
@@ -23591,8 +23868,8 @@
         <w:jc w:val="left"/>
         <w:rPr/>
       </w:pPr>
-      <w:bookmarkStart w:id="31" w:name="change"/>
-      <w:bookmarkEnd w:id="31"/>
+      <w:bookmarkStart w:id="32" w:name="change"/>
+      <w:bookmarkEnd w:id="32"/>
       <w:r>
         <w:rPr>
           <w:rStyle w:val="SourceText"/>
@@ -24641,8 +24918,8 @@
         <w:jc w:val="left"/>
         <w:rPr/>
       </w:pPr>
-      <w:bookmarkStart w:id="32" w:name="git"/>
-      <w:bookmarkEnd w:id="32"/>
+      <w:bookmarkStart w:id="33" w:name="git"/>
+      <w:bookmarkEnd w:id="33"/>
       <w:r>
         <w:rPr>
           <w:rStyle w:val="SourceText"/>
@@ -24990,8 +25267,8 @@
         <w:jc w:val="left"/>
         <w:rPr/>
       </w:pPr>
-      <w:bookmarkStart w:id="33" w:name="scope"/>
-      <w:bookmarkEnd w:id="33"/>
+      <w:bookmarkStart w:id="34" w:name="scope"/>
+      <w:bookmarkEnd w:id="34"/>
       <w:r>
         <w:rPr>
           <w:rStyle w:val="SourceText"/>
@@ -25510,8 +25787,8 @@
         <w:jc w:val="left"/>
         <w:rPr/>
       </w:pPr>
-      <w:bookmarkStart w:id="34" w:name="autopilot"/>
-      <w:bookmarkEnd w:id="34"/>
+      <w:bookmarkStart w:id="35" w:name="autopilot"/>
+      <w:bookmarkEnd w:id="35"/>
       <w:r>
         <w:rPr>
           <w:rStyle w:val="SourceText"/>
@@ -25533,12 +25810,12 @@
         </w:tblCellMar>
       </w:tblPr>
       <w:tblGrid>
-        <w:gridCol w:w="3573"/>
-        <w:gridCol w:w="1193"/>
-        <w:gridCol w:w="1156"/>
-        <w:gridCol w:w="2104"/>
-        <w:gridCol w:w="1280"/>
-        <w:gridCol w:w="3465"/>
+        <w:gridCol w:w="3569"/>
+        <w:gridCol w:w="1190"/>
+        <w:gridCol w:w="1157"/>
+        <w:gridCol w:w="2237"/>
+        <w:gridCol w:w="1278"/>
+        <w:gridCol w:w="3340"/>
       </w:tblGrid>
       <w:tr>
         <w:trPr>
@@ -25546,7 +25823,7 @@
         </w:trPr>
         <w:tc>
           <w:tcPr>
-            <w:tcW w:w="3573" w:type="dxa"/>
+            <w:tcW w:w="3569" w:type="dxa"/>
             <w:tcBorders/>
             <w:vAlign w:val="center"/>
           </w:tcPr>
@@ -25568,7 +25845,7 @@
         </w:tc>
         <w:tc>
           <w:tcPr>
-            <w:tcW w:w="1193" w:type="dxa"/>
+            <w:tcW w:w="1190" w:type="dxa"/>
             <w:tcBorders/>
             <w:vAlign w:val="center"/>
           </w:tcPr>
@@ -25590,7 +25867,7 @@
         </w:tc>
         <w:tc>
           <w:tcPr>
-            <w:tcW w:w="1156" w:type="dxa"/>
+            <w:tcW w:w="1157" w:type="dxa"/>
             <w:tcBorders/>
             <w:vAlign w:val="center"/>
           </w:tcPr>
@@ -25612,7 +25889,7 @@
         </w:tc>
         <w:tc>
           <w:tcPr>
-            <w:tcW w:w="2104" w:type="dxa"/>
+            <w:tcW w:w="2237" w:type="dxa"/>
             <w:tcBorders/>
             <w:vAlign w:val="center"/>
           </w:tcPr>
@@ -25634,7 +25911,7 @@
         </w:tc>
         <w:tc>
           <w:tcPr>
-            <w:tcW w:w="1280" w:type="dxa"/>
+            <w:tcW w:w="1278" w:type="dxa"/>
             <w:tcBorders/>
             <w:vAlign w:val="center"/>
           </w:tcPr>
@@ -25656,7 +25933,7 @@
         </w:tc>
         <w:tc>
           <w:tcPr>
-            <w:tcW w:w="3465" w:type="dxa"/>
+            <w:tcW w:w="3340" w:type="dxa"/>
             <w:tcBorders/>
             <w:vAlign w:val="center"/>
           </w:tcPr>
@@ -25681,7 +25958,7 @@
         <w:trPr/>
         <w:tc>
           <w:tcPr>
-            <w:tcW w:w="3573" w:type="dxa"/>
+            <w:tcW w:w="3569" w:type="dxa"/>
             <w:tcBorders/>
             <w:vAlign w:val="center"/>
           </w:tcPr>
@@ -25704,28 +25981,28 @@
         </w:tc>
         <w:tc>
           <w:tcPr>
-            <w:tcW w:w="1193" w:type="dxa"/>
-            <w:tcBorders/>
-            <w:vAlign w:val="center"/>
-          </w:tcPr>
-          <w:p>
-            <w:pPr>
-              <w:pStyle w:val="TableContents"/>
-              <w:shd w:fill="2E3440" w:val="clear"/>
-              <w:bidi w:val="0"/>
-              <w:spacing w:before="120" w:after="120"/>
-              <w:jc w:val="left"/>
-              <w:rPr/>
-            </w:pPr>
-            <w:r>
-              <w:rPr/>
-              <w:t>repo</w:t>
-            </w:r>
-          </w:p>
-        </w:tc>
-        <w:tc>
-          <w:tcPr>
-            <w:tcW w:w="1156" w:type="dxa"/>
+            <w:tcW w:w="1190" w:type="dxa"/>
+            <w:tcBorders/>
+            <w:vAlign w:val="center"/>
+          </w:tcPr>
+          <w:p>
+            <w:pPr>
+              <w:pStyle w:val="TableContents"/>
+              <w:shd w:fill="2E3440" w:val="clear"/>
+              <w:bidi w:val="0"/>
+              <w:spacing w:before="120" w:after="120"/>
+              <w:jc w:val="left"/>
+              <w:rPr/>
+            </w:pPr>
+            <w:r>
+              <w:rPr/>
+              <w:t>both, stricter wins</w:t>
+            </w:r>
+          </w:p>
+        </w:tc>
+        <w:tc>
+          <w:tcPr>
+            <w:tcW w:w="1157" w:type="dxa"/>
             <w:tcBorders/>
             <w:vAlign w:val="center"/>
           </w:tcPr>
@@ -25748,7 +26025,7 @@
         </w:tc>
         <w:tc>
           <w:tcPr>
-            <w:tcW w:w="2104" w:type="dxa"/>
+            <w:tcW w:w="2237" w:type="dxa"/>
             <w:tcBorders/>
             <w:vAlign w:val="center"/>
           </w:tcPr>
@@ -25789,13 +26066,13 @@
             </w:r>
             <w:r>
               <w:rPr/>
-              <w:t>)</w:t>
-            </w:r>
-          </w:p>
-        </w:tc>
-        <w:tc>
-          <w:tcPr>
-            <w:tcW w:w="1280" w:type="dxa"/>
+              <w:t>); personal: listed strictest first, the stricter wins</w:t>
+            </w:r>
+          </w:p>
+        </w:tc>
+        <w:tc>
+          <w:tcPr>
+            <w:tcW w:w="1278" w:type="dxa"/>
             <w:tcBorders/>
             <w:vAlign w:val="center"/>
           </w:tcPr>
@@ -25816,7 +26093,7 @@
         </w:tc>
         <w:tc>
           <w:tcPr>
-            <w:tcW w:w="3465" w:type="dxa"/>
+            <w:tcW w:w="3340" w:type="dxa"/>
             <w:tcBorders/>
             <w:vAlign w:val="center"/>
           </w:tcPr>
@@ -25860,7 +26137,7 @@
         <w:trPr/>
         <w:tc>
           <w:tcPr>
-            <w:tcW w:w="3573" w:type="dxa"/>
+            <w:tcW w:w="3569" w:type="dxa"/>
             <w:tcBorders/>
             <w:vAlign w:val="center"/>
           </w:tcPr>
@@ -25883,28 +26160,28 @@
         </w:tc>
         <w:tc>
           <w:tcPr>
-            <w:tcW w:w="1193" w:type="dxa"/>
-            <w:tcBorders/>
-            <w:vAlign w:val="center"/>
-          </w:tcPr>
-          <w:p>
-            <w:pPr>
-              <w:pStyle w:val="TableContents"/>
-              <w:shd w:fill="2E3440" w:val="clear"/>
-              <w:bidi w:val="0"/>
-              <w:spacing w:before="120" w:after="120"/>
-              <w:jc w:val="left"/>
-              <w:rPr/>
-            </w:pPr>
-            <w:r>
-              <w:rPr/>
-              <w:t>repo</w:t>
-            </w:r>
-          </w:p>
-        </w:tc>
-        <w:tc>
-          <w:tcPr>
-            <w:tcW w:w="1156" w:type="dxa"/>
+            <w:tcW w:w="1190" w:type="dxa"/>
+            <w:tcBorders/>
+            <w:vAlign w:val="center"/>
+          </w:tcPr>
+          <w:p>
+            <w:pPr>
+              <w:pStyle w:val="TableContents"/>
+              <w:shd w:fill="2E3440" w:val="clear"/>
+              <w:bidi w:val="0"/>
+              <w:spacing w:before="120" w:after="120"/>
+              <w:jc w:val="left"/>
+              <w:rPr/>
+            </w:pPr>
+            <w:r>
+              <w:rPr/>
+              <w:t>both, stricter wins</w:t>
+            </w:r>
+          </w:p>
+        </w:tc>
+        <w:tc>
+          <w:tcPr>
+            <w:tcW w:w="1157" w:type="dxa"/>
             <w:tcBorders/>
             <w:vAlign w:val="center"/>
           </w:tcPr>
@@ -25927,7 +26204,7 @@
         </w:tc>
         <w:tc>
           <w:tcPr>
-            <w:tcW w:w="2104" w:type="dxa"/>
+            <w:tcW w:w="2237" w:type="dxa"/>
             <w:tcBorders/>
             <w:vAlign w:val="center"/>
           </w:tcPr>
@@ -25952,13 +26229,13 @@
             </w:r>
             <w:r>
               <w:rPr/>
-              <w:t>)</w:t>
-            </w:r>
-          </w:p>
-        </w:tc>
-        <w:tc>
-          <w:tcPr>
-            <w:tcW w:w="1280" w:type="dxa"/>
+              <w:t>); personal: the smaller wins</w:t>
+            </w:r>
+          </w:p>
+        </w:tc>
+        <w:tc>
+          <w:tcPr>
+            <w:tcW w:w="1278" w:type="dxa"/>
             <w:tcBorders/>
             <w:vAlign w:val="center"/>
           </w:tcPr>
@@ -25979,7 +26256,7 @@
         </w:tc>
         <w:tc>
           <w:tcPr>
-            <w:tcW w:w="3465" w:type="dxa"/>
+            <w:tcW w:w="3340" w:type="dxa"/>
             <w:tcBorders/>
             <w:vAlign w:val="center"/>
           </w:tcPr>
@@ -26003,7 +26280,7 @@
         <w:trPr/>
         <w:tc>
           <w:tcPr>
-            <w:tcW w:w="3573" w:type="dxa"/>
+            <w:tcW w:w="3569" w:type="dxa"/>
             <w:tcBorders/>
             <w:vAlign w:val="center"/>
           </w:tcPr>
@@ -26026,28 +26303,28 @@
         </w:tc>
         <w:tc>
           <w:tcPr>
-            <w:tcW w:w="1193" w:type="dxa"/>
-            <w:tcBorders/>
-            <w:vAlign w:val="center"/>
-          </w:tcPr>
-          <w:p>
-            <w:pPr>
-              <w:pStyle w:val="TableContents"/>
-              <w:shd w:fill="2E3440" w:val="clear"/>
-              <w:bidi w:val="0"/>
-              <w:spacing w:before="120" w:after="120"/>
-              <w:jc w:val="left"/>
-              <w:rPr/>
-            </w:pPr>
-            <w:r>
-              <w:rPr/>
-              <w:t>repo</w:t>
-            </w:r>
-          </w:p>
-        </w:tc>
-        <w:tc>
-          <w:tcPr>
-            <w:tcW w:w="1156" w:type="dxa"/>
+            <w:tcW w:w="1190" w:type="dxa"/>
+            <w:tcBorders/>
+            <w:vAlign w:val="center"/>
+          </w:tcPr>
+          <w:p>
+            <w:pPr>
+              <w:pStyle w:val="TableContents"/>
+              <w:shd w:fill="2E3440" w:val="clear"/>
+              <w:bidi w:val="0"/>
+              <w:spacing w:before="120" w:after="120"/>
+              <w:jc w:val="left"/>
+              <w:rPr/>
+            </w:pPr>
+            <w:r>
+              <w:rPr/>
+              <w:t>both, stricter wins</w:t>
+            </w:r>
+          </w:p>
+        </w:tc>
+        <w:tc>
+          <w:tcPr>
+            <w:tcW w:w="1157" w:type="dxa"/>
             <w:tcBorders/>
             <w:vAlign w:val="center"/>
           </w:tcPr>
@@ -26070,7 +26347,7 @@
         </w:tc>
         <w:tc>
           <w:tcPr>
-            <w:tcW w:w="2104" w:type="dxa"/>
+            <w:tcW w:w="2237" w:type="dxa"/>
             <w:tcBorders/>
             <w:vAlign w:val="center"/>
           </w:tcPr>
@@ -26109,11 +26386,15 @@
               </w:rPr>
               <w:t>all</w:t>
             </w:r>
-          </w:p>
-        </w:tc>
-        <w:tc>
-          <w:tcPr>
-            <w:tcW w:w="1280" w:type="dxa"/>
+            <w:r>
+              <w:rPr/>
+              <w:t>; personal: listed strictest first, the stricter wins</w:t>
+            </w:r>
+          </w:p>
+        </w:tc>
+        <w:tc>
+          <w:tcPr>
+            <w:tcW w:w="1278" w:type="dxa"/>
             <w:tcBorders/>
             <w:vAlign w:val="center"/>
           </w:tcPr>
@@ -26134,7 +26415,7 @@
         </w:tc>
         <w:tc>
           <w:tcPr>
-            <w:tcW w:w="3465" w:type="dxa"/>
+            <w:tcW w:w="3340" w:type="dxa"/>
             <w:tcBorders/>
             <w:vAlign w:val="center"/>
           </w:tcPr>
@@ -26168,7 +26449,7 @@
         <w:trPr/>
         <w:tc>
           <w:tcPr>
-            <w:tcW w:w="3573" w:type="dxa"/>
+            <w:tcW w:w="3569" w:type="dxa"/>
             <w:tcBorders/>
             <w:vAlign w:val="center"/>
           </w:tcPr>
@@ -26191,28 +26472,28 @@
         </w:tc>
         <w:tc>
           <w:tcPr>
-            <w:tcW w:w="1193" w:type="dxa"/>
-            <w:tcBorders/>
-            <w:vAlign w:val="center"/>
-          </w:tcPr>
-          <w:p>
-            <w:pPr>
-              <w:pStyle w:val="TableContents"/>
-              <w:shd w:fill="2E3440" w:val="clear"/>
-              <w:bidi w:val="0"/>
-              <w:spacing w:before="120" w:after="120"/>
-              <w:jc w:val="left"/>
-              <w:rPr/>
-            </w:pPr>
-            <w:r>
-              <w:rPr/>
-              <w:t>repo</w:t>
-            </w:r>
-          </w:p>
-        </w:tc>
-        <w:tc>
-          <w:tcPr>
-            <w:tcW w:w="1156" w:type="dxa"/>
+            <w:tcW w:w="1190" w:type="dxa"/>
+            <w:tcBorders/>
+            <w:vAlign w:val="center"/>
+          </w:tcPr>
+          <w:p>
+            <w:pPr>
+              <w:pStyle w:val="TableContents"/>
+              <w:shd w:fill="2E3440" w:val="clear"/>
+              <w:bidi w:val="0"/>
+              <w:spacing w:before="120" w:after="120"/>
+              <w:jc w:val="left"/>
+              <w:rPr/>
+            </w:pPr>
+            <w:r>
+              <w:rPr/>
+              <w:t>both, stricter wins</w:t>
+            </w:r>
+          </w:p>
+        </w:tc>
+        <w:tc>
+          <w:tcPr>
+            <w:tcW w:w="1157" w:type="dxa"/>
             <w:tcBorders/>
             <w:vAlign w:val="center"/>
           </w:tcPr>
@@ -26235,7 +26516,7 @@
         </w:tc>
         <w:tc>
           <w:tcPr>
-            <w:tcW w:w="2104" w:type="dxa"/>
+            <w:tcW w:w="2237" w:type="dxa"/>
             <w:tcBorders/>
             <w:vAlign w:val="center"/>
           </w:tcPr>
@@ -26262,23 +26543,27 @@
               <w:rPr>
                 <w:rStyle w:val="SourceText"/>
               </w:rPr>
+              <w:t>risk</w:t>
+            </w:r>
+            <w:r>
+              <w:rPr/>
+              <w:t xml:space="preserve"> | </w:t>
+            </w:r>
+            <w:r>
+              <w:rPr>
+                <w:rStyle w:val="SourceText"/>
+              </w:rPr>
               <w:t>self</w:t>
             </w:r>
             <w:r>
               <w:rPr/>
-              <w:t xml:space="preserve"> | </w:t>
-            </w:r>
-            <w:r>
-              <w:rPr>
-                <w:rStyle w:val="SourceText"/>
-              </w:rPr>
-              <w:t>risk</w:t>
-            </w:r>
-          </w:p>
-        </w:tc>
-        <w:tc>
-          <w:tcPr>
-            <w:tcW w:w="1280" w:type="dxa"/>
+              <w:t>; personal: listed strictest first, the stricter wins</w:t>
+            </w:r>
+          </w:p>
+        </w:tc>
+        <w:tc>
+          <w:tcPr>
+            <w:tcW w:w="1278" w:type="dxa"/>
             <w:tcBorders/>
             <w:vAlign w:val="center"/>
           </w:tcPr>
@@ -26299,7 +26584,7 @@
         </w:tc>
         <w:tc>
           <w:tcPr>
-            <w:tcW w:w="3465" w:type="dxa"/>
+            <w:tcW w:w="3340" w:type="dxa"/>
             <w:tcBorders/>
             <w:vAlign w:val="center"/>
           </w:tcPr>
@@ -26333,7 +26618,7 @@
         <w:trPr/>
         <w:tc>
           <w:tcPr>
-            <w:tcW w:w="3573" w:type="dxa"/>
+            <w:tcW w:w="3569" w:type="dxa"/>
             <w:tcBorders/>
             <w:vAlign w:val="center"/>
           </w:tcPr>
@@ -26356,28 +26641,28 @@
         </w:tc>
         <w:tc>
           <w:tcPr>
-            <w:tcW w:w="1193" w:type="dxa"/>
-            <w:tcBorders/>
-            <w:vAlign w:val="center"/>
-          </w:tcPr>
-          <w:p>
-            <w:pPr>
-              <w:pStyle w:val="TableContents"/>
-              <w:shd w:fill="2E3440" w:val="clear"/>
-              <w:bidi w:val="0"/>
-              <w:spacing w:before="120" w:after="120"/>
-              <w:jc w:val="left"/>
-              <w:rPr/>
-            </w:pPr>
-            <w:r>
-              <w:rPr/>
-              <w:t>repo</w:t>
-            </w:r>
-          </w:p>
-        </w:tc>
-        <w:tc>
-          <w:tcPr>
-            <w:tcW w:w="1156" w:type="dxa"/>
+            <w:tcW w:w="1190" w:type="dxa"/>
+            <w:tcBorders/>
+            <w:vAlign w:val="center"/>
+          </w:tcPr>
+          <w:p>
+            <w:pPr>
+              <w:pStyle w:val="TableContents"/>
+              <w:shd w:fill="2E3440" w:val="clear"/>
+              <w:bidi w:val="0"/>
+              <w:spacing w:before="120" w:after="120"/>
+              <w:jc w:val="left"/>
+              <w:rPr/>
+            </w:pPr>
+            <w:r>
+              <w:rPr/>
+              <w:t>both, stricter wins</w:t>
+            </w:r>
+          </w:p>
+        </w:tc>
+        <w:tc>
+          <w:tcPr>
+            <w:tcW w:w="1157" w:type="dxa"/>
             <w:tcBorders/>
             <w:vAlign w:val="center"/>
           </w:tcPr>
@@ -26400,7 +26685,7 @@
         </w:tc>
         <w:tc>
           <w:tcPr>
-            <w:tcW w:w="2104" w:type="dxa"/>
+            <w:tcW w:w="2237" w:type="dxa"/>
             <w:tcBorders/>
             <w:vAlign w:val="center"/>
           </w:tcPr>
@@ -26427,23 +26712,27 @@
               <w:rPr>
                 <w:rStyle w:val="SourceText"/>
               </w:rPr>
+              <w:t>risk</w:t>
+            </w:r>
+            <w:r>
+              <w:rPr/>
+              <w:t xml:space="preserve"> | </w:t>
+            </w:r>
+            <w:r>
+              <w:rPr>
+                <w:rStyle w:val="SourceText"/>
+              </w:rPr>
               <w:t>self</w:t>
             </w:r>
             <w:r>
               <w:rPr/>
-              <w:t xml:space="preserve"> | </w:t>
-            </w:r>
-            <w:r>
-              <w:rPr>
-                <w:rStyle w:val="SourceText"/>
-              </w:rPr>
-              <w:t>risk</w:t>
-            </w:r>
-          </w:p>
-        </w:tc>
-        <w:tc>
-          <w:tcPr>
-            <w:tcW w:w="1280" w:type="dxa"/>
+              <w:t>; personal: listed strictest first, the stricter wins</w:t>
+            </w:r>
+          </w:p>
+        </w:tc>
+        <w:tc>
+          <w:tcPr>
+            <w:tcW w:w="1278" w:type="dxa"/>
             <w:tcBorders/>
             <w:vAlign w:val="center"/>
           </w:tcPr>
@@ -26464,7 +26753,7 @@
         </w:tc>
         <w:tc>
           <w:tcPr>
-            <w:tcW w:w="3465" w:type="dxa"/>
+            <w:tcW w:w="3340" w:type="dxa"/>
             <w:tcBorders/>
             <w:vAlign w:val="center"/>
           </w:tcPr>
@@ -26498,7 +26787,7 @@
         <w:trPr/>
         <w:tc>
           <w:tcPr>
-            <w:tcW w:w="3573" w:type="dxa"/>
+            <w:tcW w:w="3569" w:type="dxa"/>
             <w:tcBorders/>
             <w:vAlign w:val="center"/>
           </w:tcPr>
@@ -26521,7 +26810,7 @@
         </w:tc>
         <w:tc>
           <w:tcPr>
-            <w:tcW w:w="1193" w:type="dxa"/>
+            <w:tcW w:w="1190" w:type="dxa"/>
             <w:tcBorders/>
             <w:vAlign w:val="center"/>
           </w:tcPr>
@@ -26542,7 +26831,7 @@
         </w:tc>
         <w:tc>
           <w:tcPr>
-            <w:tcW w:w="1156" w:type="dxa"/>
+            <w:tcW w:w="1157" w:type="dxa"/>
             <w:tcBorders/>
             <w:vAlign w:val="center"/>
           </w:tcPr>
@@ -26565,7 +26854,7 @@
         </w:tc>
         <w:tc>
           <w:tcPr>
-            <w:tcW w:w="2104" w:type="dxa"/>
+            <w:tcW w:w="2237" w:type="dxa"/>
             <w:tcBorders/>
             <w:vAlign w:val="center"/>
           </w:tcPr>
@@ -26596,7 +26885,7 @@
         </w:tc>
         <w:tc>
           <w:tcPr>
-            <w:tcW w:w="1280" w:type="dxa"/>
+            <w:tcW w:w="1278" w:type="dxa"/>
             <w:tcBorders/>
             <w:vAlign w:val="center"/>
           </w:tcPr>
@@ -26617,7 +26906,7 @@
         </w:tc>
         <w:tc>
           <w:tcPr>
-            <w:tcW w:w="3465" w:type="dxa"/>
+            <w:tcW w:w="3340" w:type="dxa"/>
             <w:tcBorders/>
             <w:vAlign w:val="center"/>
           </w:tcPr>
@@ -26641,7 +26930,7 @@
         <w:trPr/>
         <w:tc>
           <w:tcPr>
-            <w:tcW w:w="3573" w:type="dxa"/>
+            <w:tcW w:w="3569" w:type="dxa"/>
             <w:tcBorders/>
             <w:vAlign w:val="center"/>
           </w:tcPr>
@@ -26664,7 +26953,7 @@
         </w:tc>
         <w:tc>
           <w:tcPr>
-            <w:tcW w:w="1193" w:type="dxa"/>
+            <w:tcW w:w="1190" w:type="dxa"/>
             <w:tcBorders/>
             <w:vAlign w:val="center"/>
           </w:tcPr>
@@ -26685,7 +26974,7 @@
         </w:tc>
         <w:tc>
           <w:tcPr>
-            <w:tcW w:w="1156" w:type="dxa"/>
+            <w:tcW w:w="1157" w:type="dxa"/>
             <w:tcBorders/>
             <w:vAlign w:val="center"/>
           </w:tcPr>
@@ -26708,7 +26997,7 @@
         </w:tc>
         <w:tc>
           <w:tcPr>
-            <w:tcW w:w="2104" w:type="dxa"/>
+            <w:tcW w:w="2237" w:type="dxa"/>
             <w:tcBorders/>
             <w:vAlign w:val="center"/>
           </w:tcPr>
@@ -26739,7 +27028,7 @@
         </w:tc>
         <w:tc>
           <w:tcPr>
-            <w:tcW w:w="1280" w:type="dxa"/>
+            <w:tcW w:w="1278" w:type="dxa"/>
             <w:tcBorders/>
             <w:vAlign w:val="center"/>
           </w:tcPr>
@@ -26760,7 +27049,7 @@
         </w:tc>
         <w:tc>
           <w:tcPr>
-            <w:tcW w:w="3465" w:type="dxa"/>
+            <w:tcW w:w="3340" w:type="dxa"/>
             <w:tcBorders/>
             <w:vAlign w:val="center"/>
           </w:tcPr>
@@ -26794,7 +27083,7 @@
         <w:trPr/>
         <w:tc>
           <w:tcPr>
-            <w:tcW w:w="3573" w:type="dxa"/>
+            <w:tcW w:w="3569" w:type="dxa"/>
             <w:tcBorders/>
             <w:vAlign w:val="center"/>
           </w:tcPr>
@@ -26817,7 +27106,7 @@
         </w:tc>
         <w:tc>
           <w:tcPr>
-            <w:tcW w:w="1193" w:type="dxa"/>
+            <w:tcW w:w="1190" w:type="dxa"/>
             <w:tcBorders/>
             <w:vAlign w:val="center"/>
           </w:tcPr>
@@ -26838,7 +27127,7 @@
         </w:tc>
         <w:tc>
           <w:tcPr>
-            <w:tcW w:w="1156" w:type="dxa"/>
+            <w:tcW w:w="1157" w:type="dxa"/>
             <w:tcBorders/>
             <w:vAlign w:val="center"/>
           </w:tcPr>
@@ -26861,7 +27150,7 @@
         </w:tc>
         <w:tc>
           <w:tcPr>
-            <w:tcW w:w="2104" w:type="dxa"/>
+            <w:tcW w:w="2237" w:type="dxa"/>
             <w:tcBorders/>
             <w:vAlign w:val="center"/>
           </w:tcPr>
@@ -26928,7 +27217,7 @@
         </w:tc>
         <w:tc>
           <w:tcPr>
-            <w:tcW w:w="1280" w:type="dxa"/>
+            <w:tcW w:w="1278" w:type="dxa"/>
             <w:tcBorders/>
             <w:vAlign w:val="center"/>
           </w:tcPr>
@@ -26949,7 +27238,7 @@
         </w:tc>
         <w:tc>
           <w:tcPr>
-            <w:tcW w:w="3465" w:type="dxa"/>
+            <w:tcW w:w="3340" w:type="dxa"/>
             <w:tcBorders/>
             <w:vAlign w:val="center"/>
           </w:tcPr>
@@ -26979,7 +27268,7 @@
         <w:trPr/>
         <w:tc>
           <w:tcPr>
-            <w:tcW w:w="3573" w:type="dxa"/>
+            <w:tcW w:w="3569" w:type="dxa"/>
             <w:tcBorders/>
             <w:vAlign w:val="center"/>
           </w:tcPr>
@@ -27002,7 +27291,7 @@
         </w:tc>
         <w:tc>
           <w:tcPr>
-            <w:tcW w:w="1193" w:type="dxa"/>
+            <w:tcW w:w="1190" w:type="dxa"/>
             <w:tcBorders/>
             <w:vAlign w:val="center"/>
           </w:tcPr>
@@ -27023,7 +27312,7 @@
         </w:tc>
         <w:tc>
           <w:tcPr>
-            <w:tcW w:w="1156" w:type="dxa"/>
+            <w:tcW w:w="1157" w:type="dxa"/>
             <w:tcBorders/>
             <w:vAlign w:val="center"/>
           </w:tcPr>
@@ -27046,7 +27335,7 @@
         </w:tc>
         <w:tc>
           <w:tcPr>
-            <w:tcW w:w="2104" w:type="dxa"/>
+            <w:tcW w:w="2237" w:type="dxa"/>
             <w:tcBorders/>
             <w:vAlign w:val="center"/>
           </w:tcPr>
@@ -27113,7 +27402,7 @@
         </w:tc>
         <w:tc>
           <w:tcPr>
-            <w:tcW w:w="1280" w:type="dxa"/>
+            <w:tcW w:w="1278" w:type="dxa"/>
             <w:tcBorders/>
             <w:vAlign w:val="center"/>
           </w:tcPr>
@@ -27134,7 +27423,7 @@
         </w:tc>
         <w:tc>
           <w:tcPr>
-            <w:tcW w:w="3465" w:type="dxa"/>
+            <w:tcW w:w="3340" w:type="dxa"/>
             <w:tcBorders/>
             <w:vAlign w:val="center"/>
           </w:tcPr>
@@ -27169,8 +27458,8 @@
         <w:jc w:val="left"/>
         <w:rPr/>
       </w:pPr>
-      <w:bookmarkStart w:id="35" w:name="tickets"/>
-      <w:bookmarkEnd w:id="35"/>
+      <w:bookmarkStart w:id="36" w:name="tickets"/>
+      <w:bookmarkEnd w:id="36"/>
       <w:r>
         <w:rPr>
           <w:rStyle w:val="SourceText"/>
@@ -27488,8 +27777,8 @@
         <w:jc w:val="left"/>
         <w:rPr/>
       </w:pPr>
-      <w:bookmarkStart w:id="36" w:name="route"/>
-      <w:bookmarkEnd w:id="36"/>
+      <w:bookmarkStart w:id="37" w:name="route"/>
+      <w:bookmarkEnd w:id="37"/>
       <w:r>
         <w:rPr>
           <w:rStyle w:val="SourceText"/>
@@ -27843,8 +28132,8 @@
         <w:jc w:val="left"/>
         <w:rPr/>
       </w:pPr>
-      <w:bookmarkStart w:id="37" w:name="coming-not-in-code-yet"/>
-      <w:bookmarkEnd w:id="37"/>
+      <w:bookmarkStart w:id="38" w:name="coming-not-in-code-yet"/>
+      <w:bookmarkEnd w:id="38"/>
       <w:r>
         <w:rPr/>
         <w:t>Coming (Not in Code Yet)</w:t>
@@ -27880,8 +28169,8 @@
         <w:jc w:val="left"/>
         <w:rPr/>
       </w:pPr>
-      <w:bookmarkStart w:id="38" w:name="t-0009"/>
-      <w:bookmarkEnd w:id="38"/>
+      <w:bookmarkStart w:id="39" w:name="t-0009"/>
+      <w:bookmarkEnd w:id="39"/>
       <w:r>
         <w:rPr/>
         <w:t>T-0009</w:t>
@@ -28324,8 +28613,8 @@
         <w:jc w:val="left"/>
         <w:rPr/>
       </w:pPr>
-      <w:bookmarkStart w:id="39" w:name="t-0011"/>
-      <w:bookmarkEnd w:id="39"/>
+      <w:bookmarkStart w:id="40" w:name="t-0011"/>
+      <w:bookmarkEnd w:id="40"/>
       <w:r>
         <w:rPr/>
         <w:t>T-0011</w:t>
@@ -28941,8 +29230,8 @@
         <w:jc w:val="left"/>
         <w:rPr/>
       </w:pPr>
-      <w:bookmarkStart w:id="40" w:name="t-0012"/>
-      <w:bookmarkEnd w:id="40"/>
+      <w:bookmarkStart w:id="41" w:name="t-0012"/>
+      <w:bookmarkEnd w:id="41"/>
       <w:r>
         <w:rPr/>
         <w:t>T-0012</w:t>
@@ -29548,8 +29837,8 @@
         <w:jc w:val="left"/>
         <w:rPr/>
       </w:pPr>
-      <w:bookmarkStart w:id="41" w:name="t-0029"/>
-      <w:bookmarkEnd w:id="41"/>
+      <w:bookmarkStart w:id="42" w:name="t-0029"/>
+      <w:bookmarkEnd w:id="42"/>
       <w:r>
         <w:rPr/>
         <w:t>T-0029</w:t>
@@ -30010,8 +30299,8 @@
         <w:jc w:val="left"/>
         <w:rPr/>
       </w:pPr>
-      <w:bookmarkStart w:id="42" w:name="t-0030"/>
-      <w:bookmarkEnd w:id="42"/>
+      <w:bookmarkStart w:id="43" w:name="t-0030"/>
+      <w:bookmarkEnd w:id="43"/>
       <w:r>
         <w:rPr/>
         <w:t>T-0030</w:t>
@@ -30454,8 +30743,8 @@
         <w:jc w:val="left"/>
         <w:rPr/>
       </w:pPr>
-      <w:bookmarkStart w:id="43" w:name="t-0050"/>
-      <w:bookmarkEnd w:id="43"/>
+      <w:bookmarkStart w:id="44" w:name="t-0050"/>
+      <w:bookmarkEnd w:id="44"/>
       <w:r>
         <w:rPr/>
         <w:t>T-0050</w:t>
@@ -30475,12 +30764,12 @@
         </w:tblCellMar>
       </w:tblPr>
       <w:tblGrid>
-        <w:gridCol w:w="3360"/>
-        <w:gridCol w:w="1442"/>
-        <w:gridCol w:w="1407"/>
-        <w:gridCol w:w="1159"/>
-        <w:gridCol w:w="1095"/>
-        <w:gridCol w:w="4308"/>
+        <w:gridCol w:w="3475"/>
+        <w:gridCol w:w="1272"/>
+        <w:gridCol w:w="1372"/>
+        <w:gridCol w:w="1157"/>
+        <w:gridCol w:w="1078"/>
+        <w:gridCol w:w="4417"/>
       </w:tblGrid>
       <w:tr>
         <w:trPr>
@@ -30488,7 +30777,7 @@
         </w:trPr>
         <w:tc>
           <w:tcPr>
-            <w:tcW w:w="3360" w:type="dxa"/>
+            <w:tcW w:w="3475" w:type="dxa"/>
             <w:tcBorders/>
             <w:vAlign w:val="center"/>
           </w:tcPr>
@@ -30510,7 +30799,7 @@
         </w:tc>
         <w:tc>
           <w:tcPr>
-            <w:tcW w:w="1442" w:type="dxa"/>
+            <w:tcW w:w="1272" w:type="dxa"/>
             <w:tcBorders/>
             <w:vAlign w:val="center"/>
           </w:tcPr>
@@ -30532,7 +30821,7 @@
         </w:tc>
         <w:tc>
           <w:tcPr>
-            <w:tcW w:w="1407" w:type="dxa"/>
+            <w:tcW w:w="1372" w:type="dxa"/>
             <w:tcBorders/>
             <w:vAlign w:val="center"/>
           </w:tcPr>
@@ -30554,7 +30843,7 @@
         </w:tc>
         <w:tc>
           <w:tcPr>
-            <w:tcW w:w="1159" w:type="dxa"/>
+            <w:tcW w:w="1157" w:type="dxa"/>
             <w:tcBorders/>
             <w:vAlign w:val="center"/>
           </w:tcPr>
@@ -30576,7 +30865,7 @@
         </w:tc>
         <w:tc>
           <w:tcPr>
-            <w:tcW w:w="1095" w:type="dxa"/>
+            <w:tcW w:w="1078" w:type="dxa"/>
             <w:tcBorders/>
             <w:vAlign w:val="center"/>
           </w:tcPr>
@@ -30598,7 +30887,7 @@
         </w:tc>
         <w:tc>
           <w:tcPr>
-            <w:tcW w:w="4308" w:type="dxa"/>
+            <w:tcW w:w="4417" w:type="dxa"/>
             <w:tcBorders/>
             <w:vAlign w:val="center"/>
           </w:tcPr>
@@ -30623,30 +30912,30 @@
         <w:trPr/>
         <w:tc>
           <w:tcPr>
-            <w:tcW w:w="3360" w:type="dxa"/>
-            <w:tcBorders/>
-            <w:vAlign w:val="center"/>
-          </w:tcPr>
-          <w:p>
-            <w:pPr>
-              <w:pStyle w:val="TableContents"/>
-              <w:shd w:fill="2E3440" w:val="clear"/>
-              <w:bidi w:val="0"/>
-              <w:spacing w:before="120" w:after="120"/>
-              <w:jc w:val="left"/>
-              <w:rPr/>
-            </w:pPr>
-            <w:r>
-              <w:rPr>
-                <w:rStyle w:val="SourceText"/>
-              </w:rPr>
-              <w:t>autopilot.mode</w:t>
-            </w:r>
-          </w:p>
-        </w:tc>
-        <w:tc>
-          <w:tcPr>
-            <w:tcW w:w="1442" w:type="dxa"/>
+            <w:tcW w:w="3475" w:type="dxa"/>
+            <w:tcBorders/>
+            <w:vAlign w:val="center"/>
+          </w:tcPr>
+          <w:p>
+            <w:pPr>
+              <w:pStyle w:val="TableContents"/>
+              <w:shd w:fill="2E3440" w:val="clear"/>
+              <w:bidi w:val="0"/>
+              <w:spacing w:before="120" w:after="120"/>
+              <w:jc w:val="left"/>
+              <w:rPr/>
+            </w:pPr>
+            <w:r>
+              <w:rPr>
+                <w:rStyle w:val="SourceText"/>
+              </w:rPr>
+              <w:t>scope.allowCliApproval</w:t>
+            </w:r>
+          </w:p>
+        </w:tc>
+        <w:tc>
+          <w:tcPr>
+            <w:tcW w:w="1272" w:type="dxa"/>
             <w:tcBorders/>
             <w:vAlign w:val="center"/>
           </w:tcPr>
@@ -30667,7 +30956,7 @@
         </w:tc>
         <w:tc>
           <w:tcPr>
-            <w:tcW w:w="1407" w:type="dxa"/>
+            <w:tcW w:w="1372" w:type="dxa"/>
             <w:tcBorders/>
             <w:vAlign w:val="center"/>
           </w:tcPr>
@@ -30688,28 +30977,28 @@
         </w:tc>
         <w:tc>
           <w:tcPr>
-            <w:tcW w:w="1159" w:type="dxa"/>
-            <w:tcBorders/>
-            <w:vAlign w:val="center"/>
-          </w:tcPr>
-          <w:p>
-            <w:pPr>
-              <w:pStyle w:val="TableContents"/>
-              <w:shd w:fill="2E3440" w:val="clear"/>
-              <w:bidi w:val="0"/>
-              <w:spacing w:before="120" w:after="120"/>
-              <w:jc w:val="left"/>
-              <w:rPr/>
-            </w:pPr>
-            <w:r>
-              <w:rPr/>
-              <w:t>off</w:t>
-            </w:r>
-          </w:p>
-        </w:tc>
-        <w:tc>
-          <w:tcPr>
-            <w:tcW w:w="1095" w:type="dxa"/>
+            <w:tcW w:w="1157" w:type="dxa"/>
+            <w:tcBorders/>
+            <w:vAlign w:val="center"/>
+          </w:tcPr>
+          <w:p>
+            <w:pPr>
+              <w:pStyle w:val="TableContents"/>
+              <w:shd w:fill="2E3440" w:val="clear"/>
+              <w:bidi w:val="0"/>
+              <w:spacing w:before="120" w:after="120"/>
+              <w:jc w:val="left"/>
+              <w:rPr/>
+            </w:pPr>
+            <w:r>
+              <w:rPr/>
+              <w:t>false</w:t>
+            </w:r>
+          </w:p>
+        </w:tc>
+        <w:tc>
+          <w:tcPr>
+            <w:tcW w:w="1078" w:type="dxa"/>
             <w:tcBorders/>
             <w:vAlign w:val="center"/>
           </w:tcPr>
@@ -30734,157 +31023,32 @@
         </w:tc>
         <w:tc>
           <w:tcPr>
-            <w:tcW w:w="4308" w:type="dxa"/>
-            <w:tcBorders/>
-            <w:vAlign w:val="center"/>
-          </w:tcPr>
-          <w:p>
-            <w:pPr>
-              <w:pStyle w:val="TableContents"/>
-              <w:shd w:fill="2E3440" w:val="clear"/>
-              <w:bidi w:val="0"/>
-              <w:spacing w:before="120" w:after="120"/>
-              <w:jc w:val="left"/>
-              <w:rPr/>
-            </w:pPr>
-            <w:r>
-              <w:rPr/>
-              <w:t>The personal autopilot keys become settable in the global file; the stricter layer wins.</w:t>
-            </w:r>
-          </w:p>
-        </w:tc>
-      </w:tr>
-      <w:tr>
-        <w:trPr/>
-        <w:tc>
-          <w:tcPr>
-            <w:tcW w:w="3360" w:type="dxa"/>
-            <w:tcBorders/>
-            <w:vAlign w:val="center"/>
-          </w:tcPr>
-          <w:p>
-            <w:pPr>
-              <w:pStyle w:val="TableContents"/>
-              <w:shd w:fill="2E3440" w:val="clear"/>
-              <w:bidi w:val="0"/>
-              <w:spacing w:before="120" w:after="120"/>
-              <w:jc w:val="left"/>
-              <w:rPr/>
-            </w:pPr>
-            <w:r>
-              <w:rPr>
-                <w:rStyle w:val="SourceText"/>
-              </w:rPr>
-              <w:t>scope.allowCliApproval</w:t>
-            </w:r>
-          </w:p>
-        </w:tc>
-        <w:tc>
-          <w:tcPr>
-            <w:tcW w:w="1442" w:type="dxa"/>
-            <w:tcBorders/>
-            <w:vAlign w:val="center"/>
-          </w:tcPr>
-          <w:p>
-            <w:pPr>
-              <w:pStyle w:val="TableContents"/>
-              <w:shd w:fill="2E3440" w:val="clear"/>
-              <w:bidi w:val="0"/>
-              <w:spacing w:before="120" w:after="120"/>
-              <w:jc w:val="left"/>
-              <w:rPr/>
-            </w:pPr>
-            <w:r>
-              <w:rPr/>
-              <w:t>changes layer</w:t>
-            </w:r>
-          </w:p>
-        </w:tc>
-        <w:tc>
-          <w:tcPr>
-            <w:tcW w:w="1407" w:type="dxa"/>
-            <w:tcBorders/>
-            <w:vAlign w:val="center"/>
-          </w:tcPr>
-          <w:p>
-            <w:pPr>
-              <w:pStyle w:val="TableContents"/>
-              <w:shd w:fill="2E3440" w:val="clear"/>
-              <w:bidi w:val="0"/>
-              <w:spacing w:before="120" w:after="120"/>
-              <w:jc w:val="left"/>
-              <w:rPr/>
-            </w:pPr>
-            <w:r>
-              <w:rPr/>
-              <w:t>both, stricter wins</w:t>
-            </w:r>
-          </w:p>
-        </w:tc>
-        <w:tc>
-          <w:tcPr>
-            <w:tcW w:w="1159" w:type="dxa"/>
-            <w:tcBorders/>
-            <w:vAlign w:val="center"/>
-          </w:tcPr>
-          <w:p>
-            <w:pPr>
-              <w:pStyle w:val="TableContents"/>
-              <w:shd w:fill="2E3440" w:val="clear"/>
-              <w:bidi w:val="0"/>
-              <w:spacing w:before="120" w:after="120"/>
-              <w:jc w:val="left"/>
-              <w:rPr/>
-            </w:pPr>
-            <w:r>
-              <w:rPr/>
-              <w:t>false</w:t>
-            </w:r>
-          </w:p>
-        </w:tc>
-        <w:tc>
-          <w:tcPr>
-            <w:tcW w:w="1095" w:type="dxa"/>
-            <w:tcBorders/>
-            <w:vAlign w:val="center"/>
-          </w:tcPr>
-          <w:p>
-            <w:pPr>
-              <w:pStyle w:val="TableContents"/>
-              <w:bidi w:val="0"/>
-              <w:spacing w:before="120" w:after="120"/>
-              <w:jc w:val="left"/>
-              <w:rPr>
-                <w:sz w:val="4"/>
-                <w:szCs w:val="4"/>
-              </w:rPr>
-            </w:pPr>
-            <w:r>
-              <w:rPr>
-                <w:sz w:val="4"/>
-                <w:szCs w:val="4"/>
-              </w:rPr>
-            </w:r>
-          </w:p>
-        </w:tc>
-        <w:tc>
-          <w:tcPr>
-            <w:tcW w:w="4308" w:type="dxa"/>
-            <w:tcBorders/>
-            <w:vAlign w:val="center"/>
-          </w:tcPr>
-          <w:p>
-            <w:pPr>
-              <w:pStyle w:val="TableContents"/>
-              <w:shd w:fill="2E3440" w:val="clear"/>
-              <w:bidi w:val="0"/>
-              <w:spacing w:before="120" w:after="120"/>
-              <w:jc w:val="left"/>
-              <w:rPr/>
-            </w:pPr>
-            <w:r>
-              <w:rPr/>
-              <w:t>Becomes settable in the global file; the stricter layer wins.</w:t>
+            <w:tcW w:w="4417" w:type="dxa"/>
+            <w:tcBorders/>
+            <w:vAlign w:val="center"/>
+          </w:tcPr>
+          <w:p>
+            <w:pPr>
+              <w:pStyle w:val="TableContents"/>
+              <w:shd w:fill="2E3440" w:val="clear"/>
+              <w:bidi w:val="0"/>
+              <w:spacing w:before="120" w:after="120"/>
+              <w:jc w:val="left"/>
+              <w:rPr/>
+            </w:pPr>
+            <w:r>
+              <w:rPr/>
+              <w:t>Becomes settable in the global file, the stricter layer winning, once its reader (</w:t>
+            </w:r>
+            <w:r>
+              <w:rPr>
+                <w:rStyle w:val="SourceText"/>
+              </w:rPr>
+              <w:t>crew_ticket.cli_approval_allowed</w:t>
+            </w:r>
+            <w:r>
+              <w:rPr/>
+              <w:t>) reads the global layer in a harness-only follow-up to T-0050.</w:t>
             </w:r>
           </w:p>
         </w:tc>

</xml_diff>

<commit_message>
batch 7: regenerate rules, config reference, diagrams README, the four changed guides; re-measure BUDGETS
config_reference.py --write (141 keys: 81 global-settable, 60 repo-only),
crew_instructions.py rules, render.sh + diagram_doc.py --write, build.py for
configuration-reference, daily-workflow, guide and troubleshooting. The
crew code map notes that T-0011's ledger-free half now lives in crew_ship.py.

Claude-Session: https://claude.ai/code/session_016wQA2o38aSB65bpjaGpMVJ
</commit_message>
<xml_diff>
--- a/docs/guides/crew/crew-1.0-configuration-reference.docx
+++ b/docs/guides/crew/crew-1.0-configuration-reference.docx
@@ -970,11 +970,11 @@
         <w:rPr>
           <w:rStyle w:val="Strong"/>
         </w:rPr>
-        <w:t>138 keys</w:t>
+        <w:t>141 keys</w:t>
       </w:r>
       <w:r>
         <w:rPr/>
-        <w:t>: 81 settable in the machine-global file, 57 repo-only.</w:t>
+        <w:t>: 81 settable in the machine-global file, 60 repo-only.</w:t>
       </w:r>
     </w:p>
     <w:p>
@@ -25810,12 +25810,12 @@
         </w:tblCellMar>
       </w:tblPr>
       <w:tblGrid>
-        <w:gridCol w:w="3569"/>
-        <w:gridCol w:w="1190"/>
+        <w:gridCol w:w="3663"/>
+        <w:gridCol w:w="1177"/>
         <w:gridCol w:w="1157"/>
-        <w:gridCol w:w="2237"/>
-        <w:gridCol w:w="1278"/>
-        <w:gridCol w:w="3340"/>
+        <w:gridCol w:w="2210"/>
+        <w:gridCol w:w="1268"/>
+        <w:gridCol w:w="3296"/>
       </w:tblGrid>
       <w:tr>
         <w:trPr>
@@ -25823,7 +25823,7 @@
         </w:trPr>
         <w:tc>
           <w:tcPr>
-            <w:tcW w:w="3569" w:type="dxa"/>
+            <w:tcW w:w="3663" w:type="dxa"/>
             <w:tcBorders/>
             <w:vAlign w:val="center"/>
           </w:tcPr>
@@ -25845,7 +25845,7 @@
         </w:tc>
         <w:tc>
           <w:tcPr>
-            <w:tcW w:w="1190" w:type="dxa"/>
+            <w:tcW w:w="1177" w:type="dxa"/>
             <w:tcBorders/>
             <w:vAlign w:val="center"/>
           </w:tcPr>
@@ -25889,7 +25889,7 @@
         </w:tc>
         <w:tc>
           <w:tcPr>
-            <w:tcW w:w="2237" w:type="dxa"/>
+            <w:tcW w:w="2210" w:type="dxa"/>
             <w:tcBorders/>
             <w:vAlign w:val="center"/>
           </w:tcPr>
@@ -25911,7 +25911,7 @@
         </w:tc>
         <w:tc>
           <w:tcPr>
-            <w:tcW w:w="1278" w:type="dxa"/>
+            <w:tcW w:w="1268" w:type="dxa"/>
             <w:tcBorders/>
             <w:vAlign w:val="center"/>
           </w:tcPr>
@@ -25933,7 +25933,7 @@
         </w:tc>
         <w:tc>
           <w:tcPr>
-            <w:tcW w:w="3340" w:type="dxa"/>
+            <w:tcW w:w="3296" w:type="dxa"/>
             <w:tcBorders/>
             <w:vAlign w:val="center"/>
           </w:tcPr>
@@ -25958,7 +25958,7 @@
         <w:trPr/>
         <w:tc>
           <w:tcPr>
-            <w:tcW w:w="3569" w:type="dxa"/>
+            <w:tcW w:w="3663" w:type="dxa"/>
             <w:tcBorders/>
             <w:vAlign w:val="center"/>
           </w:tcPr>
@@ -25981,7 +25981,7 @@
         </w:tc>
         <w:tc>
           <w:tcPr>
-            <w:tcW w:w="1190" w:type="dxa"/>
+            <w:tcW w:w="1177" w:type="dxa"/>
             <w:tcBorders/>
             <w:vAlign w:val="center"/>
           </w:tcPr>
@@ -26025,7 +26025,7 @@
         </w:tc>
         <w:tc>
           <w:tcPr>
-            <w:tcW w:w="2237" w:type="dxa"/>
+            <w:tcW w:w="2210" w:type="dxa"/>
             <w:tcBorders/>
             <w:vAlign w:val="center"/>
           </w:tcPr>
@@ -26072,7 +26072,7 @@
         </w:tc>
         <w:tc>
           <w:tcPr>
-            <w:tcW w:w="1278" w:type="dxa"/>
+            <w:tcW w:w="1268" w:type="dxa"/>
             <w:tcBorders/>
             <w:vAlign w:val="center"/>
           </w:tcPr>
@@ -26093,7 +26093,7 @@
         </w:tc>
         <w:tc>
           <w:tcPr>
-            <w:tcW w:w="3340" w:type="dxa"/>
+            <w:tcW w:w="3296" w:type="dxa"/>
             <w:tcBorders/>
             <w:vAlign w:val="center"/>
           </w:tcPr>
@@ -26137,7 +26137,7 @@
         <w:trPr/>
         <w:tc>
           <w:tcPr>
-            <w:tcW w:w="3569" w:type="dxa"/>
+            <w:tcW w:w="3663" w:type="dxa"/>
             <w:tcBorders/>
             <w:vAlign w:val="center"/>
           </w:tcPr>
@@ -26160,7 +26160,7 @@
         </w:tc>
         <w:tc>
           <w:tcPr>
-            <w:tcW w:w="1190" w:type="dxa"/>
+            <w:tcW w:w="1177" w:type="dxa"/>
             <w:tcBorders/>
             <w:vAlign w:val="center"/>
           </w:tcPr>
@@ -26204,7 +26204,7 @@
         </w:tc>
         <w:tc>
           <w:tcPr>
-            <w:tcW w:w="2237" w:type="dxa"/>
+            <w:tcW w:w="2210" w:type="dxa"/>
             <w:tcBorders/>
             <w:vAlign w:val="center"/>
           </w:tcPr>
@@ -26235,7 +26235,7 @@
         </w:tc>
         <w:tc>
           <w:tcPr>
-            <w:tcW w:w="1278" w:type="dxa"/>
+            <w:tcW w:w="1268" w:type="dxa"/>
             <w:tcBorders/>
             <w:vAlign w:val="center"/>
           </w:tcPr>
@@ -26256,7 +26256,7 @@
         </w:tc>
         <w:tc>
           <w:tcPr>
-            <w:tcW w:w="3340" w:type="dxa"/>
+            <w:tcW w:w="3296" w:type="dxa"/>
             <w:tcBorders/>
             <w:vAlign w:val="center"/>
           </w:tcPr>
@@ -26280,7 +26280,7 @@
         <w:trPr/>
         <w:tc>
           <w:tcPr>
-            <w:tcW w:w="3569" w:type="dxa"/>
+            <w:tcW w:w="3663" w:type="dxa"/>
             <w:tcBorders/>
             <w:vAlign w:val="center"/>
           </w:tcPr>
@@ -26303,7 +26303,7 @@
         </w:tc>
         <w:tc>
           <w:tcPr>
-            <w:tcW w:w="1190" w:type="dxa"/>
+            <w:tcW w:w="1177" w:type="dxa"/>
             <w:tcBorders/>
             <w:vAlign w:val="center"/>
           </w:tcPr>
@@ -26347,7 +26347,7 @@
         </w:tc>
         <w:tc>
           <w:tcPr>
-            <w:tcW w:w="2237" w:type="dxa"/>
+            <w:tcW w:w="2210" w:type="dxa"/>
             <w:tcBorders/>
             <w:vAlign w:val="center"/>
           </w:tcPr>
@@ -26394,7 +26394,7 @@
         </w:tc>
         <w:tc>
           <w:tcPr>
-            <w:tcW w:w="1278" w:type="dxa"/>
+            <w:tcW w:w="1268" w:type="dxa"/>
             <w:tcBorders/>
             <w:vAlign w:val="center"/>
           </w:tcPr>
@@ -26415,7 +26415,7 @@
         </w:tc>
         <w:tc>
           <w:tcPr>
-            <w:tcW w:w="3340" w:type="dxa"/>
+            <w:tcW w:w="3296" w:type="dxa"/>
             <w:tcBorders/>
             <w:vAlign w:val="center"/>
           </w:tcPr>
@@ -26449,7 +26449,7 @@
         <w:trPr/>
         <w:tc>
           <w:tcPr>
-            <w:tcW w:w="3569" w:type="dxa"/>
+            <w:tcW w:w="3663" w:type="dxa"/>
             <w:tcBorders/>
             <w:vAlign w:val="center"/>
           </w:tcPr>
@@ -26472,7 +26472,7 @@
         </w:tc>
         <w:tc>
           <w:tcPr>
-            <w:tcW w:w="1190" w:type="dxa"/>
+            <w:tcW w:w="1177" w:type="dxa"/>
             <w:tcBorders/>
             <w:vAlign w:val="center"/>
           </w:tcPr>
@@ -26516,7 +26516,7 @@
         </w:tc>
         <w:tc>
           <w:tcPr>
-            <w:tcW w:w="2237" w:type="dxa"/>
+            <w:tcW w:w="2210" w:type="dxa"/>
             <w:tcBorders/>
             <w:vAlign w:val="center"/>
           </w:tcPr>
@@ -26563,7 +26563,7 @@
         </w:tc>
         <w:tc>
           <w:tcPr>
-            <w:tcW w:w="1278" w:type="dxa"/>
+            <w:tcW w:w="1268" w:type="dxa"/>
             <w:tcBorders/>
             <w:vAlign w:val="center"/>
           </w:tcPr>
@@ -26584,7 +26584,7 @@
         </w:tc>
         <w:tc>
           <w:tcPr>
-            <w:tcW w:w="3340" w:type="dxa"/>
+            <w:tcW w:w="3296" w:type="dxa"/>
             <w:tcBorders/>
             <w:vAlign w:val="center"/>
           </w:tcPr>
@@ -26618,7 +26618,7 @@
         <w:trPr/>
         <w:tc>
           <w:tcPr>
-            <w:tcW w:w="3569" w:type="dxa"/>
+            <w:tcW w:w="3663" w:type="dxa"/>
             <w:tcBorders/>
             <w:vAlign w:val="center"/>
           </w:tcPr>
@@ -26641,7 +26641,7 @@
         </w:tc>
         <w:tc>
           <w:tcPr>
-            <w:tcW w:w="1190" w:type="dxa"/>
+            <w:tcW w:w="1177" w:type="dxa"/>
             <w:tcBorders/>
             <w:vAlign w:val="center"/>
           </w:tcPr>
@@ -26685,7 +26685,7 @@
         </w:tc>
         <w:tc>
           <w:tcPr>
-            <w:tcW w:w="2237" w:type="dxa"/>
+            <w:tcW w:w="2210" w:type="dxa"/>
             <w:tcBorders/>
             <w:vAlign w:val="center"/>
           </w:tcPr>
@@ -26732,7 +26732,7 @@
         </w:tc>
         <w:tc>
           <w:tcPr>
-            <w:tcW w:w="1278" w:type="dxa"/>
+            <w:tcW w:w="1268" w:type="dxa"/>
             <w:tcBorders/>
             <w:vAlign w:val="center"/>
           </w:tcPr>
@@ -26753,7 +26753,7 @@
         </w:tc>
         <w:tc>
           <w:tcPr>
-            <w:tcW w:w="3340" w:type="dxa"/>
+            <w:tcW w:w="3296" w:type="dxa"/>
             <w:tcBorders/>
             <w:vAlign w:val="center"/>
           </w:tcPr>
@@ -26787,7 +26787,7 @@
         <w:trPr/>
         <w:tc>
           <w:tcPr>
-            <w:tcW w:w="3569" w:type="dxa"/>
+            <w:tcW w:w="3663" w:type="dxa"/>
             <w:tcBorders/>
             <w:vAlign w:val="center"/>
           </w:tcPr>
@@ -26810,7 +26810,7 @@
         </w:tc>
         <w:tc>
           <w:tcPr>
-            <w:tcW w:w="1190" w:type="dxa"/>
+            <w:tcW w:w="1177" w:type="dxa"/>
             <w:tcBorders/>
             <w:vAlign w:val="center"/>
           </w:tcPr>
@@ -26854,7 +26854,7 @@
         </w:tc>
         <w:tc>
           <w:tcPr>
-            <w:tcW w:w="2237" w:type="dxa"/>
+            <w:tcW w:w="2210" w:type="dxa"/>
             <w:tcBorders/>
             <w:vAlign w:val="center"/>
           </w:tcPr>
@@ -26885,7 +26885,7 @@
         </w:tc>
         <w:tc>
           <w:tcPr>
-            <w:tcW w:w="1278" w:type="dxa"/>
+            <w:tcW w:w="1268" w:type="dxa"/>
             <w:tcBorders/>
             <w:vAlign w:val="center"/>
           </w:tcPr>
@@ -26906,7 +26906,7 @@
         </w:tc>
         <w:tc>
           <w:tcPr>
-            <w:tcW w:w="3340" w:type="dxa"/>
+            <w:tcW w:w="3296" w:type="dxa"/>
             <w:tcBorders/>
             <w:vAlign w:val="center"/>
           </w:tcPr>
@@ -26930,7 +26930,7 @@
         <w:trPr/>
         <w:tc>
           <w:tcPr>
-            <w:tcW w:w="3569" w:type="dxa"/>
+            <w:tcW w:w="3663" w:type="dxa"/>
             <w:tcBorders/>
             <w:vAlign w:val="center"/>
           </w:tcPr>
@@ -26953,7 +26953,7 @@
         </w:tc>
         <w:tc>
           <w:tcPr>
-            <w:tcW w:w="1190" w:type="dxa"/>
+            <w:tcW w:w="1177" w:type="dxa"/>
             <w:tcBorders/>
             <w:vAlign w:val="center"/>
           </w:tcPr>
@@ -26997,7 +26997,7 @@
         </w:tc>
         <w:tc>
           <w:tcPr>
-            <w:tcW w:w="2237" w:type="dxa"/>
+            <w:tcW w:w="2210" w:type="dxa"/>
             <w:tcBorders/>
             <w:vAlign w:val="center"/>
           </w:tcPr>
@@ -27028,7 +27028,7 @@
         </w:tc>
         <w:tc>
           <w:tcPr>
-            <w:tcW w:w="1278" w:type="dxa"/>
+            <w:tcW w:w="1268" w:type="dxa"/>
             <w:tcBorders/>
             <w:vAlign w:val="center"/>
           </w:tcPr>
@@ -27049,7 +27049,7 @@
         </w:tc>
         <w:tc>
           <w:tcPr>
-            <w:tcW w:w="3340" w:type="dxa"/>
+            <w:tcW w:w="3296" w:type="dxa"/>
             <w:tcBorders/>
             <w:vAlign w:val="center"/>
           </w:tcPr>
@@ -27083,7 +27083,7 @@
         <w:trPr/>
         <w:tc>
           <w:tcPr>
-            <w:tcW w:w="3569" w:type="dxa"/>
+            <w:tcW w:w="3663" w:type="dxa"/>
             <w:tcBorders/>
             <w:vAlign w:val="center"/>
           </w:tcPr>
@@ -27106,7 +27106,7 @@
         </w:tc>
         <w:tc>
           <w:tcPr>
-            <w:tcW w:w="1190" w:type="dxa"/>
+            <w:tcW w:w="1177" w:type="dxa"/>
             <w:tcBorders/>
             <w:vAlign w:val="center"/>
           </w:tcPr>
@@ -27150,7 +27150,7 @@
         </w:tc>
         <w:tc>
           <w:tcPr>
-            <w:tcW w:w="2237" w:type="dxa"/>
+            <w:tcW w:w="2210" w:type="dxa"/>
             <w:tcBorders/>
             <w:vAlign w:val="center"/>
           </w:tcPr>
@@ -27217,7 +27217,7 @@
         </w:tc>
         <w:tc>
           <w:tcPr>
-            <w:tcW w:w="1278" w:type="dxa"/>
+            <w:tcW w:w="1268" w:type="dxa"/>
             <w:tcBorders/>
             <w:vAlign w:val="center"/>
           </w:tcPr>
@@ -27238,7 +27238,7 @@
         </w:tc>
         <w:tc>
           <w:tcPr>
-            <w:tcW w:w="3340" w:type="dxa"/>
+            <w:tcW w:w="3296" w:type="dxa"/>
             <w:tcBorders/>
             <w:vAlign w:val="center"/>
           </w:tcPr>
@@ -27268,7 +27268,7 @@
         <w:trPr/>
         <w:tc>
           <w:tcPr>
-            <w:tcW w:w="3569" w:type="dxa"/>
+            <w:tcW w:w="3663" w:type="dxa"/>
             <w:tcBorders/>
             <w:vAlign w:val="center"/>
           </w:tcPr>
@@ -27291,7 +27291,7 @@
         </w:tc>
         <w:tc>
           <w:tcPr>
-            <w:tcW w:w="1190" w:type="dxa"/>
+            <w:tcW w:w="1177" w:type="dxa"/>
             <w:tcBorders/>
             <w:vAlign w:val="center"/>
           </w:tcPr>
@@ -27335,7 +27335,7 @@
         </w:tc>
         <w:tc>
           <w:tcPr>
-            <w:tcW w:w="2237" w:type="dxa"/>
+            <w:tcW w:w="2210" w:type="dxa"/>
             <w:tcBorders/>
             <w:vAlign w:val="center"/>
           </w:tcPr>
@@ -27402,7 +27402,7 @@
         </w:tc>
         <w:tc>
           <w:tcPr>
-            <w:tcW w:w="1278" w:type="dxa"/>
+            <w:tcW w:w="1268" w:type="dxa"/>
             <w:tcBorders/>
             <w:vAlign w:val="center"/>
           </w:tcPr>
@@ -27423,7 +27423,7 @@
         </w:tc>
         <w:tc>
           <w:tcPr>
-            <w:tcW w:w="3340" w:type="dxa"/>
+            <w:tcW w:w="3296" w:type="dxa"/>
             <w:tcBorders/>
             <w:vAlign w:val="center"/>
           </w:tcPr>
@@ -27445,6 +27445,507 @@
             <w:r>
               <w:rPr/>
               <w:t xml:space="preserve"> inside the sleep window; null keeps the day value; anything else counts as human, the strictest, with a warning.</w:t>
+            </w:r>
+          </w:p>
+        </w:tc>
+      </w:tr>
+      <w:tr>
+        <w:trPr/>
+        <w:tc>
+          <w:tcPr>
+            <w:tcW w:w="3663" w:type="dxa"/>
+            <w:tcBorders/>
+            <w:vAlign w:val="center"/>
+          </w:tcPr>
+          <w:p>
+            <w:pPr>
+              <w:pStyle w:val="TableContents"/>
+              <w:shd w:fill="2E3440" w:val="clear"/>
+              <w:bidi w:val="0"/>
+              <w:spacing w:before="120" w:after="120"/>
+              <w:jc w:val="left"/>
+              <w:rPr/>
+            </w:pPr>
+            <w:r>
+              <w:rPr>
+                <w:rStyle w:val="SourceText"/>
+              </w:rPr>
+              <w:t>autopilot.ship</w:t>
+            </w:r>
+          </w:p>
+        </w:tc>
+        <w:tc>
+          <w:tcPr>
+            <w:tcW w:w="1177" w:type="dxa"/>
+            <w:tcBorders/>
+            <w:vAlign w:val="center"/>
+          </w:tcPr>
+          <w:p>
+            <w:pPr>
+              <w:pStyle w:val="TableContents"/>
+              <w:shd w:fill="2E3440" w:val="clear"/>
+              <w:bidi w:val="0"/>
+              <w:spacing w:before="120" w:after="120"/>
+              <w:jc w:val="left"/>
+              <w:rPr/>
+            </w:pPr>
+            <w:r>
+              <w:rPr/>
+              <w:t>repo</w:t>
+            </w:r>
+          </w:p>
+        </w:tc>
+        <w:tc>
+          <w:tcPr>
+            <w:tcW w:w="1157" w:type="dxa"/>
+            <w:tcBorders/>
+            <w:vAlign w:val="center"/>
+          </w:tcPr>
+          <w:p>
+            <w:pPr>
+              <w:pStyle w:val="TableContents"/>
+              <w:shd w:fill="2E3440" w:val="clear"/>
+              <w:bidi w:val="0"/>
+              <w:spacing w:before="120" w:after="120"/>
+              <w:jc w:val="left"/>
+              <w:rPr/>
+            </w:pPr>
+            <w:r>
+              <w:rPr>
+                <w:rStyle w:val="SourceText"/>
+              </w:rPr>
+              <w:t>"merge"</w:t>
+            </w:r>
+          </w:p>
+        </w:tc>
+        <w:tc>
+          <w:tcPr>
+            <w:tcW w:w="2210" w:type="dxa"/>
+            <w:tcBorders/>
+            <w:vAlign w:val="center"/>
+          </w:tcPr>
+          <w:p>
+            <w:pPr>
+              <w:pStyle w:val="TableContents"/>
+              <w:shd w:fill="2E3440" w:val="clear"/>
+              <w:bidi w:val="0"/>
+              <w:spacing w:before="120" w:after="120"/>
+              <w:jc w:val="left"/>
+              <w:rPr/>
+            </w:pPr>
+            <w:r>
+              <w:rPr>
+                <w:rStyle w:val="SourceText"/>
+              </w:rPr>
+              <w:t>pr</w:t>
+            </w:r>
+            <w:r>
+              <w:rPr/>
+              <w:t xml:space="preserve"> | </w:t>
+            </w:r>
+            <w:r>
+              <w:rPr>
+                <w:rStyle w:val="SourceText"/>
+              </w:rPr>
+              <w:t>merge</w:t>
+            </w:r>
+          </w:p>
+        </w:tc>
+        <w:tc>
+          <w:tcPr>
+            <w:tcW w:w="1268" w:type="dxa"/>
+            <w:tcBorders/>
+            <w:vAlign w:val="center"/>
+          </w:tcPr>
+          <w:p>
+            <w:pPr>
+              <w:pStyle w:val="TableContents"/>
+              <w:shd w:fill="2E3440" w:val="clear"/>
+              <w:bidi w:val="0"/>
+              <w:spacing w:before="120" w:after="120"/>
+              <w:jc w:val="left"/>
+              <w:rPr/>
+            </w:pPr>
+            <w:r>
+              <w:rPr/>
+              <w:t>1.0.348</w:t>
+            </w:r>
+          </w:p>
+        </w:tc>
+        <w:tc>
+          <w:tcPr>
+            <w:tcW w:w="3296" w:type="dxa"/>
+            <w:tcBorders/>
+            <w:vAlign w:val="center"/>
+          </w:tcPr>
+          <w:p>
+            <w:pPr>
+              <w:pStyle w:val="TableContents"/>
+              <w:shd w:fill="2E3440" w:val="clear"/>
+              <w:bidi w:val="0"/>
+              <w:spacing w:before="120" w:after="120"/>
+              <w:jc w:val="left"/>
+              <w:rPr/>
+            </w:pPr>
+            <w:r>
+              <w:rPr/>
+              <w:t xml:space="preserve">After </w:t>
+            </w:r>
+            <w:r>
+              <w:rPr>
+                <w:rStyle w:val="SourceText"/>
+              </w:rPr>
+              <w:t>/crew:done</w:t>
+            </w:r>
+            <w:r>
+              <w:rPr/>
+              <w:t xml:space="preserve">: </w:t>
+            </w:r>
+            <w:r>
+              <w:rPr>
+                <w:rStyle w:val="SourceText"/>
+              </w:rPr>
+              <w:t>pr</w:t>
+            </w:r>
+            <w:r>
+              <w:rPr/>
+              <w:t xml:space="preserve"> pushes and opens the PR; </w:t>
+            </w:r>
+            <w:r>
+              <w:rPr>
+                <w:rStyle w:val="SourceText"/>
+              </w:rPr>
+              <w:t>merge</w:t>
+            </w:r>
+            <w:r>
+              <w:rPr/>
+              <w:t xml:space="preserve"> also merges it (a merge commit) once the required checks allow. Anything else reads as </w:t>
+            </w:r>
+            <w:r>
+              <w:rPr>
+                <w:rStyle w:val="SourceText"/>
+              </w:rPr>
+              <w:t>pr</w:t>
+            </w:r>
+            <w:r>
+              <w:rPr/>
+              <w:t>, with a warning.</w:t>
+            </w:r>
+          </w:p>
+        </w:tc>
+      </w:tr>
+      <w:tr>
+        <w:trPr/>
+        <w:tc>
+          <w:tcPr>
+            <w:tcW w:w="3663" w:type="dxa"/>
+            <w:tcBorders/>
+            <w:vAlign w:val="center"/>
+          </w:tcPr>
+          <w:p>
+            <w:pPr>
+              <w:pStyle w:val="TableContents"/>
+              <w:shd w:fill="2E3440" w:val="clear"/>
+              <w:bidi w:val="0"/>
+              <w:spacing w:before="120" w:after="120"/>
+              <w:jc w:val="left"/>
+              <w:rPr/>
+            </w:pPr>
+            <w:r>
+              <w:rPr>
+                <w:rStyle w:val="SourceText"/>
+              </w:rPr>
+              <w:t>autopilot.knownFailures</w:t>
+            </w:r>
+          </w:p>
+        </w:tc>
+        <w:tc>
+          <w:tcPr>
+            <w:tcW w:w="1177" w:type="dxa"/>
+            <w:tcBorders/>
+            <w:vAlign w:val="center"/>
+          </w:tcPr>
+          <w:p>
+            <w:pPr>
+              <w:pStyle w:val="TableContents"/>
+              <w:shd w:fill="2E3440" w:val="clear"/>
+              <w:bidi w:val="0"/>
+              <w:spacing w:before="120" w:after="120"/>
+              <w:jc w:val="left"/>
+              <w:rPr/>
+            </w:pPr>
+            <w:r>
+              <w:rPr/>
+              <w:t>repo</w:t>
+            </w:r>
+          </w:p>
+        </w:tc>
+        <w:tc>
+          <w:tcPr>
+            <w:tcW w:w="1157" w:type="dxa"/>
+            <w:tcBorders/>
+            <w:vAlign w:val="center"/>
+          </w:tcPr>
+          <w:p>
+            <w:pPr>
+              <w:pStyle w:val="TableContents"/>
+              <w:shd w:fill="2E3440" w:val="clear"/>
+              <w:bidi w:val="0"/>
+              <w:spacing w:before="120" w:after="120"/>
+              <w:jc w:val="left"/>
+              <w:rPr/>
+            </w:pPr>
+            <w:r>
+              <w:rPr>
+                <w:rStyle w:val="SourceText"/>
+              </w:rPr>
+              <w:t>[]</w:t>
+            </w:r>
+          </w:p>
+        </w:tc>
+        <w:tc>
+          <w:tcPr>
+            <w:tcW w:w="2210" w:type="dxa"/>
+            <w:tcBorders/>
+            <w:vAlign w:val="center"/>
+          </w:tcPr>
+          <w:p>
+            <w:pPr>
+              <w:pStyle w:val="TableContents"/>
+              <w:shd w:fill="2E3440" w:val="clear"/>
+              <w:bidi w:val="0"/>
+              <w:spacing w:before="120" w:after="120"/>
+              <w:jc w:val="left"/>
+              <w:rPr/>
+            </w:pPr>
+            <w:r>
+              <w:rPr/>
+              <w:t xml:space="preserve">list of check names (checked in </w:t>
+            </w:r>
+            <w:r>
+              <w:rPr>
+                <w:rStyle w:val="SourceText"/>
+              </w:rPr>
+              <w:t>plugin/crew/hooks/scripts/crew_autopilot.py</w:t>
+            </w:r>
+            <w:r>
+              <w:rPr/>
+              <w:t>)</w:t>
+            </w:r>
+          </w:p>
+        </w:tc>
+        <w:tc>
+          <w:tcPr>
+            <w:tcW w:w="1268" w:type="dxa"/>
+            <w:tcBorders/>
+            <w:vAlign w:val="center"/>
+          </w:tcPr>
+          <w:p>
+            <w:pPr>
+              <w:pStyle w:val="TableContents"/>
+              <w:shd w:fill="2E3440" w:val="clear"/>
+              <w:bidi w:val="0"/>
+              <w:spacing w:before="120" w:after="120"/>
+              <w:jc w:val="left"/>
+              <w:rPr/>
+            </w:pPr>
+            <w:r>
+              <w:rPr/>
+              <w:t>1.0.348</w:t>
+            </w:r>
+          </w:p>
+        </w:tc>
+        <w:tc>
+          <w:tcPr>
+            <w:tcW w:w="3296" w:type="dxa"/>
+            <w:tcBorders/>
+            <w:vAlign w:val="center"/>
+          </w:tcPr>
+          <w:p>
+            <w:pPr>
+              <w:pStyle w:val="TableContents"/>
+              <w:shd w:fill="2E3440" w:val="clear"/>
+              <w:bidi w:val="0"/>
+              <w:spacing w:before="120" w:after="120"/>
+              <w:jc w:val="left"/>
+              <w:rPr/>
+            </w:pPr>
+            <w:r>
+              <w:rPr/>
+              <w:t xml:space="preserve">Required checks whose </w:t>
+            </w:r>
+            <w:r>
+              <w:rPr>
+                <w:rStyle w:val="SourceText"/>
+              </w:rPr>
+              <w:t>fail</w:t>
+            </w:r>
+            <w:r>
+              <w:rPr/>
+              <w:t xml:space="preserve"> does not block a merge, matched by exact name; anything but a list of strings reads as </w:t>
+            </w:r>
+            <w:r>
+              <w:rPr>
+                <w:rStyle w:val="SourceText"/>
+              </w:rPr>
+              <w:t>[]</w:t>
+            </w:r>
+            <w:r>
+              <w:rPr/>
+              <w:t>, with a warning.</w:t>
+            </w:r>
+          </w:p>
+        </w:tc>
+      </w:tr>
+      <w:tr>
+        <w:trPr/>
+        <w:tc>
+          <w:tcPr>
+            <w:tcW w:w="3663" w:type="dxa"/>
+            <w:tcBorders/>
+            <w:vAlign w:val="center"/>
+          </w:tcPr>
+          <w:p>
+            <w:pPr>
+              <w:pStyle w:val="TableContents"/>
+              <w:shd w:fill="2E3440" w:val="clear"/>
+              <w:bidi w:val="0"/>
+              <w:spacing w:before="120" w:after="120"/>
+              <w:jc w:val="left"/>
+              <w:rPr/>
+            </w:pPr>
+            <w:r>
+              <w:rPr>
+                <w:rStyle w:val="SourceText"/>
+              </w:rPr>
+              <w:t>autopilot.ciTimeoutMinutes</w:t>
+            </w:r>
+          </w:p>
+        </w:tc>
+        <w:tc>
+          <w:tcPr>
+            <w:tcW w:w="1177" w:type="dxa"/>
+            <w:tcBorders/>
+            <w:vAlign w:val="center"/>
+          </w:tcPr>
+          <w:p>
+            <w:pPr>
+              <w:pStyle w:val="TableContents"/>
+              <w:shd w:fill="2E3440" w:val="clear"/>
+              <w:bidi w:val="0"/>
+              <w:spacing w:before="120" w:after="120"/>
+              <w:jc w:val="left"/>
+              <w:rPr/>
+            </w:pPr>
+            <w:r>
+              <w:rPr/>
+              <w:t>repo</w:t>
+            </w:r>
+          </w:p>
+        </w:tc>
+        <w:tc>
+          <w:tcPr>
+            <w:tcW w:w="1157" w:type="dxa"/>
+            <w:tcBorders/>
+            <w:vAlign w:val="center"/>
+          </w:tcPr>
+          <w:p>
+            <w:pPr>
+              <w:pStyle w:val="TableContents"/>
+              <w:shd w:fill="2E3440" w:val="clear"/>
+              <w:bidi w:val="0"/>
+              <w:spacing w:before="120" w:after="120"/>
+              <w:jc w:val="left"/>
+              <w:rPr/>
+            </w:pPr>
+            <w:r>
+              <w:rPr>
+                <w:rStyle w:val="SourceText"/>
+              </w:rPr>
+              <w:t>60</w:t>
+            </w:r>
+          </w:p>
+        </w:tc>
+        <w:tc>
+          <w:tcPr>
+            <w:tcW w:w="2210" w:type="dxa"/>
+            <w:tcBorders/>
+            <w:vAlign w:val="center"/>
+          </w:tcPr>
+          <w:p>
+            <w:pPr>
+              <w:pStyle w:val="TableContents"/>
+              <w:shd w:fill="2E3440" w:val="clear"/>
+              <w:bidi w:val="0"/>
+              <w:spacing w:before="120" w:after="120"/>
+              <w:jc w:val="left"/>
+              <w:rPr/>
+            </w:pPr>
+            <w:r>
+              <w:rPr/>
+              <w:t xml:space="preserve">positive integer (checked in </w:t>
+            </w:r>
+            <w:r>
+              <w:rPr>
+                <w:rStyle w:val="SourceText"/>
+              </w:rPr>
+              <w:t>plugin/crew/hooks/scripts/crew_autopilot.py</w:t>
+            </w:r>
+            <w:r>
+              <w:rPr/>
+              <w:t>)</w:t>
+            </w:r>
+          </w:p>
+        </w:tc>
+        <w:tc>
+          <w:tcPr>
+            <w:tcW w:w="1268" w:type="dxa"/>
+            <w:tcBorders/>
+            <w:vAlign w:val="center"/>
+          </w:tcPr>
+          <w:p>
+            <w:pPr>
+              <w:pStyle w:val="TableContents"/>
+              <w:shd w:fill="2E3440" w:val="clear"/>
+              <w:bidi w:val="0"/>
+              <w:spacing w:before="120" w:after="120"/>
+              <w:jc w:val="left"/>
+              <w:rPr/>
+            </w:pPr>
+            <w:r>
+              <w:rPr/>
+              <w:t>1.0.348</w:t>
+            </w:r>
+          </w:p>
+        </w:tc>
+        <w:tc>
+          <w:tcPr>
+            <w:tcW w:w="3296" w:type="dxa"/>
+            <w:tcBorders/>
+            <w:vAlign w:val="center"/>
+          </w:tcPr>
+          <w:p>
+            <w:pPr>
+              <w:pStyle w:val="TableContents"/>
+              <w:shd w:fill="2E3440" w:val="clear"/>
+              <w:bidi w:val="0"/>
+              <w:spacing w:before="120" w:after="120"/>
+              <w:jc w:val="left"/>
+              <w:rPr/>
+            </w:pPr>
+            <w:r>
+              <w:rPr/>
+              <w:t xml:space="preserve">Minutes </w:t>
+            </w:r>
+            <w:r>
+              <w:rPr>
+                <w:rStyle w:val="SourceText"/>
+              </w:rPr>
+              <w:t>ship</w:t>
+            </w:r>
+            <w:r>
+              <w:rPr/>
+              <w:t xml:space="preserve"> waits for the required checks; still pending, or green only after it, stops. Anything but a positive integer reads as 60, with a warning.</w:t>
             </w:r>
           </w:p>
         </w:tc>
@@ -28613,625 +29114,8 @@
         <w:jc w:val="left"/>
         <w:rPr/>
       </w:pPr>
-      <w:bookmarkStart w:id="40" w:name="t-0011"/>
+      <w:bookmarkStart w:id="40" w:name="t-0012"/>
       <w:bookmarkEnd w:id="40"/>
-      <w:r>
-        <w:rPr/>
-        <w:t>T-0011</w:t>
-      </w:r>
-    </w:p>
-    <w:tbl>
-      <w:tblPr>
-        <w:tblW w:w="12771" w:type="dxa"/>
-        <w:jc w:val="left"/>
-        <w:tblInd w:w="0" w:type="dxa"/>
-        <w:tblLayout w:type="fixed"/>
-        <w:tblCellMar>
-          <w:top w:w="28" w:type="dxa"/>
-          <w:left w:w="28" w:type="dxa"/>
-          <w:bottom w:w="28" w:type="dxa"/>
-          <w:right w:w="28" w:type="dxa"/>
-        </w:tblCellMar>
-      </w:tblPr>
-      <w:tblGrid>
-        <w:gridCol w:w="3653"/>
-        <w:gridCol w:w="1231"/>
-        <w:gridCol w:w="1368"/>
-        <w:gridCol w:w="1157"/>
-        <w:gridCol w:w="1154"/>
-        <w:gridCol w:w="4208"/>
-      </w:tblGrid>
-      <w:tr>
-        <w:trPr>
-          <w:tblHeader w:val="true"/>
-        </w:trPr>
-        <w:tc>
-          <w:tcPr>
-            <w:tcW w:w="3653" w:type="dxa"/>
-            <w:tcBorders/>
-            <w:vAlign w:val="center"/>
-          </w:tcPr>
-          <w:p>
-            <w:pPr>
-              <w:pStyle w:val="TableHeading"/>
-              <w:suppressLineNumbers/>
-              <w:shd w:fill="434C5E" w:val="clear"/>
-              <w:bidi w:val="0"/>
-              <w:spacing w:before="120" w:after="120"/>
-              <w:jc w:val="left"/>
-              <w:rPr/>
-            </w:pPr>
-            <w:r>
-              <w:rPr/>
-              <w:t>Setting</w:t>
-            </w:r>
-          </w:p>
-        </w:tc>
-        <w:tc>
-          <w:tcPr>
-            <w:tcW w:w="1231" w:type="dxa"/>
-            <w:tcBorders/>
-            <w:vAlign w:val="center"/>
-          </w:tcPr>
-          <w:p>
-            <w:pPr>
-              <w:pStyle w:val="TableHeading"/>
-              <w:suppressLineNumbers/>
-              <w:shd w:fill="434C5E" w:val="clear"/>
-              <w:bidi w:val="0"/>
-              <w:spacing w:before="120" w:after="120"/>
-              <w:jc w:val="left"/>
-              <w:rPr/>
-            </w:pPr>
-            <w:r>
-              <w:rPr/>
-              <w:t>Change</w:t>
-            </w:r>
-          </w:p>
-        </w:tc>
-        <w:tc>
-          <w:tcPr>
-            <w:tcW w:w="1368" w:type="dxa"/>
-            <w:tcBorders/>
-            <w:vAlign w:val="center"/>
-          </w:tcPr>
-          <w:p>
-            <w:pPr>
-              <w:pStyle w:val="TableHeading"/>
-              <w:suppressLineNumbers/>
-              <w:shd w:fill="434C5E" w:val="clear"/>
-              <w:bidi w:val="0"/>
-              <w:spacing w:before="120" w:after="120"/>
-              <w:jc w:val="left"/>
-              <w:rPr/>
-            </w:pPr>
-            <w:r>
-              <w:rPr/>
-              <w:t>Layer</w:t>
-            </w:r>
-          </w:p>
-        </w:tc>
-        <w:tc>
-          <w:tcPr>
-            <w:tcW w:w="1157" w:type="dxa"/>
-            <w:tcBorders/>
-            <w:vAlign w:val="center"/>
-          </w:tcPr>
-          <w:p>
-            <w:pPr>
-              <w:pStyle w:val="TableHeading"/>
-              <w:suppressLineNumbers/>
-              <w:shd w:fill="434C5E" w:val="clear"/>
-              <w:bidi w:val="0"/>
-              <w:spacing w:before="120" w:after="120"/>
-              <w:jc w:val="left"/>
-              <w:rPr/>
-            </w:pPr>
-            <w:r>
-              <w:rPr/>
-              <w:t>Default</w:t>
-            </w:r>
-          </w:p>
-        </w:tc>
-        <w:tc>
-          <w:tcPr>
-            <w:tcW w:w="1154" w:type="dxa"/>
-            <w:tcBorders/>
-            <w:vAlign w:val="center"/>
-          </w:tcPr>
-          <w:p>
-            <w:pPr>
-              <w:pStyle w:val="TableHeading"/>
-              <w:suppressLineNumbers/>
-              <w:shd w:fill="434C5E" w:val="clear"/>
-              <w:bidi w:val="0"/>
-              <w:spacing w:before="120" w:after="120"/>
-              <w:jc w:val="left"/>
-              <w:rPr/>
-            </w:pPr>
-            <w:r>
-              <w:rPr/>
-              <w:t>Values</w:t>
-            </w:r>
-          </w:p>
-        </w:tc>
-        <w:tc>
-          <w:tcPr>
-            <w:tcW w:w="4208" w:type="dxa"/>
-            <w:tcBorders/>
-            <w:vAlign w:val="center"/>
-          </w:tcPr>
-          <w:p>
-            <w:pPr>
-              <w:pStyle w:val="TableHeading"/>
-              <w:suppressLineNumbers/>
-              <w:shd w:fill="434C5E" w:val="clear"/>
-              <w:bidi w:val="0"/>
-              <w:spacing w:before="120" w:after="120"/>
-              <w:jc w:val="left"/>
-              <w:rPr/>
-            </w:pPr>
-            <w:r>
-              <w:rPr/>
-              <w:t>Summary</w:t>
-            </w:r>
-          </w:p>
-        </w:tc>
-      </w:tr>
-      <w:tr>
-        <w:trPr/>
-        <w:tc>
-          <w:tcPr>
-            <w:tcW w:w="3653" w:type="dxa"/>
-            <w:tcBorders/>
-            <w:vAlign w:val="center"/>
-          </w:tcPr>
-          <w:p>
-            <w:pPr>
-              <w:pStyle w:val="TableContents"/>
-              <w:shd w:fill="2E3440" w:val="clear"/>
-              <w:bidi w:val="0"/>
-              <w:spacing w:before="120" w:after="120"/>
-              <w:jc w:val="left"/>
-              <w:rPr/>
-            </w:pPr>
-            <w:r>
-              <w:rPr>
-                <w:rStyle w:val="SourceText"/>
-              </w:rPr>
-              <w:t>autopilot.ship</w:t>
-            </w:r>
-          </w:p>
-        </w:tc>
-        <w:tc>
-          <w:tcPr>
-            <w:tcW w:w="1231" w:type="dxa"/>
-            <w:tcBorders/>
-            <w:vAlign w:val="center"/>
-          </w:tcPr>
-          <w:p>
-            <w:pPr>
-              <w:pStyle w:val="TableContents"/>
-              <w:shd w:fill="2E3440" w:val="clear"/>
-              <w:bidi w:val="0"/>
-              <w:spacing w:before="120" w:after="120"/>
-              <w:jc w:val="left"/>
-              <w:rPr/>
-            </w:pPr>
-            <w:r>
-              <w:rPr/>
-              <w:t>new key</w:t>
-            </w:r>
-          </w:p>
-        </w:tc>
-        <w:tc>
-          <w:tcPr>
-            <w:tcW w:w="1368" w:type="dxa"/>
-            <w:tcBorders/>
-            <w:vAlign w:val="center"/>
-          </w:tcPr>
-          <w:p>
-            <w:pPr>
-              <w:pStyle w:val="TableContents"/>
-              <w:shd w:fill="2E3440" w:val="clear"/>
-              <w:bidi w:val="0"/>
-              <w:spacing w:before="120" w:after="120"/>
-              <w:jc w:val="left"/>
-              <w:rPr/>
-            </w:pPr>
-            <w:r>
-              <w:rPr/>
-              <w:t>repo</w:t>
-            </w:r>
-          </w:p>
-        </w:tc>
-        <w:tc>
-          <w:tcPr>
-            <w:tcW w:w="1157" w:type="dxa"/>
-            <w:tcBorders/>
-            <w:vAlign w:val="center"/>
-          </w:tcPr>
-          <w:p>
-            <w:pPr>
-              <w:pStyle w:val="TableContents"/>
-              <w:shd w:fill="2E3440" w:val="clear"/>
-              <w:bidi w:val="0"/>
-              <w:spacing w:before="120" w:after="120"/>
-              <w:jc w:val="left"/>
-              <w:rPr/>
-            </w:pPr>
-            <w:r>
-              <w:rPr/>
-              <w:t>merge</w:t>
-            </w:r>
-          </w:p>
-        </w:tc>
-        <w:tc>
-          <w:tcPr>
-            <w:tcW w:w="1154" w:type="dxa"/>
-            <w:tcBorders/>
-            <w:vAlign w:val="center"/>
-          </w:tcPr>
-          <w:p>
-            <w:pPr>
-              <w:pStyle w:val="TableContents"/>
-              <w:shd w:fill="2E3440" w:val="clear"/>
-              <w:bidi w:val="0"/>
-              <w:spacing w:before="120" w:after="120"/>
-              <w:jc w:val="left"/>
-              <w:rPr/>
-            </w:pPr>
-            <w:r>
-              <w:rPr>
-                <w:rStyle w:val="SourceText"/>
-              </w:rPr>
-              <w:t>pr</w:t>
-            </w:r>
-            <w:r>
-              <w:rPr/>
-              <w:t xml:space="preserve"> | </w:t>
-            </w:r>
-            <w:r>
-              <w:rPr>
-                <w:rStyle w:val="SourceText"/>
-              </w:rPr>
-              <w:t>merge</w:t>
-            </w:r>
-          </w:p>
-        </w:tc>
-        <w:tc>
-          <w:tcPr>
-            <w:tcW w:w="4208" w:type="dxa"/>
-            <w:tcBorders/>
-            <w:vAlign w:val="center"/>
-          </w:tcPr>
-          <w:p>
-            <w:pPr>
-              <w:pStyle w:val="TableContents"/>
-              <w:shd w:fill="2E3440" w:val="clear"/>
-              <w:bidi w:val="0"/>
-              <w:spacing w:before="120" w:after="120"/>
-              <w:jc w:val="left"/>
-              <w:rPr/>
-            </w:pPr>
-            <w:r>
-              <w:rPr/>
-              <w:t xml:space="preserve">After </w:t>
-            </w:r>
-            <w:r>
-              <w:rPr>
-                <w:rStyle w:val="SourceText"/>
-              </w:rPr>
-              <w:t>/crew:done</w:t>
-            </w:r>
-            <w:r>
-              <w:rPr/>
-              <w:t>, open a PR (</w:t>
-            </w:r>
-            <w:r>
-              <w:rPr>
-                <w:rStyle w:val="SourceText"/>
-              </w:rPr>
-              <w:t>pr</w:t>
-            </w:r>
-            <w:r>
-              <w:rPr/>
-              <w:t>) or also merge it once required checks are green (</w:t>
-            </w:r>
-            <w:r>
-              <w:rPr>
-                <w:rStyle w:val="SourceText"/>
-              </w:rPr>
-              <w:t>merge</w:t>
-            </w:r>
-            <w:r>
-              <w:rPr/>
-              <w:t>).</w:t>
-            </w:r>
-          </w:p>
-        </w:tc>
-      </w:tr>
-      <w:tr>
-        <w:trPr/>
-        <w:tc>
-          <w:tcPr>
-            <w:tcW w:w="3653" w:type="dxa"/>
-            <w:tcBorders/>
-            <w:vAlign w:val="center"/>
-          </w:tcPr>
-          <w:p>
-            <w:pPr>
-              <w:pStyle w:val="TableContents"/>
-              <w:shd w:fill="2E3440" w:val="clear"/>
-              <w:bidi w:val="0"/>
-              <w:spacing w:before="120" w:after="120"/>
-              <w:jc w:val="left"/>
-              <w:rPr/>
-            </w:pPr>
-            <w:r>
-              <w:rPr>
-                <w:rStyle w:val="SourceText"/>
-              </w:rPr>
-              <w:t>autopilot.knownFailures</w:t>
-            </w:r>
-          </w:p>
-        </w:tc>
-        <w:tc>
-          <w:tcPr>
-            <w:tcW w:w="1231" w:type="dxa"/>
-            <w:tcBorders/>
-            <w:vAlign w:val="center"/>
-          </w:tcPr>
-          <w:p>
-            <w:pPr>
-              <w:pStyle w:val="TableContents"/>
-              <w:shd w:fill="2E3440" w:val="clear"/>
-              <w:bidi w:val="0"/>
-              <w:spacing w:before="120" w:after="120"/>
-              <w:jc w:val="left"/>
-              <w:rPr/>
-            </w:pPr>
-            <w:r>
-              <w:rPr/>
-              <w:t>new key</w:t>
-            </w:r>
-          </w:p>
-        </w:tc>
-        <w:tc>
-          <w:tcPr>
-            <w:tcW w:w="1368" w:type="dxa"/>
-            <w:tcBorders/>
-            <w:vAlign w:val="center"/>
-          </w:tcPr>
-          <w:p>
-            <w:pPr>
-              <w:pStyle w:val="TableContents"/>
-              <w:shd w:fill="2E3440" w:val="clear"/>
-              <w:bidi w:val="0"/>
-              <w:spacing w:before="120" w:after="120"/>
-              <w:jc w:val="left"/>
-              <w:rPr/>
-            </w:pPr>
-            <w:r>
-              <w:rPr/>
-              <w:t>repo</w:t>
-            </w:r>
-          </w:p>
-        </w:tc>
-        <w:tc>
-          <w:tcPr>
-            <w:tcW w:w="1157" w:type="dxa"/>
-            <w:tcBorders/>
-            <w:vAlign w:val="center"/>
-          </w:tcPr>
-          <w:p>
-            <w:pPr>
-              <w:pStyle w:val="TableContents"/>
-              <w:shd w:fill="2E3440" w:val="clear"/>
-              <w:bidi w:val="0"/>
-              <w:spacing w:before="120" w:after="120"/>
-              <w:jc w:val="left"/>
-              <w:rPr/>
-            </w:pPr>
-            <w:r>
-              <w:rPr/>
-              <w:t>[]</w:t>
-            </w:r>
-          </w:p>
-        </w:tc>
-        <w:tc>
-          <w:tcPr>
-            <w:tcW w:w="1154" w:type="dxa"/>
-            <w:tcBorders/>
-            <w:vAlign w:val="center"/>
-          </w:tcPr>
-          <w:p>
-            <w:pPr>
-              <w:pStyle w:val="TableContents"/>
-              <w:bidi w:val="0"/>
-              <w:spacing w:before="120" w:after="120"/>
-              <w:jc w:val="left"/>
-              <w:rPr>
-                <w:sz w:val="4"/>
-                <w:szCs w:val="4"/>
-              </w:rPr>
-            </w:pPr>
-            <w:r>
-              <w:rPr>
-                <w:sz w:val="4"/>
-                <w:szCs w:val="4"/>
-              </w:rPr>
-            </w:r>
-          </w:p>
-        </w:tc>
-        <w:tc>
-          <w:tcPr>
-            <w:tcW w:w="4208" w:type="dxa"/>
-            <w:tcBorders/>
-            <w:vAlign w:val="center"/>
-          </w:tcPr>
-          <w:p>
-            <w:pPr>
-              <w:pStyle w:val="TableContents"/>
-              <w:shd w:fill="2E3440" w:val="clear"/>
-              <w:bidi w:val="0"/>
-              <w:spacing w:before="120" w:after="120"/>
-              <w:jc w:val="left"/>
-              <w:rPr/>
-            </w:pPr>
-            <w:r>
-              <w:rPr/>
-              <w:t>Required checks that may fail without blocking a merge, matched by exact name.</w:t>
-            </w:r>
-          </w:p>
-        </w:tc>
-      </w:tr>
-      <w:tr>
-        <w:trPr/>
-        <w:tc>
-          <w:tcPr>
-            <w:tcW w:w="3653" w:type="dxa"/>
-            <w:tcBorders/>
-            <w:vAlign w:val="center"/>
-          </w:tcPr>
-          <w:p>
-            <w:pPr>
-              <w:pStyle w:val="TableContents"/>
-              <w:shd w:fill="2E3440" w:val="clear"/>
-              <w:bidi w:val="0"/>
-              <w:spacing w:before="120" w:after="120"/>
-              <w:jc w:val="left"/>
-              <w:rPr/>
-            </w:pPr>
-            <w:r>
-              <w:rPr>
-                <w:rStyle w:val="SourceText"/>
-              </w:rPr>
-              <w:t>autopilot.ciTimeoutMinutes</w:t>
-            </w:r>
-          </w:p>
-        </w:tc>
-        <w:tc>
-          <w:tcPr>
-            <w:tcW w:w="1231" w:type="dxa"/>
-            <w:tcBorders/>
-            <w:vAlign w:val="center"/>
-          </w:tcPr>
-          <w:p>
-            <w:pPr>
-              <w:pStyle w:val="TableContents"/>
-              <w:shd w:fill="2E3440" w:val="clear"/>
-              <w:bidi w:val="0"/>
-              <w:spacing w:before="120" w:after="120"/>
-              <w:jc w:val="left"/>
-              <w:rPr/>
-            </w:pPr>
-            <w:r>
-              <w:rPr/>
-              <w:t>new key</w:t>
-            </w:r>
-          </w:p>
-        </w:tc>
-        <w:tc>
-          <w:tcPr>
-            <w:tcW w:w="1368" w:type="dxa"/>
-            <w:tcBorders/>
-            <w:vAlign w:val="center"/>
-          </w:tcPr>
-          <w:p>
-            <w:pPr>
-              <w:pStyle w:val="TableContents"/>
-              <w:shd w:fill="2E3440" w:val="clear"/>
-              <w:bidi w:val="0"/>
-              <w:spacing w:before="120" w:after="120"/>
-              <w:jc w:val="left"/>
-              <w:rPr/>
-            </w:pPr>
-            <w:r>
-              <w:rPr/>
-              <w:t>repo</w:t>
-            </w:r>
-          </w:p>
-        </w:tc>
-        <w:tc>
-          <w:tcPr>
-            <w:tcW w:w="1157" w:type="dxa"/>
-            <w:tcBorders/>
-            <w:vAlign w:val="center"/>
-          </w:tcPr>
-          <w:p>
-            <w:pPr>
-              <w:pStyle w:val="TableContents"/>
-              <w:shd w:fill="2E3440" w:val="clear"/>
-              <w:bidi w:val="0"/>
-              <w:spacing w:before="120" w:after="120"/>
-              <w:jc w:val="left"/>
-              <w:rPr/>
-            </w:pPr>
-            <w:r>
-              <w:rPr/>
-              <w:t>60</w:t>
-            </w:r>
-          </w:p>
-        </w:tc>
-        <w:tc>
-          <w:tcPr>
-            <w:tcW w:w="1154" w:type="dxa"/>
-            <w:tcBorders/>
-            <w:vAlign w:val="center"/>
-          </w:tcPr>
-          <w:p>
-            <w:pPr>
-              <w:pStyle w:val="TableContents"/>
-              <w:bidi w:val="0"/>
-              <w:spacing w:before="120" w:after="120"/>
-              <w:jc w:val="left"/>
-              <w:rPr>
-                <w:sz w:val="4"/>
-                <w:szCs w:val="4"/>
-              </w:rPr>
-            </w:pPr>
-            <w:r>
-              <w:rPr>
-                <w:sz w:val="4"/>
-                <w:szCs w:val="4"/>
-              </w:rPr>
-            </w:r>
-          </w:p>
-        </w:tc>
-        <w:tc>
-          <w:tcPr>
-            <w:tcW w:w="4208" w:type="dxa"/>
-            <w:tcBorders/>
-            <w:vAlign w:val="center"/>
-          </w:tcPr>
-          <w:p>
-            <w:pPr>
-              <w:pStyle w:val="TableContents"/>
-              <w:shd w:fill="2E3440" w:val="clear"/>
-              <w:bidi w:val="0"/>
-              <w:spacing w:before="120" w:after="120"/>
-              <w:jc w:val="left"/>
-              <w:rPr/>
-            </w:pPr>
-            <w:r>
-              <w:rPr/>
-              <w:t>How long ship waits for CI; still pending at the timeout stops.</w:t>
-            </w:r>
-          </w:p>
-        </w:tc>
-      </w:tr>
-    </w:tbl>
-    <w:p>
-      <w:pPr>
-        <w:pStyle w:val="Heading3"/>
-        <w:bidi w:val="0"/>
-        <w:ind w:hanging="0" w:left="0" w:right="0"/>
-        <w:jc w:val="left"/>
-        <w:rPr/>
-      </w:pPr>
-      <w:bookmarkStart w:id="41" w:name="t-0012"/>
-      <w:bookmarkEnd w:id="41"/>
       <w:r>
         <w:rPr/>
         <w:t>T-0012</w:t>
@@ -29837,8 +29721,8 @@
         <w:jc w:val="left"/>
         <w:rPr/>
       </w:pPr>
-      <w:bookmarkStart w:id="42" w:name="t-0029"/>
-      <w:bookmarkEnd w:id="42"/>
+      <w:bookmarkStart w:id="41" w:name="t-0029"/>
+      <w:bookmarkEnd w:id="41"/>
       <w:r>
         <w:rPr/>
         <w:t>T-0029</w:t>
@@ -30299,8 +30183,8 @@
         <w:jc w:val="left"/>
         <w:rPr/>
       </w:pPr>
-      <w:bookmarkStart w:id="43" w:name="t-0030"/>
-      <w:bookmarkEnd w:id="43"/>
+      <w:bookmarkStart w:id="42" w:name="t-0030"/>
+      <w:bookmarkEnd w:id="42"/>
       <w:r>
         <w:rPr/>
         <w:t>T-0030</w:t>
@@ -30743,8 +30627,8 @@
         <w:jc w:val="left"/>
         <w:rPr/>
       </w:pPr>
-      <w:bookmarkStart w:id="44" w:name="t-0050"/>
-      <w:bookmarkEnd w:id="44"/>
+      <w:bookmarkStart w:id="43" w:name="t-0050"/>
+      <w:bookmarkEnd w:id="43"/>
       <w:r>
         <w:rPr/>
         <w:t>T-0050</w:t>

</xml_diff>

<commit_message>
crew 1.0.349: version for batch 7 (T-0020, T-0011, T-0063)
Claude-Session: https://claude.ai/code/session_016wQA2o38aSB65bpjaGpMVJ
</commit_message>
<xml_diff>
--- a/docs/guides/crew/crew-1.0-configuration-reference.docx
+++ b/docs/guides/crew/crew-1.0-configuration-reference.docx
@@ -27568,7 +27568,7 @@
             </w:pPr>
             <w:r>
               <w:rPr/>
-              <w:t>1.0.348</w:t>
+              <w:t>1.0.349</w:t>
             </w:r>
           </w:p>
         </w:tc>
@@ -27751,7 +27751,7 @@
             </w:pPr>
             <w:r>
               <w:rPr/>
-              <w:t>1.0.348</w:t>
+              <w:t>1.0.349</w:t>
             </w:r>
           </w:p>
         </w:tc>
@@ -27914,7 +27914,7 @@
             </w:pPr>
             <w:r>
               <w:rPr/>
-              <w:t>1.0.348</w:t>
+              <w:t>1.0.349</w:t>
             </w:r>
           </w:p>
         </w:tc>

</xml_diff>

<commit_message>
crew 1.0.350, gizmoduck 0.5.8, localgpu 0.1.21: version for batch 8 (T-0105, L-0678, L-0673, T-0108, T-0035, T-0051)
Version files, PLUGINS.md claims, the batch CHANGELOG heading, T-0035's
arrival text, T-0051's crew_keys since (1.0.378 -> 1.0.350) with the
configuration reference regenerated, README What's new via sync-updates.py.

Claude-Session: https://claude.ai/code/session_016wQA2o38aSB65bpjaGpMVJ
</commit_message>
<xml_diff>
--- a/docs/guides/crew/crew-1.0-configuration-reference.docx
+++ b/docs/guides/crew/crew-1.0-configuration-reference.docx
@@ -15495,7 +15495,7 @@
             </w:pPr>
             <w:r>
               <w:rPr/>
-              <w:t>1.0.378</w:t>
+              <w:t>1.0.350</w:t>
             </w:r>
           </w:p>
         </w:tc>
@@ -15638,7 +15638,7 @@
             </w:pPr>
             <w:r>
               <w:rPr/>
-              <w:t>1.0.378</w:t>
+              <w:t>1.0.350</w:t>
             </w:r>
           </w:p>
         </w:tc>

</xml_diff>